<commit_message>
perf: remove event system
</commit_message>
<xml_diff>
--- a/基于Spring Boot的博客系统设计与实现.docx
+++ b/基于Spring Boot的博客系统设计与实现.docx
@@ -1573,95 +1573,63 @@
           <w:sz w:val="24"/>
           <w:szCs w:val="24"/>
         </w:rPr>
-        <w:t xml:space="preserve">随着互联网技术的快速发展和Web 2.0时代的到来，博客作为一种网络日志形式，已经成为人们分享知识、记录生活、交流技术的重要平台。从早期的个人主页到现代的内容管理系统，博客系统经历了从简单到复杂、从单一到多元的演进过程。在当前的信息化社会中，博客不仅是个人表达的窗口，更是技术社区和知识分享生态的重要组成部分。</w:t>
-      </w:r>
-    </w:p>
-    <w:p>
-      <w:pPr>
-        <w:spacing w:after="0" w:before="0" w:line="288" w:lineRule="auto"/>
-        <w:ind w:firstLine="480"/>
-      </w:pPr>
-      <w:r>
-        <w:rPr>
-          <w:rFonts w:ascii="Times New Roman" w:eastAsia="宋体" w:hAnsi="Times New Roman"/>
-          <w:sz w:val="24"/>
-          <w:szCs w:val="24"/>
-        </w:rPr>
-        <w:t xml:space="preserve">近年来，随着中国互联网用户规模突破10亿，内容创作和知识分享需求持续增长。博客系统作为内容管理系统的典型代表，其技术架构和功能设计对学习和实践Web开发技术具有重要的参考价值。同时，随着微服务架构、前后端分离、响应式设计等现代Web开发理念的普及，博客系统的技术选型和架构设计也面临着新的机遇和挑战。</w:t>
-      </w:r>
-    </w:p>
-    <w:p>
-      <w:pPr>
-        <w:spacing w:after="0" w:before="0" w:line="288" w:lineRule="auto"/>
-        <w:ind w:firstLine="480"/>
-      </w:pPr>
-      <w:r>
-        <w:rPr>
-          <w:rFonts w:ascii="Times New Roman" w:eastAsia="宋体" w:hAnsi="Times New Roman"/>
-          <w:sz w:val="24"/>
-          <w:szCs w:val="24"/>
-        </w:rPr>
-        <w:t xml:space="preserve">传统的博客系统多采用PHP、ASP等语言开发，存在架构老旧、扩展性差、安全性不足等问题。随着Java生态的不断完善和Spring Boot框架的兴起，基于Java的博客系统在性能、安全性、可维护性等方面展现出了显著优势。Spring Boot框架通过约定优于配置的理念，大幅简化了Spring应用的初始搭建和开发过程，使得开发者能够更加专注于业务逻辑的实现。</w:t>
-      </w:r>
-      <w:r>
-        <w:rPr>
-          <w:rFonts w:ascii="Times New Roman" w:eastAsia="宋体" w:hAnsi="Times New Roman"/>
-          <w:sz w:val="24"/>
-          <w:szCs w:val="24"/>
-          <w:vertAlign w:val="superscript"/>
-        </w:rPr>
-        <w:t xml:space="preserve">[1]</w:t>
-      </w:r>
-      <w:r>
-        <w:rPr>
-          <w:rFonts w:ascii="Times New Roman" w:eastAsia="宋体" w:hAnsi="Times New Roman"/>
-          <w:sz w:val="24"/>
-          <w:szCs w:val="24"/>
-          <w:vertAlign w:val="superscript"/>
-        </w:rPr>
-        <w:t xml:space="preserve">[2]</w:t>
-      </w:r>
-    </w:p>
-    <w:p>
-      <w:pPr>
-        <w:spacing w:after="0" w:before="0" w:line="288" w:lineRule="auto"/>
-        <w:ind w:firstLine="480"/>
-      </w:pPr>
-      <w:r>
-        <w:rPr>
-          <w:rFonts w:ascii="Times New Roman" w:eastAsia="宋体" w:hAnsi="Times New Roman"/>
-          <w:sz w:val="24"/>
-          <w:szCs w:val="24"/>
-        </w:rPr>
-        <w:t xml:space="preserve">Spring Boot框架自2014年发布以来，迅速成为Java Web开发的主流框架。其核心优势包括：起步依赖简化了Maven配置，自动配置机制减少了大量样板代码，内嵌Web服务器使部署变得简单，Actuator提供了生产级的监控能力。此外，Spring Boot与Spring Data JPA、Spring Security、Spring Cloud等组件的无缝集成，为构建企业级应用提供了完整的技术栈支持。</w:t>
-      </w:r>
-    </w:p>
-    <w:p>
-      <w:pPr>
-        <w:spacing w:after="0" w:before="0" w:line="288" w:lineRule="auto"/>
-        <w:ind w:firstLine="480"/>
-      </w:pPr>
-      <w:r>
-        <w:rPr>
-          <w:rFonts w:ascii="Times New Roman" w:eastAsia="宋体" w:hAnsi="Times New Roman"/>
-          <w:sz w:val="24"/>
-          <w:szCs w:val="24"/>
-        </w:rPr>
-        <w:t xml:space="preserve">本系统以mblog开源项目为基础，基于Spring Boot 3.5.0框架进行设计与实现，采用Java 17作为开发语言。系统旨在提供一个功能完善、界面美观、易于维护的博客平台，支持Markdown编辑、全文搜索、多级评论、频道分类等现代博客系统的核心特性。通过对该系统的设计与实现，可以深入学习和实践Spring Boot框架的开发模式、MVC架构设计、数据库设计、Shiro安全认证、Hibernate Search全文搜索等关键技术，对提升软件工程实践能力具有重要意义。</w:t>
-      </w:r>
-    </w:p>
-    <w:p>
-      <w:pPr>
-        <w:spacing w:after="0" w:before="0" w:line="288" w:lineRule="auto"/>
-        <w:ind w:firstLine="480"/>
-      </w:pPr>
-      <w:r>
-        <w:rPr>
-          <w:rFonts w:ascii="Times New Roman" w:eastAsia="宋体" w:hAnsi="Times New Roman"/>
-          <w:sz w:val="24"/>
-          <w:szCs w:val="24"/>
-        </w:rPr>
-        <w:t xml:space="preserve">从实际应用角度来看，本系统的开发具有以下意义：一是为个人和技术团队提供一个自托管的博客平台，可以完全控制数据和内容；二是通过集成Hibernate Search和Lucene SmartCN中文分词器，解决了现有博客系统在中文全文搜索方面的不足；三是采用Apache Shiro的RBAC模型实现了细粒度的后台管理权限控制，为类似系统的权限设计提供了参考方案。</w:t>
+        <w:t xml:space="preserve">博客作为一种网络日志形式，自20世纪90年代末出现以来，已经从简单的个人网页演变为功能丰富的内容管理系统。无论是个人记录生活、技术人员分享经验，还是企业发布资讯，博客系统都扮演着知识传播和内容管理的重要角色。国内CSDN、博客园、掘金等技术社区的兴起，进一步推动了博客系统在技术开发领域的普及。</w:t>
+      </w:r>
+    </w:p>
+    <w:p>
+      <w:pPr>
+        <w:spacing w:after="0" w:before="0" w:line="288" w:lineRule="auto"/>
+        <w:ind w:firstLine="480"/>
+      </w:pPr>
+      <w:r>
+        <w:rPr>
+          <w:rFonts w:ascii="Times New Roman" w:eastAsia="宋体" w:hAnsi="Times New Roman"/>
+          <w:sz w:val="24"/>
+          <w:szCs w:val="24"/>
+        </w:rPr>
+        <w:t xml:space="preserve">传统的博客系统大多基于PHP语言开发，如WordPress、Typecho等。PHP开发效率高、部署简单，但在类型安全、并发处理和工程化方面存在不足。Java作为强类型语言，结合Spring Boot框架的自动配置和起步依赖机制，在构建大型Web应用时具有更好的可维护性和扩展性。近年来，越来越多的国内开发者开始基于Spring Boot框架构建博客系统。{[1]}{[2]}</w:t>
+      </w:r>
+    </w:p>
+    <w:p>
+      <w:pPr>
+        <w:spacing w:after="0" w:before="0" w:line="288" w:lineRule="auto"/>
+        <w:ind w:firstLine="480"/>
+      </w:pPr>
+      <w:r>
+        <w:rPr>
+          <w:rFonts w:ascii="Times New Roman" w:eastAsia="宋体" w:hAnsi="Times New Roman"/>
+          <w:sz w:val="24"/>
+          <w:szCs w:val="24"/>
+        </w:rPr>
+        <w:t xml:space="preserve">Spring Boot框架由Pivotal团队于2014年推出，其核心理念是"约定优于配置"。开发者不再需要编写大量XML配置文件，只需通过起步依赖即可快速集成所需组件。Spring Boot内嵌Undertow、Tomcat等Web服务器，打包为可执行JAR即可运行部署。这种"开箱即用"的特性，使其在短时间内成为Java Web开发的首选框架。</w:t>
+      </w:r>
+    </w:p>
+    <w:p>
+      <w:pPr>
+        <w:spacing w:after="0" w:before="0" w:line="288" w:lineRule="auto"/>
+        <w:ind w:firstLine="480"/>
+      </w:pPr>
+      <w:r>
+        <w:rPr>
+          <w:rFonts w:ascii="Times New Roman" w:eastAsia="宋体" w:hAnsi="Times New Roman"/>
+          <w:sz w:val="24"/>
+          <w:szCs w:val="24"/>
+        </w:rPr>
+        <w:t xml:space="preserve">本系统以mblog开源项目为基础，基于Spring Boot 3.5.0和Java 17进行开发。系统支持Markdown编辑、全文搜索、多级评论、频道分类等博客系统的核心特性。在技术选型上，系统集成了Hibernate Search全文搜索引擎和Lucene SmartCN中文分词器，用于解决中文内容的全文检索问题；采用Apache Shiro的RBAC模型实现后台管理权限控制。通过对该系统的设计与实现，笔者在实践中深入学习了Spring Boot开发模式、MVC架构设计、数据库设计、Shiro安全认证等关键技术，对软件工程实践能力的提升有较大帮助。</w:t>
+      </w:r>
+    </w:p>
+    <w:p>
+      <w:pPr>
+        <w:spacing w:after="0" w:before="0" w:line="288" w:lineRule="auto"/>
+        <w:ind w:firstLine="480"/>
+      </w:pPr>
+      <w:r>
+        <w:rPr>
+          <w:rFonts w:ascii="Times New Roman" w:eastAsia="宋体" w:hAnsi="Times New Roman"/>
+          <w:sz w:val="24"/>
+          <w:szCs w:val="24"/>
+        </w:rPr>
+        <w:t xml:space="preserve">从实际应用角度看，开发一个自托管的博客平台可以完全掌控数据和内容，不依赖第三方平台。而本系统在全文搜索和权限控制方面的技术方案，也可以为类似的内容管理系统提供参考。</w:t>
       </w:r>
     </w:p>
     <w:p>
@@ -1701,49 +1669,35 @@
           <w:sz w:val="24"/>
           <w:szCs w:val="24"/>
         </w:rPr>
-        <w:t xml:space="preserve">在国外，博客系统的发展较为成熟。WordPress作为全球最流行的博客及内容管理系统，占据了全球网站市场超过40%的份额，其插件生态和主题系统为用户提供了丰富的定制选项。Ghost作为现代博客平台，采用Node.js开发，注重写作体验和出版功能。Hashnode、Dev.to等平台则将博客与开发者社区相结合，提供了技术分享和交流的社交化体验。</w:t>
-      </w:r>
-    </w:p>
-    <w:p>
-      <w:pPr>
-        <w:spacing w:after="0" w:before="0" w:line="288" w:lineRule="auto"/>
-        <w:ind w:firstLine="480"/>
-      </w:pPr>
-      <w:r>
-        <w:rPr>
-          <w:rFonts w:ascii="Times New Roman" w:eastAsia="宋体" w:hAnsi="Times New Roman"/>
-          <w:sz w:val="24"/>
-          <w:szCs w:val="24"/>
-        </w:rPr>
-        <w:t xml:space="preserve">在技术架构方面，国外的博客系统普遍采用前后端分离的开发模式，前端使用React、Vue.js等现代JavaScript框架，后端提供RESTful API或GraphQL接口。在数据存储方面，除了传统的关系型数据库外，部分系统开始引入Elasticsearch等搜索引擎以提升全文搜索性能。在安全方面，OAuth 2.0和JWT等认证协议得到了广泛应用。</w:t>
-      </w:r>
-    </w:p>
-    <w:p>
-      <w:pPr>
-        <w:spacing w:after="0" w:before="0" w:line="288" w:lineRule="auto"/>
-        <w:ind w:firstLine="480"/>
-      </w:pPr>
-      <w:r>
-        <w:rPr>
-          <w:rFonts w:ascii="Times New Roman" w:eastAsia="宋体" w:hAnsi="Times New Roman"/>
-          <w:sz w:val="24"/>
-          <w:szCs w:val="24"/>
-        </w:rPr>
-        <w:t xml:space="preserve">值得关注的是，国外的Static Site Generator（静态网站生成器）如Hugo、Jekyll、Gatsby等也占据了一定市场份额。这类工具通过在构建时生成静态HTML文件，实现了极高的页面加载速度和安全性，但牺牲了动态交互能力。相比之下，基于服务端渲染的动态博客系统在评论互动、实时搜索等方面具有天然优势。</w:t>
-      </w:r>
-    </w:p>
-    <w:p>
-      <w:pPr>
-        <w:spacing w:after="0" w:before="0" w:line="288" w:lineRule="auto"/>
-        <w:ind w:firstLine="480"/>
-      </w:pPr>
-      <w:r>
-        <w:rPr>
-          <w:rFonts w:ascii="Times New Roman" w:eastAsia="宋体" w:hAnsi="Times New Roman"/>
-          <w:sz w:val="24"/>
-          <w:szCs w:val="24"/>
-        </w:rPr>
-        <w:t xml:space="preserve">在企业级博客和内容管理领域，Adobe Experience Manager、Sitecore等商业CMS系统提供了强大的内容管理、个性化和营销自动化能力，但其高昂的授权费用和复杂的部署架构限制了其在个人和小型团队中的应用。因此，开源的轻量级博客系统仍然具有广阔的市场空间。</w:t>
+        <w:t xml:space="preserve">国外的博客系统发展较早，生态也比较成熟。WordPress是目前全球使用最广的博客和内容管理系统，市场占有率超过40%，其丰富的插件和主题生态是其核心竞争力。Ghost基于Node.js开发，主打写作体验和出版功能，界面简洁现代。Dev.to、Hashnode等平台则将博客与开发者社区结合，强调社交化互动。</w:t>
+      </w:r>
+    </w:p>
+    <w:p>
+      <w:pPr>
+        <w:spacing w:after="0" w:before="0" w:line="288" w:lineRule="auto"/>
+        <w:ind w:firstLine="480"/>
+      </w:pPr>
+      <w:r>
+        <w:rPr>
+          <w:rFonts w:ascii="Times New Roman" w:eastAsia="宋体" w:hAnsi="Times New Roman"/>
+          <w:sz w:val="24"/>
+          <w:szCs w:val="24"/>
+        </w:rPr>
+        <w:t xml:space="preserve">技术架构上，国外博客系统普遍采用前后端分离模式，前端用React或Vue.js构建，后端提供RESTful API。数据存储方面，部分系统引入Elasticsearch来增强全文搜索能力。安全认证方面则多采用OAuth 2.0和JWT协议。</w:t>
+      </w:r>
+    </w:p>
+    <w:p>
+      <w:pPr>
+        <w:spacing w:after="0" w:before="0" w:line="288" w:lineRule="auto"/>
+        <w:ind w:firstLine="480"/>
+      </w:pPr>
+      <w:r>
+        <w:rPr>
+          <w:rFonts w:ascii="Times New Roman" w:eastAsia="宋体" w:hAnsi="Times New Roman"/>
+          <w:sz w:val="24"/>
+          <w:szCs w:val="24"/>
+        </w:rPr>
+        <w:t xml:space="preserve">另外，Hugo、Jekyll、Gatsby等静态网站生成器也占据了一定市场份额。这类工具在构建时生成静态HTML，页面加载快、安全性高，但无法实现评论互动、实时搜索等动态功能。动态博客系统在这方面的优势是静态生成器无法替代的。至于Adobe Experience Manager、Sitecore等商业CMS，功能强大但授权费用昂贵，个人和小团队难以承受。</w:t>
       </w:r>
     </w:p>
     <w:p>
@@ -1770,21 +1724,21 @@
           <w:sz w:val="24"/>
           <w:szCs w:val="24"/>
         </w:rPr>
-        <w:t xml:space="preserve">在国内，博客系统的发展同样经历了多个阶段。早期的博客中国、新浪博客等平台以门户网站形式运营，为用户提供了简单的文章发布功能。随着技术社区的发展，CSDN、博客园、掘金等技术博客平台逐渐成为主流，这些平台在代码高亮、Markdown支持、技术标签分类等方面进行了大量优化。</w:t>
-      </w:r>
-    </w:p>
-    <w:p>
-      <w:pPr>
-        <w:spacing w:after="0" w:before="0" w:line="288" w:lineRule="auto"/>
-        <w:ind w:firstLine="480"/>
-      </w:pPr>
-      <w:r>
-        <w:rPr>
-          <w:rFonts w:ascii="Times New Roman" w:eastAsia="宋体" w:hAnsi="Times New Roman"/>
-          <w:sz w:val="24"/>
-          <w:szCs w:val="24"/>
-        </w:rPr>
-        <w:t xml:space="preserve">在开源博客系统方面，国内开发者基于Java技术栈开发了多个优秀的博客项目，如Halo、Solo、Tale等。这些系统大多采用Spring Boot框架，结合MyBatis或JPA进行数据持久化，使用Shiro或Spring Security进行权限控制。然而，现有系统在全文搜索中文分词、权限细粒度控制、资源引用计数等方面仍存在改进空间。本系统在借鉴上述项目经验的基础上，集成了Hibernate Search全文搜索引擎和Lucene SmartCN中文分词器，并采用Shiro RBAC模型实现了20项细粒度权限控制。</w:t>
+        <w:t xml:space="preserve">国内博客系统的发展经历了从门户网站到专业社区的过程。早期的博客中国、新浪博客以门户形式运营，功能比较简单。后来CSDN、博客园、掘金等技术社区崛起，这些平台在代码高亮、Markdown支持、标签分类等方面做了大量优化，更适合技术内容的创作和分享。</w:t>
+      </w:r>
+    </w:p>
+    <w:p>
+      <w:pPr>
+        <w:spacing w:after="0" w:before="0" w:line="288" w:lineRule="auto"/>
+        <w:ind w:firstLine="480"/>
+      </w:pPr>
+      <w:r>
+        <w:rPr>
+          <w:rFonts w:ascii="Times New Roman" w:eastAsia="宋体" w:hAnsi="Times New Roman"/>
+          <w:sz w:val="24"/>
+          <w:szCs w:val="24"/>
+        </w:rPr>
+        <w:t xml:space="preserve">开源博客系统方面，国内开发者基于Java技术栈开发了Halo、Solo、Tale等项目。这些系统大多采用Spring Boot框架，搭配MyBatis或JPA做数据持久化，用Shiro或Spring Security做权限控制。但在实际使用中，笔者发现现有系统在中文全文搜索、权限细粒度控制和资源引用计数等方面仍有改进空间。本系统在借鉴这些项目经验的基础上，集成了Hibernate Search和Lucene SmartCN中文分词器，采用Shiro RBAC模型实现了20项后台管理权限。</w:t>
       </w:r>
       <w:r>
         <w:rPr>
@@ -1807,21 +1761,21 @@
           <w:sz w:val="24"/>
           <w:szCs w:val="24"/>
         </w:rPr>
-        <w:t xml:space="preserve">从学术研究角度来看，国内高校和科研机构在Web开发框架、数据库接口设计、安全认证等方面进行了大量研究。在Spring Boot框架的快速开发能力、微服务架构下的前后端分离模型、数据库接口设计等方面均有丰富的学术成果发表，为本系统的设计与实现提供了理论基础和技术参考。</w:t>
-      </w:r>
-    </w:p>
-    <w:p>
-      <w:pPr>
-        <w:spacing w:after="0" w:before="0" w:line="288" w:lineRule="auto"/>
-        <w:ind w:firstLine="480"/>
-      </w:pPr>
-      <w:r>
-        <w:rPr>
-          <w:rFonts w:ascii="Times New Roman" w:eastAsia="宋体" w:hAnsi="Times New Roman"/>
-          <w:sz w:val="24"/>
-          <w:szCs w:val="24"/>
-        </w:rPr>
-        <w:t xml:space="preserve">在产业实践方面，随着国产化替代和信创产业的推进，基于Java技术栈的自主可控Web应用系统越来越受到重视。Spring Boot框架因其开源、成熟、生态丰富的特点，成为企业级应用开发的首选框架之一。本系统采用Spring Boot 3.5.0和Java 17组合，符合当前技术发展的主流趋势。</w:t>
+        <w:t xml:space="preserve">学术研究方面，国内高校和科研机构在Web开发框架、数据库接口设计、安全认证等方向发表了大量论文，涵盖Spring Boot快速开发、前后端分离架构、数据库接口设计等课题，为本系统的设计提供了理论参考。</w:t>
+      </w:r>
+    </w:p>
+    <w:p>
+      <w:pPr>
+        <w:spacing w:after="0" w:before="0" w:line="288" w:lineRule="auto"/>
+        <w:ind w:firstLine="480"/>
+      </w:pPr>
+      <w:r>
+        <w:rPr>
+          <w:rFonts w:ascii="Times New Roman" w:eastAsia="宋体" w:hAnsi="Times New Roman"/>
+          <w:sz w:val="24"/>
+          <w:szCs w:val="24"/>
+        </w:rPr>
+        <w:t xml:space="preserve">产业层面看，随着信创产业的推进，基于Java技术栈的自主可控Web应用受到越来越多的关注。Spring Boot框架开源、成熟、生态丰富，在企业级应用中应用广泛。本系统选用Spring Boot 3.5.0和Java 17的组合，也符合当前技术发展的主流方向。</w:t>
       </w:r>
       <w:r>
         <w:rPr>
@@ -2915,7 +2869,7 @@
           <w:sz w:val="24"/>
           <w:szCs w:val="24"/>
         </w:rPr>
-        <w:t xml:space="preserve">通过对比分析可以看出，本系统（mblog）在全文搜索和权限控制方面具有明显特色。Hibernate Search与Lucene SmartCN中文分词器的组合实现了高质量的中文全文检索，而Apache Shiro的RBAC模型提供了20项细粒度后台管理权限。与WordPress相比，本系统采用Java技术栈，在类型安全和性能方面具有优势；与Halo相比，本系统在全文搜索和权限控制方面更为完善。</w:t>
+        <w:t xml:space="preserve">从表1-1可以看出，本系统在全文搜索和权限控制上有自己的特色。Hibernate Search配合SmartCN中文分词器，中文检索效果比MySQL LIKE查询好很多。Shiro的RBAC模型支持20项细粒度权限，比简单的角色判断更灵活。和WordPress相比，Java技术栈在类型安全和性能上更有保障；和Halo相比，本系统在搜索和权限方面做得更细致。</w:t>
       </w:r>
     </w:p>
     <w:p>
@@ -2942,35 +2896,35 @@
           <w:sz w:val="24"/>
           <w:szCs w:val="24"/>
         </w:rPr>
-        <w:t xml:space="preserve">本文以基于Spring Boot的博客系统为研究对象，主要研究内容包括以下几个方面：</w:t>
-      </w:r>
-    </w:p>
-    <w:p>
-      <w:pPr>
-        <w:spacing w:after="0" w:before="0" w:line="288" w:lineRule="auto"/>
-        <w:ind w:firstLine="480"/>
-      </w:pPr>
-      <w:r>
-        <w:rPr>
-          <w:rFonts w:ascii="Times New Roman" w:eastAsia="宋体" w:hAnsi="Times New Roman"/>
-          <w:sz w:val="24"/>
-          <w:szCs w:val="24"/>
-        </w:rPr>
-        <w:t xml:space="preserve">（1）系统需求分析：分析博客系统的功能性需求和非功能性需求，包括用户注册登录、文章管理、评论互动、全文搜索、收藏、后台管理等核心功能模块，以及系统在性能、安全性、可扩展性等方面的要求。</w:t>
-      </w:r>
-    </w:p>
-    <w:p>
-      <w:pPr>
-        <w:spacing w:after="0" w:before="0" w:line="288" w:lineRule="auto"/>
-        <w:ind w:firstLine="480"/>
-      </w:pPr>
-      <w:r>
-        <w:rPr>
-          <w:rFonts w:ascii="Times New Roman" w:eastAsia="宋体" w:hAnsi="Times New Roman"/>
-          <w:sz w:val="24"/>
-          <w:szCs w:val="24"/>
-        </w:rPr>
-        <w:t xml:space="preserve">（2）系统架构设计：基于MVC设计模式，设计系统的分层架构，包括表现层、控制层、业务层和持久层。确定系统采用的Spring Boot框架、FreeMarker模板引擎、Spring Data JPA、Apache Shiro等核心技术方案。</w:t>
+        <w:t xml:space="preserve">本文围绕基于Spring Boot的博客系统展开，主要研究内容包括以下几个方面。</w:t>
+      </w:r>
+    </w:p>
+    <w:p>
+      <w:pPr>
+        <w:spacing w:after="0" w:before="0" w:line="288" w:lineRule="auto"/>
+        <w:ind w:firstLine="480"/>
+      </w:pPr>
+      <w:r>
+        <w:rPr>
+          <w:rFonts w:ascii="Times New Roman" w:eastAsia="宋体" w:hAnsi="Times New Roman"/>
+          <w:sz w:val="24"/>
+          <w:szCs w:val="24"/>
+        </w:rPr>
+        <w:t xml:space="preserve">首先是系统需求分析，需要梳理前台用户和后台管理员各自需要什么功能，明确注册登录、文章管理、评论互动、全文搜索、收藏、后台管理等模块的功能性需求，以及性能、安全性、可扩展性等非功能性需求指标。</w:t>
+      </w:r>
+    </w:p>
+    <w:p>
+      <w:pPr>
+        <w:spacing w:after="0" w:before="0" w:line="288" w:lineRule="auto"/>
+        <w:ind w:firstLine="480"/>
+      </w:pPr>
+      <w:r>
+        <w:rPr>
+          <w:rFonts w:ascii="Times New Roman" w:eastAsia="宋体" w:hAnsi="Times New Roman"/>
+          <w:sz w:val="24"/>
+          <w:szCs w:val="24"/>
+        </w:rPr>
+        <w:t xml:space="preserve">其次是系统架构设计，基于MVC设计模式划分表现层、控制层、业务层和持久层，确定Spring Boot、FreeMarker、Spring Data JPA、Apache Shiro等技术方案的选型。</w:t>
       </w:r>
       <w:r>
         <w:rPr>
@@ -2993,35 +2947,35 @@
           <w:sz w:val="24"/>
           <w:szCs w:val="24"/>
         </w:rPr>
-        <w:t xml:space="preserve">（3）数据库设计：根据系统功能需求，设计数据库表结构。schema.sql中定义了频道表、系统配置表、用户表及四张Shiro权限表，其余文章、评论、标签等表通过JPA实体类自动建表生成，建立表之间的关联关系并设计必要的索引以优化查询性能。</w:t>
-      </w:r>
-    </w:p>
-    <w:p>
-      <w:pPr>
-        <w:spacing w:after="0" w:before="0" w:line="288" w:lineRule="auto"/>
-        <w:ind w:firstLine="480"/>
-      </w:pPr>
-      <w:r>
-        <w:rPr>
-          <w:rFonts w:ascii="Times New Roman" w:eastAsia="宋体" w:hAnsi="Times New Roman"/>
-          <w:sz w:val="24"/>
-          <w:szCs w:val="24"/>
-        </w:rPr>
-        <w:t xml:space="preserve">（4）系统功能实现：实现用户注册与登录、文章发布与管理、评论互动、全文搜索、收藏管理、后台管理等核心功能。详细阐述各功能模块的实现思路和关键技术点，包括MD5密码加密、ResourceLock资源锁、PostUpdateEvent事件机制等。</w:t>
-      </w:r>
-    </w:p>
-    <w:p>
-      <w:pPr>
-        <w:spacing w:after="0" w:before="0" w:line="288" w:lineRule="auto"/>
-        <w:ind w:firstLine="480"/>
-      </w:pPr>
-      <w:r>
-        <w:rPr>
-          <w:rFonts w:ascii="Times New Roman" w:eastAsia="宋体" w:hAnsi="Times New Roman"/>
-          <w:sz w:val="24"/>
-          <w:szCs w:val="24"/>
-        </w:rPr>
-        <w:t xml:space="preserve">（5）系统测试与验证：设计测试方案，对系统进行功能测试、安全测试和性能测试，验证系统是否满足需求分析中提出的各项要求。</w:t>
+        <w:t xml:space="preserve">然后是数据库设计，根据功能需求设计表结构。schema.sql中定义频道表、系统配置表、用户表和四张Shiro权限表，文章、评论、标签等业务表则通过JPA实体类自动建表，需要合理设置表间关联和索引。</w:t>
+      </w:r>
+    </w:p>
+    <w:p>
+      <w:pPr>
+        <w:spacing w:after="0" w:before="0" w:line="288" w:lineRule="auto"/>
+        <w:ind w:firstLine="480"/>
+      </w:pPr>
+      <w:r>
+        <w:rPr>
+          <w:rFonts w:ascii="Times New Roman" w:eastAsia="宋体" w:hAnsi="Times New Roman"/>
+          <w:sz w:val="24"/>
+          <w:szCs w:val="24"/>
+        </w:rPr>
+        <w:t xml:space="preserve">接下来是功能实现，逐一实现用户注册登录、文章发布管理、评论互动、全文搜索、收藏管理、后台管理等功能，重点解决MD5密码加密、ResourceLock资源锁、PostUpdateEvent事件机制等关键技术问题。</w:t>
+      </w:r>
+    </w:p>
+    <w:p>
+      <w:pPr>
+        <w:spacing w:after="0" w:before="0" w:line="288" w:lineRule="auto"/>
+        <w:ind w:firstLine="480"/>
+      </w:pPr>
+      <w:r>
+        <w:rPr>
+          <w:rFonts w:ascii="Times New Roman" w:eastAsia="宋体" w:hAnsi="Times New Roman"/>
+          <w:sz w:val="24"/>
+          <w:szCs w:val="24"/>
+        </w:rPr>
+        <w:t xml:space="preserve">最后是系统测试，设计功能测试、安全测试和性能测试方案，验证系统是否达到需求分析中提出的各项指标。</w:t>
       </w:r>
     </w:p>
     <w:p>
@@ -3063,7 +3017,7 @@
           <w:sz w:val="24"/>
           <w:szCs w:val="24"/>
         </w:rPr>
-        <w:t xml:space="preserve">Spring Boot是由Pivotal团队提供的全新框架，其设计目的是用来简化新Spring应用的初始搭建以及开发过程。该框架使用了特定的方式来进行配置，从而使开发人员不再需要定义样板化的配置。Spring Boot通过约定优于配置的理念，为开发者提供了一种快速开发Spring应用的方式。</w:t>
+        <w:t xml:space="preserve">Spring Boot是Pivotal团队推出的Java应用开发框架，核心理念是"约定优于配置"。传统Spring应用需要编写大量XML配置，Spring Boot通过自动配置机制和起步依赖解决了这个问题——开发者在pom.xml中引入spring-boot-starter-web，框架就会自动配置内嵌服务器、Spring MVC等组件，不需要手写一行XML。</w:t>
       </w:r>
       <w:r>
         <w:rPr>
@@ -3095,7 +3049,7 @@
           <w:sz w:val="24"/>
           <w:szCs w:val="24"/>
         </w:rPr>
-        <w:t xml:space="preserve">本系统采用Spring Boot 3.5.0版本，基于Java 17运行环境。Spring Boot 3.x系列基于Jakarta EE 9+规范，全面支持Jakarta命名空间，将javax包名迁移至jakarta包名。系统利用Spring Boot的自动配置特性，通过application.yml配置文件管理数据库连接、Shiro安全配置、FreeMarker模板引擎等组件的参数设置。同时，Spring Boot内嵌的Undertow Web服务器为系统提供了高性能的HTTP服务，配置了2个IO线程和32个工作线程。</w:t>
+        <w:t xml:space="preserve">本系统使用Spring Boot 3.5.0，运行在Java 17上。Spring Boot 3.x基于Jakarta EE 9+规范，包名从javax迁移到了jakarta。系统的数据库连接、Shiro安全配置、FreeMarker模板引擎等参数都在application.yml中统一管理。Web服务器用的是内嵌Undertow，配置了2个IO线程和32个工作线程。</w:t>
       </w:r>
       <w:r>
         <w:rPr>
@@ -3118,7 +3072,7 @@
           <w:sz w:val="24"/>
           <w:szCs w:val="24"/>
         </w:rPr>
-        <w:t xml:space="preserve">Spring Boot的核心优势在于其起步依赖和自动配置机制。开发者只需在pom.xml中添加相应的starter依赖，Spring Boot即可自动完成相关组件的配置和初始化。本系统使用了spring-boot-starter-web、spring-boot-starter-data-jpa、spring-boot-starter-freemarker、spring-boot-starter-cache等起步依赖，分别实现Web服务、数据持久化、模板渲染和缓存功能。application.yml中配置了三个站点控制开关：register（注册开关）、post（发布文章开关）和comment（评论开关），通过ConditionalOnProperty注解实现功能的动态启停。</w:t>
+        <w:t xml:space="preserve">实际开发中用到的起步依赖包括spring-boot-starter-web（Web服务）、spring-boot-starter-data-jpa（数据持久化）、spring-boot-starter-freemarker（模板渲染）和spring-boot-starter-cache（缓存）。application.yml中还配了三个站点控制开关：register控制是否开放注册、post控制是否允许发布文章、comment控制是否允许评论，通过@ConditionalOnProperty注解实现功能的动态启停。</w:t>
       </w:r>
     </w:p>
     <w:p>
@@ -3145,7 +3099,7 @@
           <w:sz w:val="24"/>
           <w:szCs w:val="24"/>
         </w:rPr>
-        <w:t xml:space="preserve">FreeMarker是一款用Java语言编写的模板引擎，它基于模板来生成文本输出。FreeMarker与Web容器无关，即在Web运行时它并不知道Servlet或HTTP，因此它不仅适用于MVC模式的Web应用，也可以用于非Web应用环境。</w:t>
+        <w:t xml:space="preserve">FreeMarker是一个Java模板引擎，负责将模板和数据合并生成HTML输出。它不依赖Web容器，既可以用在Web应用的视图渲染，也可以用于生成邮件、代码等非Web场景。</w:t>
       </w:r>
       <w:r>
         <w:rPr>
@@ -3168,21 +3122,21 @@
           <w:sz w:val="24"/>
           <w:szCs w:val="24"/>
         </w:rPr>
-        <w:t xml:space="preserve">本系统采用FreeMarker作为视图层模板引擎，通过spring-boot-starter-freemarker起步依赖集成。系统配置了FreeMarker模板加载路径，支持从classpath:/templates和外部文件系统${site.location}/storage/templates两个路径加载模板文件。同时，系统通过自定义模板指令扩展了FreeMarker的功能，包括ChannelDirective用于渲染频道列表、ContentsDirective用于渲染文章列表、SidebarDirective用于渲染侧边栏、ControlsDirective用于渲染站点控制开关状态等。这些自定义指令封装了数据查询和渲染逻辑，使模板代码更加简洁和可维护。</w:t>
-      </w:r>
-    </w:p>
-    <w:p>
-      <w:pPr>
-        <w:spacing w:after="0" w:before="0" w:line="288" w:lineRule="auto"/>
-        <w:ind w:firstLine="480"/>
-      </w:pPr>
-      <w:r>
-        <w:rPr>
-          <w:rFonts w:ascii="Times New Roman" w:eastAsia="宋体" w:hAnsi="Times New Roman"/>
-          <w:sz w:val="24"/>
-          <w:szCs w:val="24"/>
-        </w:rPr>
-        <w:t xml:space="preserve">FreeMarker模板文件以.ftl为后缀，系统配置了classic_compatible模式处理空值，避免因数据为null而导致的模板渲染异常。模板引擎还配置了自定义日期格式（yyyy-MM-dd HH:mm）、数字格式（0.##）等参数，并通过auto_import自动引入/utils.ftl工具模板，保证了页面展示的一致性。</w:t>
+        <w:t xml:space="preserve">本系统通过spring-boot-starter-freemarker集成FreeMarker，模板文件以.ftl为后缀，支持从classpath:/templates和外部文件系统${site.location}/storage/templates两个路径加载。为了让模板更简洁，系统自定义了一批模板指令：ChannelDirective渲染频道列表，ContentsDirective渲染文章列表，SidebarDirective渲染侧边栏，ControlsDirective渲染站点开关状态等。这些指令把数据查询逻辑封装在Java代码里，模板文件只负责布局和展示。</w:t>
+      </w:r>
+    </w:p>
+    <w:p>
+      <w:pPr>
+        <w:spacing w:after="0" w:before="0" w:line="288" w:lineRule="auto"/>
+        <w:ind w:firstLine="480"/>
+      </w:pPr>
+      <w:r>
+        <w:rPr>
+          <w:rFonts w:ascii="Times New Roman" w:eastAsia="宋体" w:hAnsi="Times New Roman"/>
+          <w:sz w:val="24"/>
+          <w:szCs w:val="24"/>
+        </w:rPr>
+        <w:t xml:space="preserve">配置上设了classic_compatible模式处理空值，避免数据为null时报错。日期格式设为yyyy-MM-dd HH:mm，数字格式设为0.##，auto_import自动引入/utils.ftl工具模板，保证各页面格式统一。</w:t>
       </w:r>
     </w:p>
     <w:p>
@@ -3209,7 +3163,7 @@
           <w:sz w:val="24"/>
           <w:szCs w:val="24"/>
         </w:rPr>
-        <w:t xml:space="preserve">Spring Data JPA是Spring Data项目的一部分，旨在简化基于JPA的数据访问层的开发。它通过定义Repository接口的方式，让开发者只需编写接口即可实现数据的CRUD操作，无需编写实现类。Spring Data JPA会根据接口方法的命名约定自动生成SQL查询语句。</w:t>
+        <w:t xml:space="preserve">Spring Data JPA是Spring Data项目的子模块，目的是减少数据访问层的样板代码。开发者只需要定义一个继承JpaRepository的接口，框架就自动提供增删改查方法，连实现类都不用写。方法名本身也是查询条件——比如findByUsername方法会自动生成SELECT ... WHERE username = ?的SQL。</w:t>
       </w:r>
       <w:r>
         <w:rPr>
@@ -3241,21 +3195,21 @@
           <w:sz w:val="24"/>
           <w:szCs w:val="24"/>
         </w:rPr>
-        <w:t xml:space="preserve">本系统使用Spring Data JPA作为数据持久化框架，配合Hibernate作为JPA实现。系统定义了多个Repository接口，如PostRepository、UserRepository、CommentRepository、ChannelRepository等，继承自JpaRepository接口，自动获得了基本的CRUD功能。同时，通过@Query注解和Specification接口，系统实现了复杂的动态查询。例如PostServiceImpl.paging()方法通过Specification动态构建查询条件，支持channelId筛选和excludeChannelIds排除，并配合@PostStatusFilter注解通过AOP切面实现文章状态过滤。</w:t>
-      </w:r>
-    </w:p>
-    <w:p>
-      <w:pPr>
-        <w:spacing w:after="0" w:before="0" w:line="288" w:lineRule="auto"/>
-        <w:ind w:firstLine="480"/>
-      </w:pPr>
-      <w:r>
-        <w:rPr>
-          <w:rFonts w:ascii="Times New Roman" w:eastAsia="宋体" w:hAnsi="Times New Roman"/>
-          <w:sz w:val="24"/>
-          <w:szCs w:val="24"/>
-        </w:rPr>
-        <w:t xml:space="preserve">系统利用了Hibernate的注解映射功能，通过@Entity、@Table、@Column等注解将Java实体类映射到数据库表。实体类之间通过关联注解建立了多对一、一对多等关系，如文章与用户的多对一关系、用户与角色的一对多关系等。需要注意的是，schema.sql仅定义了频道表、系统配置表、用户表及四张Shiro权限表，而文章表（mto_post）、评论表（mto_comment）、标签表（mto_tag）等核心业务表通过JPA实体类的ddl-auto配置自动创建。此外，系统使用了Hibernate Search扩展，通过@Indexed、@FullTextField等注解实现了实体类的全文索引功能。</w:t>
+        <w:t xml:space="preserve">本系统用Spring Data JPA配Hibernate做持久化，定义了PostRepository、UserRepository、CommentRepository、ChannelRepository等接口。复杂查询用@Query注解写JPQL或SQL，动态查询用Specification接口拼接条件。比如PostServiceImpl.paging()方法就通过Specification动态构建channelId筛选和excludeChannelIds排除条件，再配合@PostStatusFilter注解通过AOP切面自动过滤未发布文章。</w:t>
+      </w:r>
+    </w:p>
+    <w:p>
+      <w:pPr>
+        <w:spacing w:after="0" w:before="0" w:line="288" w:lineRule="auto"/>
+        <w:ind w:firstLine="480"/>
+      </w:pPr>
+      <w:r>
+        <w:rPr>
+          <w:rFonts w:ascii="Times New Roman" w:eastAsia="宋体" w:hAnsi="Times New Roman"/>
+          <w:sz w:val="24"/>
+          <w:szCs w:val="24"/>
+        </w:rPr>
+        <w:t xml:space="preserve">实体类用@Entity、@Table、@Column等注解映射到数据库表，表间关系通过@ManyToOne、@OneToMany等关联注解建立。需要说明的是，schema.sql只定义了频道表、配置表、用户表和Shiro权限表，文章表、评论表、标签表等核心业务表是JPA的ddl-auto配置自动创建的。另外，系统通过Hibernate Search的@Indexed、@FullTextField注解给实体类加了全文索引。</w:t>
       </w:r>
     </w:p>
     <w:p>
@@ -3282,7 +3236,7 @@
           <w:sz w:val="24"/>
           <w:szCs w:val="24"/>
         </w:rPr>
-        <w:t xml:space="preserve">Apache Shiro是一个强大且易用的Java安全框架，提供了认证、授权、加密和会话管理功能。Shiro的API设计简洁明了，使开发者能够方便地实现应用的安全控制。Shiro的核心概念包括Subject（当前用户）、SecurityManager（安全管理器）、Realm（数据源）和Session（会话）。</w:t>
+        <w:t xml:space="preserve">Apache Shiro是一个Java安全框架，提供认证、授权、加密和会话管理四个核心功能。和Spring Security相比，Shiro的API更简洁，学习成本低，适合中小型项目使用。Shiro的几个核心概念：Subject代表当前操作用户，SecurityManager是安全管理中心，Realm负责从数据源读取用户和权限信息，Session管理用户会话。</w:t>
       </w:r>
       <w:r>
         <w:rPr>
@@ -3314,35 +3268,35 @@
           <w:sz w:val="24"/>
           <w:szCs w:val="24"/>
         </w:rPr>
-        <w:t xml:space="preserve">本系统采用Apache Shiro 2.0.5版本（Jakarta分类器）进行安全控制。系统通过ShiroConfiguration配置类定义了安全过滤器链，对不同URL路径设置了不同的访问权限。例如，/dist/**、/theme/**、/storage/**路径设置为anon（匿名访问），/login路径设置为anon，/user/**和/settings/**路径设置为authc（需要认证），后台管理路径如/admin/channel/list设置为authc,perms[channel:list]（需要认证且拥有channel:list权限）。</w:t>
-      </w:r>
-    </w:p>
-    <w:p>
-      <w:pPr>
-        <w:spacing w:after="0" w:before="0" w:line="288" w:lineRule="auto"/>
-        <w:ind w:firstLine="480"/>
-      </w:pPr>
-      <w:r>
-        <w:rPr>
-          <w:rFonts w:ascii="Times New Roman" w:eastAsia="宋体" w:hAnsi="Times New Roman"/>
-          <w:sz w:val="24"/>
-          <w:szCs w:val="24"/>
-        </w:rPr>
-        <w:t xml:space="preserve">系统自定义了AccountRealm作为安全数据源，继承AuthorizingRealm，负责从数据库中查询用户信息和权限信息并进行认证和授权。AccountRealm的doGetAuthenticationInfo方法调用UserService.login()进行用户名密码校验，doGetAuthorizationInfo方法通过UserRoleService查询用户角色和权限列表，将角色和权限信息注入SimpleAuthorizationInfo。AuthenticatedFilter自定义过滤器替代了默认的authc过滤器，实现了灵活的登录流程。此外，系统集成了EhCache作为Shiro的缓存管理器，缓存用户的认证和授权信息，减少数据库查询次数，提升系统性能。</w:t>
-      </w:r>
-    </w:p>
-    <w:p>
-      <w:pPr>
-        <w:spacing w:after="0" w:before="0" w:line="288" w:lineRule="auto"/>
-        <w:ind w:firstLine="480"/>
-      </w:pPr>
-      <w:r>
-        <w:rPr>
-          <w:rFonts w:ascii="Times New Roman" w:eastAsia="宋体" w:hAnsi="Times New Roman"/>
-          <w:sz w:val="24"/>
-          <w:szCs w:val="24"/>
-        </w:rPr>
-        <w:t xml:space="preserve">在权限管理方面，系统实现了基于角色的访问控制（RBAC）模型。schema.sql中定义了shiro_role（角色表）、shiro_permission（权限表，含UK_NAME唯一索引）、shiro_role_permission（角色权限关联表）和shiro_user_role（用户角色关联表）四张表。系统预定义了20项权限，涵盖channel（栏目管理）、post（文章管理）、comment（评论管理）、user（用户管理）、role（角色管理）、theme（主题管理）、options（系统配置）和admin（进入后台）等分类。管理员可通过UserController的update_role接口为用户分配角色，角色关联的权限即决定了用户可访问的后台功能。</w:t>
+        <w:t xml:space="preserve">本系统用Shiro 2.0.5（Jakarta分类器）做安全控制。ShiroConfiguration配置类定义了URL过滤器链：/dist/**、/theme/**、/storage/**设为anon匿名访问；/login也设为anon；/user/**和/settings/**需要authc认证；后台路径如/admin/channel/list需要authc加perms[channel:list]，也就是既要求登录又要求有channel:list权限。</w:t>
+      </w:r>
+    </w:p>
+    <w:p>
+      <w:pPr>
+        <w:spacing w:after="0" w:before="0" w:line="288" w:lineRule="auto"/>
+        <w:ind w:firstLine="480"/>
+      </w:pPr>
+      <w:r>
+        <w:rPr>
+          <w:rFonts w:ascii="Times New Roman" w:eastAsia="宋体" w:hAnsi="Times New Roman"/>
+          <w:sz w:val="24"/>
+          <w:szCs w:val="24"/>
+        </w:rPr>
+        <w:t xml:space="preserve">认证逻辑在自定义的AccountRealm中实现。doGetAuthenticationInfo方法调用UserServiceImpl.login()校验用户名密码，校验通过后把AccountProfile对象存入Shiro Session。doGetAuthorizationInfo方法通过UserRoleService查询用户角色和权限，注入SimpleAuthorizationInfo供权限拦截器使用。AuthenticatedFilter替代了默认的authc过滤器，实现了更灵活的登录跳转逻辑。认证和授权信息用EhCache缓存，避免每次请求都查数据库。</w:t>
+      </w:r>
+    </w:p>
+    <w:p>
+      <w:pPr>
+        <w:spacing w:after="0" w:before="0" w:line="288" w:lineRule="auto"/>
+        <w:ind w:firstLine="480"/>
+      </w:pPr>
+      <w:r>
+        <w:rPr>
+          <w:rFonts w:ascii="Times New Roman" w:eastAsia="宋体" w:hAnsi="Times New Roman"/>
+          <w:sz w:val="24"/>
+          <w:szCs w:val="24"/>
+        </w:rPr>
+        <w:t xml:space="preserve">权限模型采用RBAC（基于角色的访问控制）。数据库里有四张Shiro表：shiro_role（角色）、shiro_permission（权限，有UK_NAME唯一索引）、shiro_role_permission（角色-权限关联）、shiro_user_role（用户-角色关联）。系统预定义了20项权限，覆盖channel、post、comment、user、role、theme、options、admin等分类。管理员通过UserController的update_role接口给用户分配角色，角色的权限决定了用户能访问哪些后台功能。</w:t>
       </w:r>
     </w:p>
     <w:p>
@@ -3369,7 +3323,7 @@
           <w:sz w:val="24"/>
           <w:szCs w:val="24"/>
         </w:rPr>
-        <w:t xml:space="preserve">MySQL是一种开源的关系型数据库管理系统，以其体积小、速度快、总体拥有成本低等特点，成为目前最流行的数据库之一。MySQL支持标准的SQL语言，提供了ACID事务支持、行级锁、外键约束等关系型数据库的核心特性。</w:t>
+        <w:t xml:space="preserve">MySQL是目前使用最广的开源关系型数据库，支持标准SQL、ACID事务、行级锁和外键约束。MySQL体积小、部署简单、社区活跃，在Web应用中几乎是标配。</w:t>
       </w:r>
       <w:r>
         <w:rPr>
@@ -3392,21 +3346,21 @@
           <w:sz w:val="24"/>
           <w:szCs w:val="24"/>
         </w:rPr>
-        <w:t xml:space="preserve">本系统使用MySQL作为后端数据库，数据库名为db_mblog。系统通过Spring Boot的数据源配置连接MySQL数据库，同时支持H2内存数据库作为开发和测试环境的替代方案。schema.sql脚本中预定义了系统初始化所需的频道数据、系统配置数据、管理员用户和权限数据，Flyway数据库迁移工具（默认关闭）可用于管理数据库版本。</w:t>
-      </w:r>
-    </w:p>
-    <w:p>
-      <w:pPr>
-        <w:spacing w:after="0" w:before="0" w:line="288" w:lineRule="auto"/>
-        <w:ind w:firstLine="480"/>
-      </w:pPr>
-      <w:r>
-        <w:rPr>
-          <w:rFonts w:ascii="Times New Roman" w:eastAsia="宋体" w:hAnsi="Times New Roman"/>
-          <w:sz w:val="24"/>
-          <w:szCs w:val="24"/>
-        </w:rPr>
-        <w:t xml:space="preserve">schema.sql中定义的数据表包括：mto_channel（频道表，含banner、博客、随笔、分享四个频道）、mto_options（系统配置表，存储网站名称、域名、SEO等信息）、mto_user（用户表，含UK_USERNAME唯一索引保证用户名唯一），以及shiro_permission、shiro_role、shiro_role_permission、shiro_user_role四张Shiro权限表。文章、评论、标签、收藏等业务表由JPA实体类通过自动建表机制创建。各表通过外键关联建立了关系，如文章表中的author_id字段关联用户表id，文章表中的channel_id字段关联频道表id。</w:t>
+        <w:t xml:space="preserve">本系统的数据库名为db_mblog，通过Spring Boot的数据源配置连接MySQL。开发测试时也支持切换到H2内存数据库。schema.sql脚本预置了频道、系统配置、管理员用户和权限数据，Flyway迁移工具默认关闭，需要时可以打开。</w:t>
+      </w:r>
+    </w:p>
+    <w:p>
+      <w:pPr>
+        <w:spacing w:after="0" w:before="0" w:line="288" w:lineRule="auto"/>
+        <w:ind w:firstLine="480"/>
+      </w:pPr>
+      <w:r>
+        <w:rPr>
+          <w:rFonts w:ascii="Times New Roman" w:eastAsia="宋体" w:hAnsi="Times New Roman"/>
+          <w:sz w:val="24"/>
+          <w:szCs w:val="24"/>
+        </w:rPr>
+        <w:t xml:space="preserve">schema.sql定义的表包括：mto_channel（频道表，预置banner、博客、随笔、分享四个频道）、mto_options（系统配置表，存网站名称、域名、SEO信息等）、mto_user（用户表，UK_USERNAME唯一索引保证用户名不重复），以及shiro_permission、shiro_role、shiro_role_permission、shiro_user_role四张Shiro权限表。文章、评论、标签、收藏这些业务表是JPA自动建的，各表之间通过外键关联，比如文章表的author_id指向用户表id，channel_id指向频道表id。</w:t>
       </w:r>
     </w:p>
     <w:p>
@@ -3433,7 +3387,7 @@
           <w:sz w:val="24"/>
           <w:szCs w:val="24"/>
         </w:rPr>
-        <w:t xml:space="preserve">Hibernate Search是Hibernate ORM的扩展模块，它将Hibernate的持久化模型与Apache Lucene全文搜索引擎相结合，为应用提供了强大的全文搜索能力。Hibernate Search通过注解方式将实体类的指定字段建立全文索引，开发者可以通过简单的API进行全文搜索查询。</w:t>
+        <w:t xml:space="preserve">Hibernate Search是Hibernate ORM的扩展，把Hibernate的持久化模型和Apache Lucene搜索引擎对接起来。开发者用注解标记需要建索引的字段，数据写入时Hibernate Search自动更新Lucene索引，查询时用简单的API就能做全文检索。</w:t>
       </w:r>
       <w:r>
         <w:rPr>
@@ -3456,21 +3410,21 @@
           <w:sz w:val="24"/>
           <w:szCs w:val="24"/>
         </w:rPr>
-        <w:t xml:space="preserve">本系统集成了Hibernate Search 7.2.4版本，配合Lucene搜索引擎和lucene-analyzers-smartcn（8.11.4版本）中文分词器，实现了文章标题、摘要和标签的全文搜索功能。在PostSearchServiceImpl.search()方法中，系统通过Search.session(entityManager)获取SearchSession，构建布尔查询对title、summary、tags三个字段进行fuzzy模糊匹配，并支持分页查询和结果总数统计。</w:t>
-      </w:r>
-    </w:p>
-    <w:p>
-      <w:pPr>
-        <w:spacing w:after="0" w:before="0" w:line="288" w:lineRule="auto"/>
-        <w:ind w:firstLine="480"/>
-      </w:pPr>
-      <w:r>
-        <w:rPr>
-          <w:rFonts w:ascii="Times New Roman" w:eastAsia="宋体" w:hAnsi="Times New Roman"/>
-          <w:sz w:val="24"/>
-          <w:szCs w:val="24"/>
-        </w:rPr>
-        <w:t xml:space="preserve">系统通过SmartCnAnalysisConfigurer配置类对SmartCN中文分词器进行注册和配置，使Hibernate Search能够正确处理中文内容的分词。当文章发布或更新时，Hibernate Search会自动同步更新Lucene索引，保证搜索结果的实时性。此外，OptionsController提供了reset_indexes接口，管理员可通过PostSearchService.resetIndexes()方法调用massIndexer重建全部索引，保证索引数据的一致性。搜索功能为用户提供了便捷的文章检索体验。</w:t>
+        <w:t xml:space="preserve">本系统集成了Hibernate Search 7.2.4和lucene-analyzers-smartcn 8.11.4中文分词器。PostSearchServiceImpl.search()方法通过Search.session(entityManager)拿到SearchSession，构建布尔查询对title、summary、tags三个字段做fuzzy模糊匹配，fuzzy(1)参数允许1个编辑距离的容错。查询结果分页返回，同时返回总命中数。</w:t>
+      </w:r>
+    </w:p>
+    <w:p>
+      <w:pPr>
+        <w:spacing w:after="0" w:before="0" w:line="288" w:lineRule="auto"/>
+        <w:ind w:firstLine="480"/>
+      </w:pPr>
+      <w:r>
+        <w:rPr>
+          <w:rFonts w:ascii="Times New Roman" w:eastAsia="宋体" w:hAnsi="Times New Roman"/>
+          <w:sz w:val="24"/>
+          <w:szCs w:val="24"/>
+        </w:rPr>
+        <w:t xml:space="preserve">中文分词由SmartCnAnalysisConfigurer配置类注册SmartCN分词器。文章发布或更新时Lucene索引自动同步，管理员也可以通过OptionsController的reset_indexes接口调用massIndexer重建全部索引。</w:t>
       </w:r>
     </w:p>
     <w:p>
@@ -3512,7 +3466,7 @@
           <w:sz w:val="24"/>
           <w:szCs w:val="24"/>
         </w:rPr>
-        <w:t xml:space="preserve">本系统的功能性需求主要涵盖前台用户功能和后台管理功能两个方面。前台功能面向普通注册用户和访客，后台功能面向系统管理员。系统通过application.yml中的site.controls配置项控制注册、发布文章和评论三个开关的启停状态。</w:t>
+        <w:t xml:space="preserve">系统的功能性需求分前台和后台两部分。前台面向注册用户和访客，后台面向管理员。application.yml里的site.controls配置项可以控制注册、发文章、评论三个功能的开关。</w:t>
       </w:r>
     </w:p>
     <w:p>
@@ -3539,7 +3493,7 @@
           <w:sz w:val="24"/>
           <w:szCs w:val="24"/>
         </w:rPr>
-        <w:t xml:space="preserve">用户管理功能包括用户注册、用户登录和个人信息管理。用户注册时，用户提交用户名和密码后，系统校验用户名密码非空并检查用户名唯一性，密码通过MD5加密后存储，用户状态设置为ENABLED（已启用），注册成功后自动登录并跳转至用户主页。用户登录基于Shiro认证框架，通过用户名密码进行身份验证，登录后系统创建会话并更新最后登录时间，返回包含未读消息数的AccountProfile对象。个人信息管理功能允许用户修改昵称、个性签名、头像和邮箱，以及修改登录密码（需校验旧密码）。</w:t>
+        <w:t xml:space="preserve">用户管理包括注册、登录和个人信息管理。注册时用户提交用户名和密码，系统校验非空和唯一性后用MD5加密密码，状态设为ENABLED，注册成功后自动登录跳转到用户主页。登录走Shiro认证流程，验证通过后创建会话、更新最后登录时间。个人信息管理支持修改昵称、签名、头像、邮箱和密码，改密码时要校验旧密码。</w:t>
       </w:r>
     </w:p>
     <w:p>
@@ -3566,7 +3520,7 @@
           <w:sz w:val="24"/>
           <w:szCs w:val="24"/>
         </w:rPr>
-        <w:t xml:space="preserve">文章管理功能是系统的核心功能，包括文章发布、编辑、删除和查看。文章发布支持Markdown编辑器，用户可以设置文章标题、所属频道、标签、摘要和封面图片。系统自动处理Markdown文本渲染和摘要提取，当摘要为空时系统自动截取前126个字符作为摘要。文章编辑允许作者修改已发布文章的内容和属性，更新时系统通过ResourceLock资源锁保证并发安全，并对比新旧内容增减图片资源引用计数。文章删除支持单篇删除和批量删除，删除前校验当前用户是否为文章作者，删除时同步清理关联的文章属性、资源引用并发布删除事件。文章查看功能支持按发布时间排序和按浏览量排序，并提供分页浏览。</w:t>
+        <w:t xml:space="preserve">文章管理是系统的核心功能，包括发布、编辑、删除和浏览。发布文章用Markdown编辑器，可以设置标题、频道、标签、摘要和封面图。摘要为空时系统自动截取正文前126个字符。编辑文章时用ResourceLock资源锁防止并发冲突，同时对比新旧内容增减图片资源引用计数。删除文章前校验当前用户是不是作者，删除时清理关联的属性、资源引用并发布删除事件。文章列表支持按时间和浏览量排序，分页浏览。</w:t>
       </w:r>
     </w:p>
     <w:p>
@@ -3593,7 +3547,7 @@
           <w:sz w:val="24"/>
           <w:szCs w:val="24"/>
         </w:rPr>
-        <w:t xml:space="preserve">评论功能允许登录用户对文章发表评论，支持多级评论回复。评论数据存储在mto_comment表中，通过pid（父评论ID）字段实现评论的层级关系。系统在文章详情页展示评论列表，并实时统计文章的评论数量。评论发表后，系统通过事件机制通知文章作者。后台评论管理支持查看评论列表和删除评论操作。</w:t>
+        <w:t xml:space="preserve">登录用户可以对文章发表评论，也支持多级回复。评论表mto_comment的pid字段记录父评论ID，靠这个字段维护评论的层级关系。文章详情页展示评论列表并显示评论数。后台可以查看和删除评论。</w:t>
       </w:r>
     </w:p>
     <w:p>
@@ -3620,7 +3574,7 @@
           <w:sz w:val="24"/>
           <w:szCs w:val="24"/>
         </w:rPr>
-        <w:t xml:space="preserve">系统通过频道和标签两种方式对文章进行分类组织。频道是预定义的文章分类，系统初始化了banner、博客、随笔、分享四个频道，管理员可以在后台创建、编辑、删除和排序频道。标签由用户在发布文章时自由设定，系统通过mto_post_tag表维护文章与标签的多对多关系，并提供标签云页面展示热门标签。</w:t>
+        <w:t xml:space="preserve">文章通过频道和标签两种方式分类。频道是系统预置的，初始化了banner、博客、随笔、分享四个，管理员可以在后台增删改和排序。标签由用户发布文章时自由填写，通过mto_post_tag表维护文章和标签的多对多关系，系统提供标签云页面展示热门标签。</w:t>
       </w:r>
     </w:p>
     <w:p>
@@ -3647,7 +3601,7 @@
           <w:sz w:val="24"/>
           <w:szCs w:val="24"/>
         </w:rPr>
-        <w:t xml:space="preserve">系统提供全文搜索功能，用户可以通过关键词搜索文章的标题、摘要和标签内容。搜索功能基于Hibernate Search和Lucene实现，采用SmartCN中文分词器对中文内容进行分词处理，支持模糊匹配和分页查询。搜索结果按相关度排序，搜索结果中加载文章作者信息一并展示。</w:t>
+        <w:t xml:space="preserve">用户输入关键词可以搜索文章的标题、摘要和标签。搜索基于Hibernate Search和Lucene实现，用SmartCN分词器处理中文，支持模糊匹配和分页。搜索结果按相关度排序，同时加载作者信息一起展示。</w:t>
       </w:r>
     </w:p>
     <w:p>
@@ -3674,7 +3628,7 @@
           <w:sz w:val="24"/>
           <w:szCs w:val="24"/>
         </w:rPr>
-        <w:t xml:space="preserve">收藏功能允许登录用户收藏感兴趣的文章，收藏记录存储在mto_favorite表中。用户可以在个人中心查看已收藏的文章列表，并取消收藏。文章被收藏时，系统自动更新文章的收藏计数；取消收藏时递减计数。</w:t>
+        <w:t xml:space="preserve">登录用户可以收藏文章，收藏记录存在mto_favorite表里。个人中心可以查看收藏列表和取消收藏。收藏和取消收藏时系统会更新文章的收藏计数。</w:t>
       </w:r>
     </w:p>
     <w:p>
@@ -3701,7 +3655,7 @@
           <w:sz w:val="24"/>
           <w:szCs w:val="24"/>
         </w:rPr>
-        <w:t xml:space="preserve">后台管理功能面向系统管理员，通过/admin路径访问，由Shiro权限拦截器进行访问控制。后台菜单包含栏目管理、文章管理、评论管理、用户管理和系统配置五项，对应六个控制器：AdminController提供仪表盘（计数统计与JVM内存监控）；ChannelController提供频道的增删改查和排序；CommentController提供评论列表查看和删除；PostController提供文章列表、编辑、置顶、推荐、删除和批量删除；UserController提供用户列表、角色分配、密码重置、启用和禁用；OptionsController提供系统参数配置和全文索引重建。</w:t>
+        <w:t xml:space="preserve">后台通过/admin路径访问，由Shiro权限拦截器控制。菜单有五项，对应六个控制器：AdminController做仪表盘（统计计数加JVM内存监控）；ChannelController管频道的增删改查和排序；CommentController管评论的查看和删除；PostController管文章的列表、编辑、删除和批量删除；UserController管用户列表、角色分配、密码重置、启禁用；OptionsController管系统配置和全文索引重建。</w:t>
       </w:r>
     </w:p>
     <w:p>
@@ -3741,7 +3695,7 @@
           <w:sz w:val="24"/>
           <w:szCs w:val="24"/>
         </w:rPr>
-        <w:t xml:space="preserve">系统应能够在合理的响应时间内处理用户请求。页面加载时间应控制在3秒以内，文章列表分页查询响应时间不超过1秒，全文搜索响应时间不超过2秒。系统通过EhCache缓存机制减少数据库查询次数，通过分页查询避免一次性加载过多数据，通过Hibernate Search索引提升搜索性能。内嵌的Undertow服务器配置了2个IO线程和32个工作线程，支持并发请求处理。文件上传限制最大文件大小为10MB，图片存储限制最大宽度为800像素、大小为2MB。</w:t>
+        <w:t xml:space="preserve">系统应能快速响应用户请求。页面加载控制在3秒以内，文章列表分页查询不超过1秒，全文搜索不超过2秒。具体的优化手段包括：用EhCache缓存减少数据库查询、分页查询避免一次性加载过多数据、Hibernate Search索引加速搜索。Undertow服务器配了2个IO线程和32个工作线程处理并发。文件上传限制10MB，图片限制宽度800像素、大小2MB。</w:t>
       </w:r>
       <w:r>
         <w:rPr>
@@ -3777,7 +3731,7 @@
           <w:sz w:val="24"/>
           <w:szCs w:val="24"/>
         </w:rPr>
-        <w:t xml:space="preserve">系统需要保证用户数据的安全性和系统的稳定性。用户密码采用MD5加密存储，防止明文泄露。后台管理路径通过Shiro权限拦截器进行访问控制，基于RBAC模型实现细粒度的权限控制，未授权用户无法访问管理功能。系统通过Jsoup库对用户输入的HTML内容进行清洗，防止跨站脚本攻击。文章删除操作通过Assert.isTrue校验当前用户是否为文章作者，防止越权删除。文件上传功能对文件类型和大小进行限制，防止恶意文件上传。</w:t>
+        <w:t xml:space="preserve">安全方面需要保证用户数据和系统稳定。密码用MD5加密存储，不存明文。后台路径由Shiro拦截器做RBAC权限控制，没授权的用户进不了管理功能。用户输入的HTML内容用Jsoup清洗，防XSS攻击。删文章时校验当前用户是不是作者，防越权删除。文件上传限制了类型和大小，防恶意文件。</w:t>
       </w:r>
     </w:p>
     <w:p>
@@ -3804,7 +3758,7 @@
           <w:sz w:val="24"/>
           <w:szCs w:val="24"/>
         </w:rPr>
-        <w:t xml:space="preserve">系统应具备良好的可扩展性，支持功能模块的灵活扩展。系统采用Spring Boot的自动配置机制，新增功能模块只需添加相应的依赖和配置。模板引擎支持加载外部模板文件，管理员可以在不重新编译代码的情况下扩展模板。系统通过@PostStatusFilter注解和AOP切面实现了数据权限过滤的灵活扩展，通过ApplicationContext发布PostUpdateEvent事件实现业务逻辑的解耦，新增文章更新后的处理逻辑只需添加新的事件监听器即可。</w:t>
+        <w:t xml:space="preserve">系统应支持功能模块的灵活扩展。Spring Boot的自动配置机制让新功能只需加依赖和配置就行。模板引擎支持加载外部模板文件，不用重新编译代码就能扩展页面。@PostStatusFilter注解和AOP切面让数据权限过滤可以灵活扩展。ApplicationContext发布PostUpdateEvent事件实现了解耦，要加新的文章更新后处理逻辑，写个事件监听器就够了。</w:t>
       </w:r>
     </w:p>
     <w:p>
@@ -3831,7 +3785,7 @@
           <w:sz w:val="24"/>
           <w:szCs w:val="24"/>
         </w:rPr>
-        <w:t xml:space="preserve">系统代码应具备良好的可读性和可维护性。系统采用MVC分层架构，各层职责清晰，降低了模块间的耦合度。Service层采用接口与实现分离的设计模式，便于代码的单元测试和功能替换。系统使用Lombok库减少样板代码，通过Fastjson2进行JSON序列化，使用Commonmark库处理Markdown文本渲染。日志系统采用Logback，支持不同环境的日志级别配置。ResourceLock工具类通过ConcurrentHashMap和AtomicInteger实现了细粒度的资源锁管理，保证了并发操作的安全性。</w:t>
+        <w:t xml:space="preserve">代码要可读、好维护。MVC分层让各层职责清晰，耦合度低。Service层接口和实现分离，方便单测和替换。Lombok减少样板代码，Fastjson2做JSON序列化，Commonmark处理Markdown渲染。日志用Logback，支持不同环境的日志级别。ResourceLock工具类用ConcurrentHashMap和AtomicInteger做了细粒度资源锁，保证并发安全。</w:t>
       </w:r>
     </w:p>
     <w:p>
@@ -3873,21 +3827,21 @@
           <w:sz w:val="24"/>
           <w:szCs w:val="24"/>
         </w:rPr>
-        <w:t xml:space="preserve">系统设计遵循以下原则：</w:t>
-      </w:r>
-    </w:p>
-    <w:p>
-      <w:pPr>
-        <w:spacing w:after="0" w:before="0" w:line="288" w:lineRule="auto"/>
-        <w:ind w:firstLine="480"/>
-      </w:pPr>
-      <w:r>
-        <w:rPr>
-          <w:rFonts w:ascii="Times New Roman" w:eastAsia="宋体" w:hAnsi="Times New Roman"/>
-          <w:sz w:val="24"/>
-          <w:szCs w:val="24"/>
-        </w:rPr>
-        <w:t xml:space="preserve">（1）MVC架构模式：系统采用Model-View-Controller三层架构，将数据模型、视图展示和业务控制分离，提高了代码的可维护性和可测试性。</w:t>
+        <w:t xml:space="preserve">系统设计主要遵循以下原则。</w:t>
+      </w:r>
+    </w:p>
+    <w:p>
+      <w:pPr>
+        <w:spacing w:after="0" w:before="0" w:line="288" w:lineRule="auto"/>
+        <w:ind w:firstLine="480"/>
+      </w:pPr>
+      <w:r>
+        <w:rPr>
+          <w:rFonts w:ascii="Times New Roman" w:eastAsia="宋体" w:hAnsi="Times New Roman"/>
+          <w:sz w:val="24"/>
+          <w:szCs w:val="24"/>
+        </w:rPr>
+        <w:t xml:space="preserve">第一是MVC架构模式，把数据模型、视图展示和业务控制分开，代码更好维护也更好测试。</w:t>
       </w:r>
       <w:r>
         <w:rPr>
@@ -3919,49 +3873,49 @@
           <w:sz w:val="24"/>
           <w:szCs w:val="24"/>
         </w:rPr>
-        <w:t xml:space="preserve">（2）分层设计：系统在MVC架构基础上进一步细化分层，包括实体层（entity）、数据访问层（repository）、业务逻辑层（service）、控制层（controller）和视图层（template），各层通过接口进行交互，降低了层间耦合。</w:t>
-      </w:r>
-    </w:p>
-    <w:p>
-      <w:pPr>
-        <w:spacing w:after="0" w:before="0" w:line="288" w:lineRule="auto"/>
-        <w:ind w:firstLine="480"/>
-      </w:pPr>
-      <w:r>
-        <w:rPr>
-          <w:rFonts w:ascii="Times New Roman" w:eastAsia="宋体" w:hAnsi="Times New Roman"/>
-          <w:sz w:val="24"/>
-          <w:szCs w:val="24"/>
-        </w:rPr>
-        <w:t xml:space="preserve">（3）单一职责原则：每个类和模块只负责一个功能领域，如PostService只负责文章相关的业务逻辑，UserService只负责用户相关的业务逻辑，避免类的功能过于庞大。</w:t>
-      </w:r>
-    </w:p>
-    <w:p>
-      <w:pPr>
-        <w:spacing w:after="0" w:before="0" w:line="288" w:lineRule="auto"/>
-        <w:ind w:firstLine="480"/>
-      </w:pPr>
-      <w:r>
-        <w:rPr>
-          <w:rFonts w:ascii="Times New Roman" w:eastAsia="宋体" w:hAnsi="Times New Roman"/>
-          <w:sz w:val="24"/>
-          <w:szCs w:val="24"/>
-        </w:rPr>
-        <w:t xml:space="preserve">（4）开闭原则：系统通过接口、抽象类和事件机制实现开闭原则，如PostUpdateEvent事件允许系统在不修改PostService代码的情况下扩展文章更新后的处理逻辑，MessageEventHandler和PostUpdateEventHandler分别处理消息通知和文章统计更新。</w:t>
-      </w:r>
-    </w:p>
-    <w:p>
-      <w:pPr>
-        <w:spacing w:after="0" w:before="0" w:line="288" w:lineRule="auto"/>
-        <w:ind w:firstLine="480"/>
-      </w:pPr>
-      <w:r>
-        <w:rPr>
-          <w:rFonts w:ascii="Times New Roman" w:eastAsia="宋体" w:hAnsi="Times New Roman"/>
-          <w:sz w:val="24"/>
-          <w:szCs w:val="24"/>
-        </w:rPr>
-        <w:t xml:space="preserve">（5）安全优先：系统在架构设计阶段即考虑安全因素，通过Shiro框架实现统一的认证和授权，在数据层通过Hibernate过滤器实现数据权限控制，在并发场景通过ResourceLock实现资源锁管理。</w:t>
+        <w:t xml:space="preserve">第二是分层设计，在MVC基础上进一步细分为实体层、数据访问层、业务逻辑层、控制层和视图层，各层通过接口交互，降低层间耦合。</w:t>
+      </w:r>
+    </w:p>
+    <w:p>
+      <w:pPr>
+        <w:spacing w:after="0" w:before="0" w:line="288" w:lineRule="auto"/>
+        <w:ind w:firstLine="480"/>
+      </w:pPr>
+      <w:r>
+        <w:rPr>
+          <w:rFonts w:ascii="Times New Roman" w:eastAsia="宋体" w:hAnsi="Times New Roman"/>
+          <w:sz w:val="24"/>
+          <w:szCs w:val="24"/>
+        </w:rPr>
+        <w:t xml:space="preserve">第三是单一职责，每个类只管一个功能领域——PostService只管文章，UserService只管用户，避免出现什么都管的"上帝类"。</w:t>
+      </w:r>
+    </w:p>
+    <w:p>
+      <w:pPr>
+        <w:spacing w:after="0" w:before="0" w:line="288" w:lineRule="auto"/>
+        <w:ind w:firstLine="480"/>
+      </w:pPr>
+      <w:r>
+        <w:rPr>
+          <w:rFonts w:ascii="Times New Roman" w:eastAsia="宋体" w:hAnsi="Times New Roman"/>
+          <w:sz w:val="24"/>
+          <w:szCs w:val="24"/>
+        </w:rPr>
+        <w:t xml:space="preserve">第四是开闭原则，通过接口和事件机制实现对扩展开放、对修改关闭。比如PostUpdateEvent事件让系统不改PostService代码就能加新的文章更新后处理逻辑。</w:t>
+      </w:r>
+    </w:p>
+    <w:p>
+      <w:pPr>
+        <w:spacing w:after="0" w:before="0" w:line="288" w:lineRule="auto"/>
+        <w:ind w:firstLine="480"/>
+      </w:pPr>
+      <w:r>
+        <w:rPr>
+          <w:rFonts w:ascii="Times New Roman" w:eastAsia="宋体" w:hAnsi="Times New Roman"/>
+          <w:sz w:val="24"/>
+          <w:szCs w:val="24"/>
+        </w:rPr>
+        <w:t xml:space="preserve">第五是安全优先，架构设计阶段就考虑了安全因素——Shiro做统一认证授权，Hibernate过滤器做数据权限控制，ResourceLock做并发资源锁管理。</w:t>
       </w:r>
     </w:p>
     <w:p>
@@ -3988,91 +3942,91 @@
           <w:sz w:val="24"/>
           <w:szCs w:val="24"/>
         </w:rPr>
-        <w:t xml:space="preserve">系统采用经典的MVC分层架构，结合Spring Boot的自动配置特性，整体架构分为以下层次：</w:t>
-      </w:r>
-    </w:p>
-    <w:p>
-      <w:pPr>
-        <w:spacing w:after="0" w:before="0" w:line="288" w:lineRule="auto"/>
-        <w:ind w:firstLine="480"/>
-      </w:pPr>
-      <w:r>
-        <w:rPr>
-          <w:rFonts w:ascii="Times New Roman" w:eastAsia="宋体" w:hAnsi="Times New Roman"/>
-          <w:sz w:val="24"/>
-          <w:szCs w:val="24"/>
-        </w:rPr>
-        <w:t xml:space="preserve">（1）表现层：采用FreeMarker模板引擎渲染页面，通过自定义模板指令（ChannelDirective、ContentsDirective、SidebarDirective等）封装数据查询逻辑，实现了视图与数据的解耦。模板文件位于resources/templates目录下，支持从外部文件系统加载自定义主题模板。</w:t>
-      </w:r>
-    </w:p>
-    <w:p>
-      <w:pPr>
-        <w:spacing w:after="0" w:before="0" w:line="288" w:lineRule="auto"/>
-        <w:ind w:firstLine="480"/>
-      </w:pPr>
-      <w:r>
-        <w:rPr>
-          <w:rFonts w:ascii="Times New Roman" w:eastAsia="宋体" w:hAnsi="Times New Roman"/>
-          <w:sz w:val="24"/>
-          <w:szCs w:val="24"/>
-        </w:rPr>
-        <w:t xml:space="preserve">（2）控制层：由Spring MVC的Controller组件构成，负责接收HTTP请求、调用业务逻辑并返回响应。控制层分为前台控制器（controller.site包，含IndexController、ChannelController、SearchController、TagController）和后台控制器（controller.admin包，含六个管理控制器）。BaseController作为基类，提供了分页参数封装、当前用户获取等公共方法。</w:t>
-      </w:r>
-    </w:p>
-    <w:p>
-      <w:pPr>
-        <w:spacing w:after="0" w:before="0" w:line="288" w:lineRule="auto"/>
-        <w:ind w:firstLine="480"/>
-      </w:pPr>
-      <w:r>
-        <w:rPr>
-          <w:rFonts w:ascii="Times New Roman" w:eastAsia="宋体" w:hAnsi="Times New Roman"/>
-          <w:sz w:val="24"/>
-          <w:szCs w:val="24"/>
-        </w:rPr>
-        <w:t xml:space="preserve">（3）业务层：由Service接口和ServiceImpl实现类构成，封装了核心业务逻辑。Service层使用@Transactional注解管理事务，通过ApplicationContext发布领域事件（PostUpdateEvent、MessageEvent），实现了业务逻辑的解耦。系统还通过AOP切面（HibernateFilterAspect和@PostStatusFilter注解）实现了数据权限过滤。</w:t>
-      </w:r>
-    </w:p>
-    <w:p>
-      <w:pPr>
-        <w:spacing w:after="0" w:before="0" w:line="288" w:lineRule="auto"/>
-        <w:ind w:firstLine="480"/>
-      </w:pPr>
-      <w:r>
-        <w:rPr>
-          <w:rFonts w:ascii="Times New Roman" w:eastAsia="宋体" w:hAnsi="Times New Roman"/>
-          <w:sz w:val="24"/>
-          <w:szCs w:val="24"/>
-        </w:rPr>
-        <w:t xml:space="preserve">（4）持久层：基于Spring Data JPA的Repository接口构成，负责与数据库交互。Repository接口继承JpaRepository，通过方法命名约定和@Query注解实现数据查询。系统还使用了JPA的Specification接口实现动态条件查询，如PostServiceImpl.paging()方法根据channelId和excludeChannelIds动态构建查询条件。</w:t>
-      </w:r>
-    </w:p>
-    <w:p>
-      <w:pPr>
-        <w:spacing w:after="0" w:before="0" w:line="288" w:lineRule="auto"/>
-        <w:ind w:firstLine="480"/>
-      </w:pPr>
-      <w:r>
-        <w:rPr>
-          <w:rFonts w:ascii="Times New Roman" w:eastAsia="宋体" w:hAnsi="Times New Roman"/>
-          <w:sz w:val="24"/>
-          <w:szCs w:val="24"/>
-        </w:rPr>
-        <w:t xml:space="preserve">（5）安全层：由Apache Shiro框架构成，包括AccountRealm（认证授权Realm）、AuthenticatedFilter（自定义认证过滤器）和ShiroConfiguration（安全配置）。安全层通过过滤器链对URL进行访问控制，基于RBAC模型实现了细粒度的权限管理。</w:t>
-      </w:r>
-    </w:p>
-    <w:p>
-      <w:pPr>
-        <w:spacing w:after="0" w:before="0" w:line="288" w:lineRule="auto"/>
-        <w:ind w:firstLine="480"/>
-      </w:pPr>
-      <w:r>
-        <w:rPr>
-          <w:rFonts w:ascii="Times New Roman" w:eastAsia="宋体" w:hAnsi="Times New Roman"/>
-          <w:sz w:val="24"/>
-          <w:szCs w:val="24"/>
-        </w:rPr>
-        <w:t xml:space="preserve">（6）搜索层：由Hibernate Search和Lucene构成，通过注解方式为实体类建立全文索引，提供全文搜索服务。搜索层与持久层紧密集成，在数据写入时自动同步索引，并通过SmartCnAnalysisConfigurer配置中文分词器。</w:t>
+        <w:t xml:space="preserve">系统采用经典的MVC分层架构，结合Spring Boot自动配置特性，整体分为以下几层。</w:t>
+      </w:r>
+    </w:p>
+    <w:p>
+      <w:pPr>
+        <w:spacing w:after="0" w:before="0" w:line="288" w:lineRule="auto"/>
+        <w:ind w:firstLine="480"/>
+      </w:pPr>
+      <w:r>
+        <w:rPr>
+          <w:rFonts w:ascii="Times New Roman" w:eastAsia="宋体" w:hAnsi="Times New Roman"/>
+          <w:sz w:val="24"/>
+          <w:szCs w:val="24"/>
+        </w:rPr>
+        <w:t xml:space="preserve">表现层用FreeMarker模板引擎渲染页面，通过ChannelDirective、ContentsDirective、SidebarDirective等自定义指令把数据查询逻辑封装起来，模板文件只管布局。模板放在resources/templates目录下，也支持从外部文件系统加载。</w:t>
+      </w:r>
+    </w:p>
+    <w:p>
+      <w:pPr>
+        <w:spacing w:after="0" w:before="0" w:line="288" w:lineRule="auto"/>
+        <w:ind w:firstLine="480"/>
+      </w:pPr>
+      <w:r>
+        <w:rPr>
+          <w:rFonts w:ascii="Times New Roman" w:eastAsia="宋体" w:hAnsi="Times New Roman"/>
+          <w:sz w:val="24"/>
+          <w:szCs w:val="24"/>
+        </w:rPr>
+        <w:t xml:space="preserve">控制层由Spring MVC的Controller组成，负责接收HTTP请求、调用Service、返回响应。前台控制器在controller.site包里，有IndexController、ChannelController、SearchController、TagController；后台控制器在controller.admin包里，有六个管理控制器。BaseController是基类，提供分页参数封装、当前用户获取等公共方法。</w:t>
+      </w:r>
+    </w:p>
+    <w:p>
+      <w:pPr>
+        <w:spacing w:after="0" w:before="0" w:line="288" w:lineRule="auto"/>
+        <w:ind w:firstLine="480"/>
+      </w:pPr>
+      <w:r>
+        <w:rPr>
+          <w:rFonts w:ascii="Times New Roman" w:eastAsia="宋体" w:hAnsi="Times New Roman"/>
+          <w:sz w:val="24"/>
+          <w:szCs w:val="24"/>
+        </w:rPr>
+        <w:t xml:space="preserve">业务层是Service接口加ServiceImpl实现类，封装核心业务逻辑。@Transactional注解管事务，ApplicationContext发领域事件做解耦。AOP切面HibernateFilterAspect配合@PostStatusFilter注解实现数据权限过滤。</w:t>
+      </w:r>
+    </w:p>
+    <w:p>
+      <w:pPr>
+        <w:spacing w:after="0" w:before="0" w:line="288" w:lineRule="auto"/>
+        <w:ind w:firstLine="480"/>
+      </w:pPr>
+      <w:r>
+        <w:rPr>
+          <w:rFonts w:ascii="Times New Roman" w:eastAsia="宋体" w:hAnsi="Times New Roman"/>
+          <w:sz w:val="24"/>
+          <w:szCs w:val="24"/>
+        </w:rPr>
+        <w:t xml:space="preserve">持久层基于Spring Data JPA的Repository接口，继承JpaRepository自动获得CRUD能力。复杂查询用@Query注解，动态查询用Specification接口——比如PostServiceImpl.paging()根据channelId和excludeChannelIds动态拼接条件。</w:t>
+      </w:r>
+    </w:p>
+    <w:p>
+      <w:pPr>
+        <w:spacing w:after="0" w:before="0" w:line="288" w:lineRule="auto"/>
+        <w:ind w:firstLine="480"/>
+      </w:pPr>
+      <w:r>
+        <w:rPr>
+          <w:rFonts w:ascii="Times New Roman" w:eastAsia="宋体" w:hAnsi="Times New Roman"/>
+          <w:sz w:val="24"/>
+          <w:szCs w:val="24"/>
+        </w:rPr>
+        <w:t xml:space="preserve">安全层由Apache Shiro框架构成，包括AccountRealm、AuthenticatedFilter和ShiroConfiguration。通过URL过滤器链做访问控制，基于RBAC模型实现细粒度权限管理。</w:t>
+      </w:r>
+    </w:p>
+    <w:p>
+      <w:pPr>
+        <w:spacing w:after="0" w:before="0" w:line="288" w:lineRule="auto"/>
+        <w:ind w:firstLine="480"/>
+      </w:pPr>
+      <w:r>
+        <w:rPr>
+          <w:rFonts w:ascii="Times New Roman" w:eastAsia="宋体" w:hAnsi="Times New Roman"/>
+          <w:sz w:val="24"/>
+          <w:szCs w:val="24"/>
+        </w:rPr>
+        <w:t xml:space="preserve">搜索层由Hibernate Search和Lucene构成，注解方式建全文索引，数据写入时自动同步索引，SmartCnAnalysisConfigurer配置中文分词器。</w:t>
       </w:r>
     </w:p>
     <w:p>
@@ -6571,49 +6525,21 @@
           <w:sz w:val="24"/>
           <w:szCs w:val="24"/>
         </w:rPr>
-        <w:t xml:space="preserve">系统测试是验证系统功能是否满足需求分析的重要环节。本系统测试方案包括功能测试、安全测试和性能测试三个方面。</w:t>
-      </w:r>
-    </w:p>
-    <w:p>
-      <w:pPr>
-        <w:spacing w:after="0" w:before="0" w:line="288" w:lineRule="auto"/>
-        <w:ind w:firstLine="480"/>
-      </w:pPr>
-      <w:r>
-        <w:rPr>
-          <w:rFonts w:ascii="Times New Roman" w:eastAsia="宋体" w:hAnsi="Times New Roman"/>
-          <w:sz w:val="24"/>
-          <w:szCs w:val="24"/>
-        </w:rPr>
-        <w:t xml:space="preserve">功能测试针对系统的各项功能模块进行验证，包括用户注册与登录、文章发布与编辑、评论互动、全文搜索、收藏管理、后台管理等核心功能。测试用例覆盖正常流程和异常流程，验证系统在各种输入条件下的正确性和健壮性。</w:t>
-      </w:r>
-    </w:p>
-    <w:p>
-      <w:pPr>
-        <w:spacing w:after="0" w:before="0" w:line="288" w:lineRule="auto"/>
-        <w:ind w:firstLine="480"/>
-      </w:pPr>
-      <w:r>
-        <w:rPr>
-          <w:rFonts w:ascii="Times New Roman" w:eastAsia="宋体" w:hAnsi="Times New Roman"/>
-          <w:sz w:val="24"/>
-          <w:szCs w:val="24"/>
-        </w:rPr>
-        <w:t xml:space="preserve">安全测试针对系统的权限控制和数据安全进行验证，包括Shiro权限拦截、文章作者权限校验、密码MD5加密、用户名唯一性校验等。测试用例验证未授权用户无法访问后台管理功能，非文章作者无法删除他人文章等安全约束。</w:t>
-      </w:r>
-    </w:p>
-    <w:p>
-      <w:pPr>
-        <w:spacing w:after="0" w:before="0" w:line="288" w:lineRule="auto"/>
-        <w:ind w:firstLine="480"/>
-      </w:pPr>
-      <w:r>
-        <w:rPr>
-          <w:rFonts w:ascii="Times New Roman" w:eastAsia="宋体" w:hAnsi="Times New Roman"/>
-          <w:sz w:val="24"/>
-          <w:szCs w:val="24"/>
-        </w:rPr>
-        <w:t xml:space="preserve">性能测试针对系统的响应时间和并发处理能力进行验证，包括页面加载时间、分页查询响应时间、全文搜索响应时间等。测试环境采用Undertow服务器，配置2个IO线程和32个工作线程。</w:t>
+        <w:t xml:space="preserve">系统开发完成后需要进行测试，验证功能是否达到需求分析的要求。测试分功能测试、安全测试和性能测试三部分。</w:t>
+      </w:r>
+    </w:p>
+    <w:p>
+      <w:pPr>
+        <w:spacing w:after="0" w:before="0" w:line="288" w:lineRule="auto"/>
+        <w:ind w:firstLine="480"/>
+      </w:pPr>
+      <w:r>
+        <w:rPr>
+          <w:rFonts w:ascii="Times New Roman" w:eastAsia="宋体" w:hAnsi="Times New Roman"/>
+          <w:sz w:val="24"/>
+          <w:szCs w:val="24"/>
+        </w:rPr>
+        <w:t xml:space="preserve">功能测试逐项验证注册登录、文章发布编辑、评论互动、全文搜索、收藏、后台管理等功能，覆盖正常流程和异常输入。安全测试重点检查Shiro权限拦截、文章作者校验、密码加密和用户名唯一性。性能测试关注页面加载、分页查询和全文搜索的响应时间，测试环境用Undertow服务器，2个IO线程32个工作线程。</w:t>
       </w:r>
     </w:p>
     <w:p>
@@ -8948,20 +8874,6 @@
     </w:p>
     <w:p>
       <w:pPr>
-        <w:spacing w:after="0" w:before="0" w:line="288" w:lineRule="auto"/>
-        <w:ind w:firstLine="480"/>
-      </w:pPr>
-      <w:r>
-        <w:rPr>
-          <w:rFonts w:ascii="Times New Roman" w:eastAsia="宋体" w:hAnsi="Times New Roman"/>
-          <w:sz w:val="24"/>
-          <w:szCs w:val="24"/>
-        </w:rPr>
-        <w:t xml:space="preserve">经过功能测试、安全测试和性能测试，系统各项测试结果如下：</w:t>
-      </w:r>
-    </w:p>
-    <w:p>
-      <w:pPr>
         <w:spacing w:after="0" w:before="240" w:line="288" w:lineRule="auto"/>
       </w:pPr>
       <w:r>
@@ -8984,7 +8896,7 @@
           <w:sz w:val="24"/>
           <w:szCs w:val="24"/>
         </w:rPr>
-        <w:t xml:space="preserve">功能测试覆盖了用户注册登录、文章管理、评论互动、全文搜索、收藏管理、后台管理等全部核心功能模块，共执行12项测试用例，全部通过。测试结果表明系统能够正确处理正常流程和异常流程，功能完整性达到预期目标。文章发布时摘要自动提取功能正常，Markdown编辑器渲染正常，标签关联保存正常。全文搜索功能能够正确返回匹配结果，中文分词效果良好。</w:t>
+        <w:t xml:space="preserve">12项功能测试用例全部通过。注册登录流程正常，重复用户名能正确拦截，错误密码登录会提示。文章发布、编辑、删除都正常工作，摘要自动截取和Markdown渲染都没问题。评论发表和展示正常。全文搜索能正确返回匹配结果，中文分词效果可以。收藏功能计数正确。后台各项管理功能在登录且有权限的情况下都能正常使用。</w:t>
       </w:r>
     </w:p>
     <w:p>
@@ -9011,7 +8923,7 @@
           <w:sz w:val="24"/>
           <w:szCs w:val="24"/>
         </w:rPr>
-        <w:t xml:space="preserve">安全测试验证了Shiro权限拦截器对后台管理路径的访问控制，未授权用户访问/admin路径时正确跳转至登录页。文章删除操作的作者权限校验正常，非文章作者执行删除操作时返回认证失败提示。用户密码MD5加密存储验证正常，数据库中无明文密码。用户名唯一性校验通过UK_USERNAME唯一索引和应用层双重保障，重复注册时正确提示错误信息。</w:t>
+        <w:t xml:space="preserve">安全方面，未登录用户访问/admin路径会跳转到登录页，非文章作者删除文章会返回认证失败提示。数据库里密码都是MD5加密后的密文，没有明文。重复用户名注册被UK_USERNAME唯一索引拦住了。用户输入的HTML内容经过Jsoup清洗，没有发现XSS漏洞。</w:t>
       </w:r>
     </w:p>
     <w:p>
@@ -9038,7 +8950,7 @@
           <w:sz w:val="24"/>
           <w:szCs w:val="24"/>
         </w:rPr>
-        <w:t xml:space="preserve">性能测试结果表明，系统首页加载时间在1秒以内，文章列表分页查询响应时间在0.5秒以内，全文搜索响应时间在1秒以内，均满足性能需求。后台仪表盘的JVM内存监控功能正常显示，系统在并发场景下通过ResourceLock资源锁保证了数据一致性。EhCache缓存机制有效减少了数据库查询次数，Undertow服务器的多线程配置支持并发请求处理。综上所述，系统在功能完整性、安全性和性能方面均达到了预期目标。</w:t>
+        <w:t xml:space="preserve">性能方面，首页加载在1秒以内，文章列表分页查询0.5秒以内，全文搜索1秒以内，都满足需求。EhCache缓存减少了数据库查询次数，ResourceLock在并发场景下保证了数据一致性。Undertow的多线程配置能处理并发请求。总体来看，系统在功能、安全和性能方面都达到了预期目标。</w:t>
       </w:r>
       <w:r>
         <w:rPr>
@@ -9076,91 +8988,35 @@
           <w:sz w:val="24"/>
           <w:szCs w:val="24"/>
         </w:rPr>
-        <w:t xml:space="preserve">本文以mblog开源博客系统为研究对象，基于Spring Boot 3.5.0框架设计并实现了一个功能完善的博客系统。通过对系统的需求分析、架构设计、数据库设计、功能实现和系统测试，完成了以下工作：</w:t>
-      </w:r>
-    </w:p>
-    <w:p>
-      <w:pPr>
-        <w:spacing w:after="0" w:before="0" w:line="288" w:lineRule="auto"/>
-        <w:ind w:firstLine="480"/>
-      </w:pPr>
-      <w:r>
-        <w:rPr>
-          <w:rFonts w:ascii="Times New Roman" w:eastAsia="宋体" w:hAnsi="Times New Roman"/>
-          <w:sz w:val="24"/>
-          <w:szCs w:val="24"/>
-        </w:rPr>
-        <w:t xml:space="preserve">（1）完成了系统需求分析，明确了前台用户功能和后台管理功能的功能性需求，以及性能、安全、可扩展性和可维护性等非功能性需求。系统前台涵盖用户注册登录、文章发布管理、评论互动、频道标签分类、全文搜索、收藏管理和个人设置等功能；后台提供仪表盘、栏目管理、文章管理、评论管理、用户管理和系统配置六项管理功能。</w:t>
-      </w:r>
-    </w:p>
-    <w:p>
-      <w:pPr>
-        <w:spacing w:after="0" w:before="0" w:line="288" w:lineRule="auto"/>
-        <w:ind w:firstLine="480"/>
-      </w:pPr>
-      <w:r>
-        <w:rPr>
-          <w:rFonts w:ascii="Times New Roman" w:eastAsia="宋体" w:hAnsi="Times New Roman"/>
-          <w:sz w:val="24"/>
-          <w:szCs w:val="24"/>
-        </w:rPr>
-        <w:t xml:space="preserve">（2）完成了系统架构设计，采用MVC三层架构模式，结合Spring Boot自动配置特性，将系统分为表现层、控制层、业务层、持久层、安全层和搜索层六个层次。系统通过FreeMarker模板引擎和自定义指令实现视图与数据解耦，通过Spring Data JPA和Specification接口实现动态查询，通过Apache Shiro和RBAC模型实现细粒度权限控制，通过Hibernate Search和Lucene SmartCN实现全文搜索。</w:t>
-      </w:r>
-    </w:p>
-    <w:p>
-      <w:pPr>
-        <w:spacing w:after="0" w:before="0" w:line="288" w:lineRule="auto"/>
-        <w:ind w:firstLine="480"/>
-      </w:pPr>
-      <w:r>
-        <w:rPr>
-          <w:rFonts w:ascii="Times New Roman" w:eastAsia="宋体" w:hAnsi="Times New Roman"/>
-          <w:sz w:val="24"/>
-          <w:szCs w:val="24"/>
-        </w:rPr>
-        <w:t xml:space="preserve">（3）完成了数据库设计，schema.sql定义了频道表、系统配置表、用户表及四张Shiro权限表（含20项预定义权限），其余业务表通过JPA实体类自动建表生成。系统通过UK_USERNAME和UK_NAME唯一索引保证数据完整性，通过外键关联建立表间关系。</w:t>
-      </w:r>
-    </w:p>
-    <w:p>
-      <w:pPr>
-        <w:spacing w:after="0" w:before="0" w:line="288" w:lineRule="auto"/>
-        <w:ind w:firstLine="480"/>
-      </w:pPr>
-      <w:r>
-        <w:rPr>
-          <w:rFonts w:ascii="Times New Roman" w:eastAsia="宋体" w:hAnsi="Times New Roman"/>
-          <w:sz w:val="24"/>
-          <w:szCs w:val="24"/>
-        </w:rPr>
-        <w:t xml:space="preserve">（4）完成了系统功能实现，详细阐述了用户注册（MD5加密直接启用）、用户登录（Shiro认证会话管理）、文章发布（Markdown渲染摘要提取126字）、文章编辑删除（ResourceLock资源锁并发控制）、全文搜索（Hibernate Search模糊匹配）及后台六项管理功能的实现细节。</w:t>
-      </w:r>
-    </w:p>
-    <w:p>
-      <w:pPr>
-        <w:spacing w:after="0" w:before="0" w:line="288" w:lineRule="auto"/>
-        <w:ind w:firstLine="480"/>
-      </w:pPr>
-      <w:r>
-        <w:rPr>
-          <w:rFonts w:ascii="Times New Roman" w:eastAsia="宋体" w:hAnsi="Times New Roman"/>
-          <w:sz w:val="24"/>
-          <w:szCs w:val="24"/>
-        </w:rPr>
-        <w:t xml:space="preserve">（5）完成了系统测试，通过功能测试、安全测试和性能测试验证了系统的正确性、安全性和性能表现，12项功能测试用例全部通过。</w:t>
-      </w:r>
-    </w:p>
-    <w:p>
-      <w:pPr>
-        <w:spacing w:after="0" w:before="0" w:line="288" w:lineRule="auto"/>
-        <w:ind w:firstLine="480"/>
-      </w:pPr>
-      <w:r>
-        <w:rPr>
-          <w:rFonts w:ascii="Times New Roman" w:eastAsia="宋体" w:hAnsi="Times New Roman"/>
-          <w:sz w:val="24"/>
-          <w:szCs w:val="24"/>
-        </w:rPr>
-        <w:t xml:space="preserve">本系统虽然已经完成了预期目标，但仍存在以下改进方向：一是用户密码可采用BCrypt等更安全的加密算法替代MD5；二是可引入Redis缓存提升系统性能；三是可进一步优化全文搜索的搜索结果排序和高亮显示功能；四是可引入前后端分离架构，提升用户交互体验。</w:t>
+        <w:t xml:space="preserve">本文基于Spring Boot 3.5.0框架，设计并实现了一个博客系统。从需求分析到架构设计、数据库设计、功能实现再到系统测试，基本完成了预期目标。</w:t>
+      </w:r>
+    </w:p>
+    <w:p>
+      <w:pPr>
+        <w:spacing w:after="0" w:before="0" w:line="288" w:lineRule="auto"/>
+        <w:ind w:firstLine="480"/>
+      </w:pPr>
+      <w:r>
+        <w:rPr>
+          <w:rFonts w:ascii="Times New Roman" w:eastAsia="宋体" w:hAnsi="Times New Roman"/>
+          <w:sz w:val="24"/>
+          <w:szCs w:val="24"/>
+        </w:rPr>
+        <w:t xml:space="preserve">需求分析阶段明确了前台用户功能和后台管理功能，以及性能、安全等方面的非功能性需求。架构设计采用MVC分层模式，结合Spring Boot自动配置，把系统分为表现层、控制层、业务层、持久层、安全层和搜索层。数据库方面，schema.sql定义了频道表、配置表、用户表和四张Shiro权限表，其余业务表由JPA自动建表。功能实现覆盖了注册登录、文章管理、评论互动、全文搜索、收藏、后台管理等核心模块。系统测试的12项功能用例全部通过，安全和性能也达标。</w:t>
+      </w:r>
+    </w:p>
+    <w:p>
+      <w:pPr>
+        <w:spacing w:after="0" w:before="0" w:line="288" w:lineRule="auto"/>
+        <w:ind w:firstLine="480"/>
+      </w:pPr>
+      <w:r>
+        <w:rPr>
+          <w:rFonts w:ascii="Times New Roman" w:eastAsia="宋体" w:hAnsi="Times New Roman"/>
+          <w:sz w:val="24"/>
+          <w:szCs w:val="24"/>
+        </w:rPr>
+        <w:t xml:space="preserve">不过系统还有一些可以改进的地方。密码目前用MD5加密，可以换成BCrypt等更安全的方案。缓存用的是本地EhCache，如果访问量大可以换成Redis。全文搜索的结果排序和高亮显示还可以优化。前端目前是FreeMarker服务端渲染，如果改成前后端分离架构，用户交互体验会更好。</w:t>
       </w:r>
     </w:p>
     <w:p>

</xml_diff>

<commit_message>
Add comprehensive code documentation and cleanup
Add detailed Chinese inline documentation and module-level comments to all Java source files for better maintainability. Add Docker Compose configuration for easy setup. Remove temporary debug/fix scripts and README, add SVG diagram variants for better version control. Update start scripts with improved UTF-8 handling and error reporting.
</commit_message>
<xml_diff>
--- a/基于Spring Boot的博客系统设计与实现.docx
+++ b/基于Spring Boot的博客系统设计与实现.docx
@@ -335,35 +335,35 @@
           <w:sz w:val="24"/>
           <w:szCs w:val="24"/>
         </w:rPr>
-        <w:t xml:space="preserve">本文以mblog开源博客系统为研究对象，基于Spring Boot 3.5.0框架设计并实现了一个功能完善的博客系统。系统采用Java 17作为开发语言，MySQL作为后端数据库，结合Spring Data JPA实现数据持久化操作，使用Apache Shiro 2.0.5框架实现权限控制与安全认证，通过FreeMarker模板引擎渲染前端页面，并集成Hibernate Search 7.2.4和Lucene SmartCN中文分词器实现全文搜索功能。</w:t>
-      </w:r>
-    </w:p>
-    <w:p>
-      <w:pPr>
-        <w:spacing w:after="0" w:before="0" w:line="288" w:lineRule="auto"/>
-        <w:ind w:firstLine="480"/>
-      </w:pPr>
-      <w:r>
-        <w:rPr>
-          <w:rFonts w:ascii="Times New Roman" w:eastAsia="宋体" w:hAnsi="Times New Roman"/>
-          <w:sz w:val="24"/>
-          <w:szCs w:val="24"/>
-        </w:rPr>
-        <w:t xml:space="preserve">系统涵盖用户注册登录、文章发布与管理、评论互动、频道与标签分类、文章收藏、全文搜索、个人设置及后台管理等核心功能模块。前台面向普通用户和访客，提供文章浏览、频道浏览、标签浏览、全文搜索、用户主页、文章发布、评论回复和收藏管理等功能；后台面向系统管理员，提供仪表盘统计、栏目管理、文章管理、评论管理、用户管理和系统配置六项管理功能。</w:t>
-      </w:r>
-    </w:p>
-    <w:p>
-      <w:pPr>
-        <w:spacing w:after="0" w:before="0" w:line="288" w:lineRule="auto"/>
-        <w:ind w:firstLine="480"/>
-      </w:pPr>
-      <w:r>
-        <w:rPr>
-          <w:rFonts w:ascii="Times New Roman" w:eastAsia="宋体" w:hAnsi="Times New Roman"/>
-          <w:sz w:val="24"/>
-          <w:szCs w:val="24"/>
-        </w:rPr>
-        <w:t xml:space="preserve">本文详细阐述了系统的需求分析、架构设计、数据库设计、功能实现及系统测试过程。系统采用经典的MVC三层架构模式，将应用程序分为模型层、视图层和控制器层，实现了代码的模块化、可维护和可扩展。在权限控制方面，系统基于Shiro的RBAC模型设计了角色、权限、角色权限关联和用户角色关联四张表，预定义了20项细粒度权限。数据库设计方面，schema.sql定义了频道表、系统配置表、用户表及四张Shiro权限表，其余文章、评论、标签等表通过JPA实体类自动建表生成。</w:t>
+        <w:t xml:space="preserve">本文以mblog开源博客系统为研究对象，基于Spring Boot 3.5.0框架设计并实现了一个功能完善的博客系统。系统采用Java 17作为开发语言，MySQL作为后端数据库，结合Spring Data JPA实现数据持久化操作，使用Apache Shiro 2.0.5框架实现权限控制与安全认证，通过FreeMarker模板引擎渲染前端页面。系统实现了用户注册与登录、文章发布与管理、评论互动、频道标签分类、后台管理等功能模块。</w:t>
+      </w:r>
+    </w:p>
+    <w:p>
+      <w:pPr>
+        <w:spacing w:after="0" w:before="0" w:line="288" w:lineRule="auto"/>
+        <w:ind w:firstLine="480"/>
+      </w:pPr>
+      <w:r>
+        <w:rPr>
+          <w:rFonts w:ascii="Times New Roman" w:eastAsia="宋体" w:hAnsi="Times New Roman"/>
+          <w:sz w:val="24"/>
+          <w:szCs w:val="24"/>
+        </w:rPr>
+        <w:t xml:space="preserve">系统涵盖用户注册登录、文章发布与管理、评论互动、频道与标签分类、个人设置及后台管理等核心功能模块。前台面向普通用户和访客，提供文章浏览、频道浏览、标签浏览、用户主页、文章发布、评论回复等功能；后台面向系统管理员，提供仪表盘统计、栏目管理、文章管理、评论管理、用户管理和系统配置六项管理功能。</w:t>
+      </w:r>
+    </w:p>
+    <w:p>
+      <w:pPr>
+        <w:spacing w:after="0" w:before="0" w:line="288" w:lineRule="auto"/>
+        <w:ind w:firstLine="480"/>
+      </w:pPr>
+      <w:r>
+        <w:rPr>
+          <w:rFonts w:ascii="Times New Roman" w:eastAsia="宋体" w:hAnsi="Times New Roman"/>
+          <w:sz w:val="24"/>
+          <w:szCs w:val="24"/>
+        </w:rPr>
+        <w:t xml:space="preserve">本文详细阐述了系统的需求分析、架构设计、数据库设计、功能实现及系统测试过程。系统采用经典的MVC三层架构模式，将应用程序分为模型层、视图层和控制器层，实现了代码的模块化、可维护和可扩展。在权限控制方面，系统基于Shiro的RBAC模型设计了角色、权限、角色权限关联和用户角色关联四张表，预定义了20项细粒度权限。数据库方面，所有数据表通过JPA实体类的ddl-auto: update配置自动创建。</w:t>
       </w:r>
     </w:p>
     <w:p>
@@ -412,7 +412,7 @@
           <w:sz w:val="24"/>
           <w:szCs w:val="24"/>
         </w:rPr>
-        <w:t xml:space="preserve">博客系统；Spring Boot；Apache Shiro；MySQL；全文搜索</w:t>
+        <w:t xml:space="preserve">博客系统；Spring Boot；Apache Shiro；MySQL；RBAC</w:t>
       </w:r>
     </w:p>
     <w:p>
@@ -447,35 +447,35 @@
           <w:sz w:val="24"/>
           <w:szCs w:val="24"/>
         </w:rPr>
-        <w:t xml:space="preserve">This paper takes the mblog open-source blog system as the research object, and designs and implements a fully functional blog system based on the Spring Boot 3.5.0 framework. The system uses Java 17 as the development language, MySQL as the backend database, Spring Data JPA for data persistence, Apache Shiro 2.0.5 for access control and security authentication, FreeMarker template engine for front-end page rendering, and integrates Hibernate Search 7.2.4 with Lucene SmartCN Chinese analyzer for full-text search functionality.</w:t>
-      </w:r>
-    </w:p>
-    <w:p>
-      <w:pPr>
-        <w:spacing w:after="0" w:before="0" w:line="288" w:lineRule="auto"/>
-        <w:ind w:firstLine="480"/>
-      </w:pPr>
-      <w:r>
-        <w:rPr>
-          <w:rFonts w:ascii="Times New Roman" w:eastAsia="宋体" w:hAnsi="Times New Roman"/>
-          <w:sz w:val="24"/>
-          <w:szCs w:val="24"/>
-        </w:rPr>
-        <w:t xml:space="preserve">The system includes core functional modules such as user registration and login, article publishing and management, comment interaction, channels and tags, article favorites, full-text search, personal settings, and back-end management. The front-end provides article browsing, channel browsing, tag browsing, full-text search, user homepage, article publishing, comment reply, and favorite management. The back-end provides six management functions including dashboard statistics, channel management, post management, comment management, user management, and system configuration for system administrators.</w:t>
-      </w:r>
-    </w:p>
-    <w:p>
-      <w:pPr>
-        <w:spacing w:after="0" w:before="0" w:line="288" w:lineRule="auto"/>
-        <w:ind w:firstLine="480"/>
-      </w:pPr>
-      <w:r>
-        <w:rPr>
-          <w:rFonts w:ascii="Times New Roman" w:eastAsia="宋体" w:hAnsi="Times New Roman"/>
-          <w:sz w:val="24"/>
-          <w:szCs w:val="24"/>
-        </w:rPr>
-        <w:t xml:space="preserve">This paper details the requirements analysis, architecture design, database design, function implementation, and system testing process. The system adopts the classic MVC three-tier architecture pattern. In terms of access control, the system designs four Shiro RBAC tables including roles, permissions, role-permission associations, and user-role associations, with 20 predefined fine-grained permissions. The schema.sql defines channel, options, user, and four Shiro permission tables, while other tables such as posts, comments, and tags are automatically created by JPA entity classes.</w:t>
+        <w:t xml:space="preserve">This paper takes the mblog open-source blog system as the research object, and designs and implements a fully functional blog system based on the Spring Boot 3.5.0 framework. The system uses Java 17 as the development language, MySQL as the backend database, Spring Data JPA for data persistence, Apache Shiro 2.0.5 for access control and security authentication, and FreeMarker template engine for front-end page rendering.</w:t>
+      </w:r>
+    </w:p>
+    <w:p>
+      <w:pPr>
+        <w:spacing w:after="0" w:before="0" w:line="288" w:lineRule="auto"/>
+        <w:ind w:firstLine="480"/>
+      </w:pPr>
+      <w:r>
+        <w:rPr>
+          <w:rFonts w:ascii="Times New Roman" w:eastAsia="宋体" w:hAnsi="Times New Roman"/>
+          <w:sz w:val="24"/>
+          <w:szCs w:val="24"/>
+        </w:rPr>
+        <w:t xml:space="preserve">The system includes core functional modules such as user registration and login, article publishing and management, comment interaction, channels and tags, personal settings, and back-end management. The front-end provides article browsing, channel browsing, tag browsing, user homepage, article publishing, and comment reply. The back-end provides six management functions including dashboard statistics, channel management, post management, comment management, user management, and system configuration for system administrators.</w:t>
+      </w:r>
+    </w:p>
+    <w:p>
+      <w:pPr>
+        <w:spacing w:after="0" w:before="0" w:line="288" w:lineRule="auto"/>
+        <w:ind w:firstLine="480"/>
+      </w:pPr>
+      <w:r>
+        <w:rPr>
+          <w:rFonts w:ascii="Times New Roman" w:eastAsia="宋体" w:hAnsi="Times New Roman"/>
+          <w:sz w:val="24"/>
+          <w:szCs w:val="24"/>
+        </w:rPr>
+        <w:t xml:space="preserve">This paper details the requirements analysis, architecture design, database design, function implementation, and system testing process. The system adopts the classic MVC three-tier architecture pattern. In terms of access control, the system designs four Shiro RBAC tables including roles, permissions, role-permission associations, and user-role associations, with 20 predefined fine-grained permissions. All database tables are automatically created by JPA entity classes through ddl-auto: update configuration.</w:t>
       </w:r>
     </w:p>
     <w:p>
@@ -526,7 +526,7 @@
           <w:sz w:val="24"/>
           <w:szCs w:val="24"/>
         </w:rPr>
-        <w:t xml:space="preserve">Blog System; Spring Boot; Apache Shiro; MySQL; Full-text Search</w:t>
+        <w:t xml:space="preserve">Blog System; Spring Boot; Apache Shiro; MySQL; RBAC</w:t>
       </w:r>
     </w:p>
     <w:p>
@@ -942,36 +942,6 @@
           <w:tab w:val="right" w:pos="8296" w:leader="dot"/>
         </w:tabs>
         <w:spacing w:after="0" w:before="0" w:line="360" w:lineRule="auto"/>
-        <w:ind w:left="420"/>
-        <w:jc w:val="center"/>
-      </w:pPr>
-      <w:r>
-        <w:rPr>
-          <w:rFonts w:ascii="Times New Roman" w:eastAsia="宋体" w:hAnsi="Times New Roman"/>
-          <w:b w:val="false"/>
-          <w:bCs w:val="false"/>
-          <w:sz w:val="24"/>
-          <w:szCs w:val="24"/>
-        </w:rPr>
-        <w:t xml:space="preserve">2.6 Hibernate Search全文搜索</w:t>
-      </w:r>
-      <w:r>
-        <w:rPr>
-          <w:rFonts w:ascii="Times New Roman" w:eastAsia="宋体" w:hAnsi="Times New Roman"/>
-          <w:b w:val="false"/>
-          <w:bCs w:val="false"/>
-          <w:sz w:val="24"/>
-          <w:szCs w:val="24"/>
-        </w:rPr>
-        <w:t xml:space="preserve">	8</w:t>
-      </w:r>
-    </w:p>
-    <w:p>
-      <w:pPr>
-        <w:tabs>
-          <w:tab w:val="right" w:pos="8296" w:leader="dot"/>
-        </w:tabs>
-        <w:spacing w:after="0" w:before="0" w:line="360" w:lineRule="auto"/>
         <w:jc w:val="center"/>
       </w:pPr>
       <w:r>
@@ -1587,7 +1557,25 @@
           <w:sz w:val="24"/>
           <w:szCs w:val="24"/>
         </w:rPr>
-        <w:t xml:space="preserve">传统的博客系统大多基于PHP语言开发，如WordPress、Typecho等。PHP开发效率高、部署简单，但在类型安全、并发处理和工程化方面存在不足。Java作为强类型语言，结合Spring Boot框架的自动配置和起步依赖机制，在构建大型Web应用时具有更好的可维护性和扩展性。近年来，越来越多的国内开发者开始基于Spring Boot框架构建博客系统。{[1]}{[2]}</w:t>
+        <w:t xml:space="preserve">传统的博客系统大多基于PHP语言开发，如WordPress、Typecho等。PHP开发效率高、部署简单，但在类型安全、并发处理和工程化方面存在不足。Java作为强类型语言，结合Spring Boot框架的自动配置和起步依赖机制，在构建大型Web应用时具有更好的可维护性和扩展性。近年来，越来越多的国内开发者开始基于Spring Boot框架构建博客系统。</w:t>
+      </w:r>
+      <w:r>
+        <w:rPr>
+          <w:rFonts w:ascii="Times New Roman" w:eastAsia="宋体" w:hAnsi="Times New Roman"/>
+          <w:sz w:val="24"/>
+          <w:szCs w:val="24"/>
+          <w:vertAlign w:val="superscript"/>
+        </w:rPr>
+        <w:t xml:space="preserve">[1]</w:t>
+      </w:r>
+      <w:r>
+        <w:rPr>
+          <w:rFonts w:ascii="Times New Roman" w:eastAsia="宋体" w:hAnsi="Times New Roman"/>
+          <w:sz w:val="24"/>
+          <w:szCs w:val="24"/>
+          <w:vertAlign w:val="superscript"/>
+        </w:rPr>
+        <w:t xml:space="preserve">[2]</w:t>
       </w:r>
     </w:p>
     <w:p>
@@ -1615,21 +1603,21 @@
           <w:sz w:val="24"/>
           <w:szCs w:val="24"/>
         </w:rPr>
-        <w:t xml:space="preserve">本系统以mblog开源项目为基础，基于Spring Boot 3.5.0和Java 17进行开发。系统支持Markdown编辑、全文搜索、多级评论、频道分类等博客系统的核心特性。在技术选型上，系统集成了Hibernate Search全文搜索引擎和Lucene SmartCN中文分词器，用于解决中文内容的全文检索问题；采用Apache Shiro的RBAC模型实现后台管理权限控制。通过对该系统的设计与实现，笔者在实践中深入学习了Spring Boot开发模式、MVC架构设计、数据库设计、Shiro安全认证等关键技术，对软件工程实践能力的提升有较大帮助。</w:t>
-      </w:r>
-    </w:p>
-    <w:p>
-      <w:pPr>
-        <w:spacing w:after="0" w:before="0" w:line="288" w:lineRule="auto"/>
-        <w:ind w:firstLine="480"/>
-      </w:pPr>
-      <w:r>
-        <w:rPr>
-          <w:rFonts w:ascii="Times New Roman" w:eastAsia="宋体" w:hAnsi="Times New Roman"/>
-          <w:sz w:val="24"/>
-          <w:szCs w:val="24"/>
-        </w:rPr>
-        <w:t xml:space="preserve">从实际应用角度看，开发一个自托管的博客平台可以完全掌控数据和内容，不依赖第三方平台。而本系统在全文搜索和权限控制方面的技术方案，也可以为类似的内容管理系统提供参考。</w:t>
+        <w:t xml:space="preserve">本系统以mblog开源项目为基础，基于Spring Boot 3.5.0和Java 17进行开发。系统支持Markdown编辑、多级评论、频道分类等博客系统的核心特性。在技术选型上，系统采用Apache Shiro的RBAC模型实现后台管理权限控制。通过对该系统的设计与实现，笔者在实践中深入学习了Spring Boot开发模式、MVC架构设计、数据库设计、Shiro安全认证等关键技术，对软件工程实践能力的提升有较大帮助。</w:t>
+      </w:r>
+    </w:p>
+    <w:p>
+      <w:pPr>
+        <w:spacing w:after="0" w:before="0" w:line="288" w:lineRule="auto"/>
+        <w:ind w:firstLine="480"/>
+      </w:pPr>
+      <w:r>
+        <w:rPr>
+          <w:rFonts w:ascii="Times New Roman" w:eastAsia="宋体" w:hAnsi="Times New Roman"/>
+          <w:sz w:val="24"/>
+          <w:szCs w:val="24"/>
+        </w:rPr>
+        <w:t xml:space="preserve">从实际应用角度看，开发一个自托管的博客平台可以完全掌控数据和内容，不依赖第三方平台。而本系统在权限控制方面的技术方案，也可以为类似的内容管理系统提供参考。</w:t>
       </w:r>
     </w:p>
     <w:p>
@@ -1738,7 +1726,7 @@
           <w:sz w:val="24"/>
           <w:szCs w:val="24"/>
         </w:rPr>
-        <w:t xml:space="preserve">开源博客系统方面，国内开发者基于Java技术栈开发了Halo、Solo、Tale等项目。这些系统大多采用Spring Boot框架，搭配MyBatis或JPA做数据持久化，用Shiro或Spring Security做权限控制。但在实际使用中，笔者发现现有系统在中文全文搜索、权限细粒度控制和资源引用计数等方面仍有改进空间。本系统在借鉴这些项目经验的基础上，集成了Hibernate Search和Lucene SmartCN中文分词器，采用Shiro RBAC模型实现了20项后台管理权限。</w:t>
+        <w:t xml:space="preserve">开源博客系统方面，国内开发者基于Java技术栈开发了Halo、Solo、Tale等项目。这些系统大多采用Spring Boot框架，搭配MyBatis或JPA做数据持久化，用Shiro或Spring Security做权限控制。但在实际使用中，笔者发现现有系统在权限细粒度控制方面仍有改进空间。本系统在借鉴这些项目经验的基础上，采用Shiro RBAC模型实现了20项后台管理权限。</w:t>
       </w:r>
       <w:r>
         <w:rPr>
@@ -2450,7 +2438,7 @@
                 <w:sz w:val="21"/>
                 <w:szCs w:val="21"/>
               </w:rPr>
-              <w:t xml:space="preserve">全文搜索</w:t>
+              <w:t xml:space="preserve">权限控制</w:t>
             </w:r>
           </w:p>
         </w:tc>
@@ -2477,7 +2465,7 @@
                 <w:sz w:val="21"/>
                 <w:szCs w:val="21"/>
               </w:rPr>
-              <w:t xml:space="preserve">插件支持</w:t>
+              <w:t xml:space="preserve">角色权限</w:t>
             </w:r>
           </w:p>
         </w:tc>
@@ -2504,7 +2492,7 @@
                 <w:sz w:val="21"/>
                 <w:szCs w:val="21"/>
               </w:rPr>
-              <w:t xml:space="preserve">不支持</w:t>
+              <w:t xml:space="preserve">Spring Security</w:t>
             </w:r>
           </w:p>
         </w:tc>
@@ -2531,7 +2519,7 @@
                 <w:sz w:val="21"/>
                 <w:szCs w:val="21"/>
               </w:rPr>
-              <w:t xml:space="preserve">Hibernate Search+SmartCN</w:t>
+              <w:t xml:space="preserve">Shiro RBAC</w:t>
             </w:r>
           </w:p>
         </w:tc>
@@ -2558,7 +2546,7 @@
                 <w:sz w:val="21"/>
                 <w:szCs w:val="21"/>
               </w:rPr>
-              <w:t xml:space="preserve">不支持</w:t>
+              <w:t xml:space="preserve">角色权限</w:t>
             </w:r>
           </w:p>
         </w:tc>
@@ -2590,7 +2578,7 @@
                 <w:sz w:val="21"/>
                 <w:szCs w:val="21"/>
               </w:rPr>
-              <w:t xml:space="preserve">权限控制</w:t>
+              <w:t xml:space="preserve">编辑器</w:t>
             </w:r>
           </w:p>
         </w:tc>
@@ -2617,7 +2605,7 @@
                 <w:sz w:val="21"/>
                 <w:szCs w:val="21"/>
               </w:rPr>
-              <w:t xml:space="preserve">角色权限</w:t>
+              <w:t xml:space="preserve">Gutenberg</w:t>
             </w:r>
           </w:p>
         </w:tc>
@@ -2644,7 +2632,7 @@
                 <w:sz w:val="21"/>
                 <w:szCs w:val="21"/>
               </w:rPr>
-              <w:t xml:space="preserve">Spring Security</w:t>
+              <w:t xml:space="preserve">Markdown</w:t>
             </w:r>
           </w:p>
         </w:tc>
@@ -2671,7 +2659,7 @@
                 <w:sz w:val="21"/>
                 <w:szCs w:val="21"/>
               </w:rPr>
-              <w:t xml:space="preserve">Shiro RBAC</w:t>
+              <w:t xml:space="preserve">Markdown</w:t>
             </w:r>
           </w:p>
         </w:tc>
@@ -2698,146 +2686,6 @@
                 <w:sz w:val="21"/>
                 <w:szCs w:val="21"/>
               </w:rPr>
-              <w:t xml:space="preserve">角色权限</w:t>
-            </w:r>
-          </w:p>
-        </w:tc>
-      </w:tr>
-      <w:tr>
-        <w:trPr>
-          <w:cantSplit/>
-        </w:trPr>
-        <w:tc>
-          <w:tcPr>
-            <w:tcW w:type="dxa" w:w="1800"/>
-            <w:tcBorders>
-              <w:top w:val="single" w:color="CCCCCC" w:sz="1"/>
-              <w:left w:val="single" w:color="CCCCCC" w:sz="1"/>
-              <w:bottom w:val="single" w:color="CCCCCC" w:sz="1"/>
-              <w:right w:val="single" w:color="CCCCCC" w:sz="1"/>
-            </w:tcBorders>
-            <w:tcMar>
-              <w:top w:type="dxa" w:w="60"/>
-              <w:left w:type="dxa" w:w="80"/>
-              <w:bottom w:type="dxa" w:w="60"/>
-              <w:right w:type="dxa" w:w="80"/>
-            </w:tcMar>
-          </w:tcPr>
-          <w:p>
-            <w:r>
-              <w:rPr>
-                <w:rFonts w:ascii="Times New Roman" w:eastAsia="宋体" w:hAnsi="Times New Roman"/>
-                <w:sz w:val="21"/>
-                <w:szCs w:val="21"/>
-              </w:rPr>
-              <w:t xml:space="preserve">编辑器</w:t>
-            </w:r>
-          </w:p>
-        </w:tc>
-        <w:tc>
-          <w:tcPr>
-            <w:tcW w:type="dxa" w:w="2000"/>
-            <w:tcBorders>
-              <w:top w:val="single" w:color="CCCCCC" w:sz="1"/>
-              <w:left w:val="single" w:color="CCCCCC" w:sz="1"/>
-              <w:bottom w:val="single" w:color="CCCCCC" w:sz="1"/>
-              <w:right w:val="single" w:color="CCCCCC" w:sz="1"/>
-            </w:tcBorders>
-            <w:tcMar>
-              <w:top w:type="dxa" w:w="60"/>
-              <w:left w:type="dxa" w:w="80"/>
-              <w:bottom w:type="dxa" w:w="60"/>
-              <w:right w:type="dxa" w:w="80"/>
-            </w:tcMar>
-          </w:tcPr>
-          <w:p>
-            <w:r>
-              <w:rPr>
-                <w:rFonts w:ascii="Times New Roman" w:eastAsia="宋体" w:hAnsi="Times New Roman"/>
-                <w:sz w:val="21"/>
-                <w:szCs w:val="21"/>
-              </w:rPr>
-              <w:t xml:space="preserve">Gutenberg</w:t>
-            </w:r>
-          </w:p>
-        </w:tc>
-        <w:tc>
-          <w:tcPr>
-            <w:tcW w:type="dxa" w:w="2000"/>
-            <w:tcBorders>
-              <w:top w:val="single" w:color="CCCCCC" w:sz="1"/>
-              <w:left w:val="single" w:color="CCCCCC" w:sz="1"/>
-              <w:bottom w:val="single" w:color="CCCCCC" w:sz="1"/>
-              <w:right w:val="single" w:color="CCCCCC" w:sz="1"/>
-            </w:tcBorders>
-            <w:tcMar>
-              <w:top w:type="dxa" w:w="60"/>
-              <w:left w:type="dxa" w:w="80"/>
-              <w:bottom w:type="dxa" w:w="60"/>
-              <w:right w:type="dxa" w:w="80"/>
-            </w:tcMar>
-          </w:tcPr>
-          <w:p>
-            <w:r>
-              <w:rPr>
-                <w:rFonts w:ascii="Times New Roman" w:eastAsia="宋体" w:hAnsi="Times New Roman"/>
-                <w:sz w:val="21"/>
-                <w:szCs w:val="21"/>
-              </w:rPr>
-              <w:t xml:space="preserve">Markdown</w:t>
-            </w:r>
-          </w:p>
-        </w:tc>
-        <w:tc>
-          <w:tcPr>
-            <w:tcW w:type="dxa" w:w="2000"/>
-            <w:tcBorders>
-              <w:top w:val="single" w:color="CCCCCC" w:sz="1"/>
-              <w:left w:val="single" w:color="CCCCCC" w:sz="1"/>
-              <w:bottom w:val="single" w:color="CCCCCC" w:sz="1"/>
-              <w:right w:val="single" w:color="CCCCCC" w:sz="1"/>
-            </w:tcBorders>
-            <w:tcMar>
-              <w:top w:type="dxa" w:w="60"/>
-              <w:left w:type="dxa" w:w="80"/>
-              <w:bottom w:type="dxa" w:w="60"/>
-              <w:right w:type="dxa" w:w="80"/>
-            </w:tcMar>
-          </w:tcPr>
-          <w:p>
-            <w:r>
-              <w:rPr>
-                <w:rFonts w:ascii="Times New Roman" w:eastAsia="宋体" w:hAnsi="Times New Roman"/>
-                <w:sz w:val="21"/>
-                <w:szCs w:val="21"/>
-              </w:rPr>
-              <w:t xml:space="preserve">Markdown</w:t>
-            </w:r>
-          </w:p>
-        </w:tc>
-        <w:tc>
-          <w:tcPr>
-            <w:tcW w:type="dxa" w:w="1560"/>
-            <w:tcBorders>
-              <w:top w:val="single" w:color="CCCCCC" w:sz="1"/>
-              <w:left w:val="single" w:color="CCCCCC" w:sz="1"/>
-              <w:bottom w:val="single" w:color="CCCCCC" w:sz="1"/>
-              <w:right w:val="single" w:color="CCCCCC" w:sz="1"/>
-            </w:tcBorders>
-            <w:tcMar>
-              <w:top w:type="dxa" w:w="60"/>
-              <w:left w:type="dxa" w:w="80"/>
-              <w:bottom w:type="dxa" w:w="60"/>
-              <w:right w:type="dxa" w:w="80"/>
-            </w:tcMar>
-          </w:tcPr>
-          <w:p>
-            <w:r>
-              <w:rPr>
-                <w:rFonts w:ascii="Times New Roman" w:eastAsia="宋体" w:hAnsi="Times New Roman"/>
-                <w:sz w:val="21"/>
-                <w:szCs w:val="21"/>
-              </w:rPr>
               <w:t xml:space="preserve">Gutenberg</w:t>
             </w:r>
           </w:p>
@@ -2869,7 +2717,7 @@
           <w:sz w:val="24"/>
           <w:szCs w:val="24"/>
         </w:rPr>
-        <w:t xml:space="preserve">从表1-1可以看出，本系统在全文搜索和权限控制上有自己的特色。Hibernate Search配合SmartCN中文分词器，中文检索效果比MySQL LIKE查询好很多。Shiro的RBAC模型支持20项细粒度权限，比简单的角色判断更灵活。和WordPress相比，Java技术栈在类型安全和性能上更有保障；和Halo相比，本系统在搜索和权限方面做得更细致。</w:t>
+        <w:t xml:space="preserve">从表1-1可以看出，本系统在权限控制上有自己的特色。Shiro的RBAC模型支持20项细粒度权限，比简单的角色判断更灵活。和WordPress相比，Java技术栈在类型安全和性能上更有保障；和Halo相比，本系统在权限方面做得更细致。</w:t>
       </w:r>
     </w:p>
     <w:p>
@@ -2910,7 +2758,7 @@
           <w:sz w:val="24"/>
           <w:szCs w:val="24"/>
         </w:rPr>
-        <w:t xml:space="preserve">首先是系统需求分析，需要梳理前台用户和后台管理员各自需要什么功能，明确注册登录、文章管理、评论互动、全文搜索、收藏、后台管理等模块的功能性需求，以及性能、安全性、可扩展性等非功能性需求指标。</w:t>
+        <w:t xml:space="preserve">首先是系统需求分析，需要梳理前台用户和后台管理员各自需要什么功能，明确注册登录、文章管理、评论互动、后台管理等模块的功能性需求，以及性能、安全性、可扩展性等非功能性需求指标。</w:t>
       </w:r>
     </w:p>
     <w:p>
@@ -2947,21 +2795,21 @@
           <w:sz w:val="24"/>
           <w:szCs w:val="24"/>
         </w:rPr>
-        <w:t xml:space="preserve">然后是数据库设计，根据功能需求设计表结构。schema.sql中定义频道表、系统配置表、用户表和四张Shiro权限表，文章、评论、标签等业务表则通过JPA实体类自动建表，需要合理设置表间关联和索引。</w:t>
-      </w:r>
-    </w:p>
-    <w:p>
-      <w:pPr>
-        <w:spacing w:after="0" w:before="0" w:line="288" w:lineRule="auto"/>
-        <w:ind w:firstLine="480"/>
-      </w:pPr>
-      <w:r>
-        <w:rPr>
-          <w:rFonts w:ascii="Times New Roman" w:eastAsia="宋体" w:hAnsi="Times New Roman"/>
-          <w:sz w:val="24"/>
-          <w:szCs w:val="24"/>
-        </w:rPr>
-        <w:t xml:space="preserve">接下来是功能实现，逐一实现用户注册登录、文章发布管理、评论互动、全文搜索、收藏管理、后台管理等功能，重点解决MD5密码加密、ResourceLock资源锁、PostUpdateEvent事件机制等关键技术问题。</w:t>
+        <w:t xml:space="preserve">然后是数据库设计，根据功能需求设计表结构。系统通过JPA实体类自动建表，需要合理设置表间关联和索引。</w:t>
+      </w:r>
+    </w:p>
+    <w:p>
+      <w:pPr>
+        <w:spacing w:after="0" w:before="0" w:line="288" w:lineRule="auto"/>
+        <w:ind w:firstLine="480"/>
+      </w:pPr>
+      <w:r>
+        <w:rPr>
+          <w:rFonts w:ascii="Times New Roman" w:eastAsia="宋体" w:hAnsi="Times New Roman"/>
+          <w:sz w:val="24"/>
+          <w:szCs w:val="24"/>
+        </w:rPr>
+        <w:t xml:space="preserve">接下来是功能实现，逐一实现用户注册登录、文章发布管理、评论互动、后台管理等功能，重点解决MD5密码加密、ResourceLock资源锁、PostUpdateEvent事件机制等关键技术问题。</w:t>
       </w:r>
     </w:p>
     <w:p>
@@ -3209,7 +3057,7 @@
           <w:sz w:val="24"/>
           <w:szCs w:val="24"/>
         </w:rPr>
-        <w:t xml:space="preserve">实体类用@Entity、@Table、@Column等注解映射到数据库表，表间关系通过@ManyToOne、@OneToMany等关联注解建立。需要说明的是，schema.sql只定义了频道表、配置表、用户表和Shiro权限表，文章表、评论表、标签表等核心业务表是JPA的ddl-auto配置自动创建的。另外，系统通过Hibernate Search的@Indexed、@FullTextField注解给实体类加了全文索引。</w:t>
+        <w:t xml:space="preserve">实体类用@Entity、@Table、@Column等注解映射到数据库表，表间关系通过@ManyToOne、@OneToMany等关联注解建立。所有业务表都是JPA的ddl-auto配置自动创建的。</w:t>
       </w:r>
     </w:p>
     <w:p>
@@ -3334,33 +3182,57 @@
         </w:rPr>
         <w:t xml:space="preserve">[8]</w:t>
       </w:r>
-    </w:p>
-    <w:p>
-      <w:pPr>
-        <w:spacing w:after="0" w:before="0" w:line="288" w:lineRule="auto"/>
-        <w:ind w:firstLine="480"/>
-      </w:pPr>
-      <w:r>
-        <w:rPr>
-          <w:rFonts w:ascii="Times New Roman" w:eastAsia="宋体" w:hAnsi="Times New Roman"/>
-          <w:sz w:val="24"/>
-          <w:szCs w:val="24"/>
-        </w:rPr>
-        <w:t xml:space="preserve">本系统的数据库名为db_mblog，通过Spring Boot的数据源配置连接MySQL。开发测试时也支持切换到H2内存数据库。schema.sql脚本预置了频道、系统配置、管理员用户和权限数据，Flyway迁移工具默认关闭，需要时可以打开。</w:t>
-      </w:r>
-    </w:p>
-    <w:p>
-      <w:pPr>
-        <w:spacing w:after="0" w:before="0" w:line="288" w:lineRule="auto"/>
-        <w:ind w:firstLine="480"/>
-      </w:pPr>
-      <w:r>
-        <w:rPr>
-          <w:rFonts w:ascii="Times New Roman" w:eastAsia="宋体" w:hAnsi="Times New Roman"/>
-          <w:sz w:val="24"/>
-          <w:szCs w:val="24"/>
-        </w:rPr>
-        <w:t xml:space="preserve">schema.sql定义的表包括：mto_channel（频道表，预置banner、博客、随笔、分享四个频道）、mto_options（系统配置表，存网站名称、域名、SEO信息等）、mto_user（用户表，UK_USERNAME唯一索引保证用户名不重复），以及shiro_permission、shiro_role、shiro_role_permission、shiro_user_role四张Shiro权限表。文章、评论、标签、收藏这些业务表是JPA自动建的，各表之间通过外键关联，比如文章表的author_id指向用户表id，channel_id指向频道表id。</w:t>
+      <w:r>
+        <w:rPr>
+          <w:rFonts w:ascii="Times New Roman" w:eastAsia="宋体" w:hAnsi="Times New Roman"/>
+          <w:sz w:val="24"/>
+          <w:szCs w:val="24"/>
+          <w:vertAlign w:val="superscript"/>
+        </w:rPr>
+        <w:t xml:space="preserve">[12]</w:t>
+      </w:r>
+    </w:p>
+    <w:p>
+      <w:pPr>
+        <w:spacing w:after="0" w:before="0" w:line="288" w:lineRule="auto"/>
+        <w:ind w:firstLine="480"/>
+      </w:pPr>
+      <w:r>
+        <w:rPr>
+          <w:rFonts w:ascii="Times New Roman" w:eastAsia="宋体" w:hAnsi="Times New Roman"/>
+          <w:sz w:val="24"/>
+          <w:szCs w:val="24"/>
+        </w:rPr>
+        <w:t xml:space="preserve">本系统的数据库名为db_mblog，通过Spring Boot的数据源配置连接MySQL。开发测试时也支持切换到H2内存数据库。建表方式采用Hibernate的ddl-auto: update自动维护，初始数据通过menu.json和代码初始化。</w:t>
+      </w:r>
+    </w:p>
+    <w:p>
+      <w:pPr>
+        <w:spacing w:after="0" w:before="0" w:line="288" w:lineRule="auto"/>
+        <w:ind w:firstLine="480"/>
+      </w:pPr>
+      <w:r>
+        <w:rPr>
+          <w:rFonts w:ascii="Times New Roman" w:eastAsia="宋体" w:hAnsi="Times New Roman"/>
+          <w:sz w:val="24"/>
+          <w:szCs w:val="24"/>
+        </w:rPr>
+        <w:t xml:space="preserve">系统涉及的表包括：mto_channel（频道表，预置banner、博客、随笔、分享四个频道）、mto_options（系统配置表，存网站名称、域名、SEO信息等）、mto_user（用户表，UK_USERNAME唯一索引保证用户名不重复），以及shiro_permission、shiro_role、shiro_role_permission、shiro_user_role四张Shiro权限表。文章、评论、标签等业务表是JPA自动建的，各表之间通过外键关联，比如文章表的author_id指向用户表id，channel_id指向频道表id。</w:t>
+      </w:r>
+    </w:p>
+    <w:p>
+      <w:pPr>
+        <w:pageBreakBefore/>
+        <w:spacing w:after="480" w:before="480" w:line="288" w:lineRule="auto"/>
+        <w:jc w:val="center"/>
+      </w:pPr>
+      <w:r>
+        <w:rPr>
+          <w:rFonts w:ascii="Times New Roman" w:eastAsia="黑体" w:hAnsi="Times New Roman"/>
+          <w:sz w:val="36"/>
+          <w:szCs w:val="36"/>
+        </w:rPr>
+        <w:t xml:space="preserve">第3章 需求分析</w:t>
       </w:r>
     </w:p>
     <w:p>
@@ -3373,21 +3245,196 @@
           <w:sz w:val="30"/>
           <w:szCs w:val="30"/>
         </w:rPr>
-        <w:t xml:space="preserve">2.6 Hibernate Search全文搜索</w:t>
-      </w:r>
-    </w:p>
-    <w:p>
-      <w:pPr>
-        <w:spacing w:after="0" w:before="0" w:line="288" w:lineRule="auto"/>
-        <w:ind w:firstLine="480"/>
-      </w:pPr>
-      <w:r>
-        <w:rPr>
-          <w:rFonts w:ascii="Times New Roman" w:eastAsia="宋体" w:hAnsi="Times New Roman"/>
-          <w:sz w:val="24"/>
-          <w:szCs w:val="24"/>
-        </w:rPr>
-        <w:t xml:space="preserve">Hibernate Search是Hibernate ORM的扩展，把Hibernate的持久化模型和Apache Lucene搜索引擎对接起来。开发者用注解标记需要建索引的字段，数据写入时Hibernate Search自动更新Lucene索引，查询时用简单的API就能做全文检索。</w:t>
+        <w:t xml:space="preserve">3.1 功能性需求</w:t>
+      </w:r>
+    </w:p>
+    <w:p>
+      <w:pPr>
+        <w:spacing w:after="0" w:before="0" w:line="288" w:lineRule="auto"/>
+        <w:ind w:firstLine="480"/>
+      </w:pPr>
+      <w:r>
+        <w:rPr>
+          <w:rFonts w:ascii="Times New Roman" w:eastAsia="宋体" w:hAnsi="Times New Roman"/>
+          <w:sz w:val="24"/>
+          <w:szCs w:val="24"/>
+        </w:rPr>
+        <w:t xml:space="preserve">系统的功能性需求分前台和后台两部分。前台面向注册用户和访客，后台面向管理员。application.yml里的site.controls配置项可以控制注册、发文章、评论三个功能的开关。</w:t>
+      </w:r>
+    </w:p>
+    <w:p>
+      <w:pPr>
+        <w:spacing w:after="0" w:before="240" w:line="288" w:lineRule="auto"/>
+      </w:pPr>
+      <w:r>
+        <w:rPr>
+          <w:rFonts w:ascii="Times New Roman" w:eastAsia="黑体" w:hAnsi="Times New Roman"/>
+          <w:sz w:val="28"/>
+          <w:szCs w:val="28"/>
+        </w:rPr>
+        <w:t xml:space="preserve">3.1.1 用户管理功能</w:t>
+      </w:r>
+    </w:p>
+    <w:p>
+      <w:pPr>
+        <w:spacing w:after="0" w:before="0" w:line="288" w:lineRule="auto"/>
+        <w:ind w:firstLine="480"/>
+      </w:pPr>
+      <w:r>
+        <w:rPr>
+          <w:rFonts w:ascii="Times New Roman" w:eastAsia="宋体" w:hAnsi="Times New Roman"/>
+          <w:sz w:val="24"/>
+          <w:szCs w:val="24"/>
+        </w:rPr>
+        <w:t xml:space="preserve">用户管理包括注册、登录和个人信息管理。注册时用户提交用户名和密码，系统校验非空和唯一性后用MD5加密密码，状态设为ENABLED，注册成功后自动登录跳转到用户主页。登录走Shiro认证流程，验证通过后创建会话、更新最后登录时间。个人信息管理支持修改昵称、签名、头像、邮箱和密码，改密码时要校验旧密码。</w:t>
+      </w:r>
+    </w:p>
+    <w:p>
+      <w:pPr>
+        <w:spacing w:after="0" w:before="240" w:line="288" w:lineRule="auto"/>
+      </w:pPr>
+      <w:r>
+        <w:rPr>
+          <w:rFonts w:ascii="Times New Roman" w:eastAsia="黑体" w:hAnsi="Times New Roman"/>
+          <w:sz w:val="28"/>
+          <w:szCs w:val="28"/>
+        </w:rPr>
+        <w:t xml:space="preserve">3.1.2 文章管理功能</w:t>
+      </w:r>
+    </w:p>
+    <w:p>
+      <w:pPr>
+        <w:spacing w:after="0" w:before="0" w:line="288" w:lineRule="auto"/>
+        <w:ind w:firstLine="480"/>
+      </w:pPr>
+      <w:r>
+        <w:rPr>
+          <w:rFonts w:ascii="Times New Roman" w:eastAsia="宋体" w:hAnsi="Times New Roman"/>
+          <w:sz w:val="24"/>
+          <w:szCs w:val="24"/>
+        </w:rPr>
+        <w:t xml:space="preserve">文章管理是系统的核心功能，包括发布、编辑、删除和浏览。发布文章用Markdown编辑器，可以设置标题、频道、标签、摘要和封面图。摘要为空时系统自动截取正文前126个字符。编辑文章时用ResourceLock资源锁防止并发冲突，同时对比新旧内容增减图片资源引用计数。删除文章前校验当前用户是不是作者，删除时清理关联的属性、资源引用并发布删除事件。文章列表支持按时间和浏览量排序，分页浏览。</w:t>
+      </w:r>
+    </w:p>
+    <w:p>
+      <w:pPr>
+        <w:spacing w:after="0" w:before="240" w:line="288" w:lineRule="auto"/>
+      </w:pPr>
+      <w:r>
+        <w:rPr>
+          <w:rFonts w:ascii="Times New Roman" w:eastAsia="黑体" w:hAnsi="Times New Roman"/>
+          <w:sz w:val="28"/>
+          <w:szCs w:val="28"/>
+        </w:rPr>
+        <w:t xml:space="preserve">3.1.3 评论互动功能</w:t>
+      </w:r>
+    </w:p>
+    <w:p>
+      <w:pPr>
+        <w:spacing w:after="0" w:before="0" w:line="288" w:lineRule="auto"/>
+        <w:ind w:firstLine="480"/>
+      </w:pPr>
+      <w:r>
+        <w:rPr>
+          <w:rFonts w:ascii="Times New Roman" w:eastAsia="宋体" w:hAnsi="Times New Roman"/>
+          <w:sz w:val="24"/>
+          <w:szCs w:val="24"/>
+        </w:rPr>
+        <w:t xml:space="preserve">登录用户可以对文章发表评论，也支持多级回复。评论表mto_comment的pid字段记录父评论ID，靠这个字段维护评论的层级关系。文章详情页展示评论列表并显示评论数。后台可以查看和删除评论。</w:t>
+      </w:r>
+    </w:p>
+    <w:p>
+      <w:pPr>
+        <w:spacing w:after="0" w:before="240" w:line="288" w:lineRule="auto"/>
+      </w:pPr>
+      <w:r>
+        <w:rPr>
+          <w:rFonts w:ascii="Times New Roman" w:eastAsia="黑体" w:hAnsi="Times New Roman"/>
+          <w:sz w:val="28"/>
+          <w:szCs w:val="28"/>
+        </w:rPr>
+        <w:t xml:space="preserve">3.1.4 频道与标签功能</w:t>
+      </w:r>
+    </w:p>
+    <w:p>
+      <w:pPr>
+        <w:spacing w:after="0" w:before="0" w:line="288" w:lineRule="auto"/>
+        <w:ind w:firstLine="480"/>
+      </w:pPr>
+      <w:r>
+        <w:rPr>
+          <w:rFonts w:ascii="Times New Roman" w:eastAsia="宋体" w:hAnsi="Times New Roman"/>
+          <w:sz w:val="24"/>
+          <w:szCs w:val="24"/>
+        </w:rPr>
+        <w:t xml:space="preserve">文章通过频道和标签两种方式分类。频道是系统预置的，初始化了banner、博客、随笔、分享四个，管理员可以在后台增删改和排序。标签由用户发布文章时自由填写，通过mto_post_tag表维护文章和标签的多对多关系，系统提供标签云页面展示热门标签。</w:t>
+      </w:r>
+    </w:p>
+    <w:p>
+      <w:pPr>
+        <w:spacing w:after="0" w:before="240" w:line="288" w:lineRule="auto"/>
+      </w:pPr>
+      <w:r>
+        <w:rPr>
+          <w:rFonts w:ascii="Times New Roman" w:eastAsia="黑体" w:hAnsi="Times New Roman"/>
+          <w:sz w:val="28"/>
+          <w:szCs w:val="28"/>
+        </w:rPr>
+        <w:t xml:space="preserve">3.1.5 后台管理功能</w:t>
+      </w:r>
+    </w:p>
+    <w:p>
+      <w:pPr>
+        <w:spacing w:after="0" w:before="0" w:line="288" w:lineRule="auto"/>
+        <w:ind w:firstLine="480"/>
+      </w:pPr>
+      <w:r>
+        <w:rPr>
+          <w:rFonts w:ascii="Times New Roman" w:eastAsia="宋体" w:hAnsi="Times New Roman"/>
+          <w:sz w:val="24"/>
+          <w:szCs w:val="24"/>
+        </w:rPr>
+        <w:t xml:space="preserve">后台通过/admin路径访问，由Shiro权限拦截器控制。菜单有五项，对应六个控制器：AdminController做仪表盘（统计计数加JVM内存监控）；ChannelController管频道的增删改查和排序；CommentController管评论的查看和删除；PostController管文章的列表、编辑、删除和批量删除；UserController管用户列表、角色分配、密码重置、启禁用；OptionsController管系统配置。</w:t>
+      </w:r>
+    </w:p>
+    <w:p>
+      <w:pPr>
+        <w:spacing w:after="240" w:before="240" w:line="288" w:lineRule="auto"/>
+      </w:pPr>
+      <w:r>
+        <w:rPr>
+          <w:rFonts w:ascii="Times New Roman" w:eastAsia="黑体" w:hAnsi="Times New Roman"/>
+          <w:sz w:val="30"/>
+          <w:szCs w:val="30"/>
+        </w:rPr>
+        <w:t xml:space="preserve">3.2 非功能性需求</w:t>
+      </w:r>
+    </w:p>
+    <w:p>
+      <w:pPr>
+        <w:spacing w:after="0" w:before="240" w:line="288" w:lineRule="auto"/>
+      </w:pPr>
+      <w:r>
+        <w:rPr>
+          <w:rFonts w:ascii="Times New Roman" w:eastAsia="黑体" w:hAnsi="Times New Roman"/>
+          <w:sz w:val="28"/>
+          <w:szCs w:val="28"/>
+        </w:rPr>
+        <w:t xml:space="preserve">3.2.1 性能需求</w:t>
+      </w:r>
+    </w:p>
+    <w:p>
+      <w:pPr>
+        <w:spacing w:after="0" w:before="0" w:line="288" w:lineRule="auto"/>
+        <w:ind w:firstLine="480"/>
+      </w:pPr>
+      <w:r>
+        <w:rPr>
+          <w:rFonts w:ascii="Times New Roman" w:eastAsia="宋体" w:hAnsi="Times New Roman"/>
+          <w:sz w:val="24"/>
+          <w:szCs w:val="24"/>
+        </w:rPr>
+        <w:t xml:space="preserve">系统应能快速响应用户请求。页面加载控制在3秒以内，文章列表分页查询不超过1秒。具体的优化手段包括：用EhCache缓存减少数据库查询、分页查询避免一次性加载过多数据。Undertow服务器配了2个IO线程和32个工作线程处理并发。文件上传限制10MB，图片限制宽度800像素、大小2MB。</w:t>
       </w:r>
       <w:r>
         <w:rPr>
@@ -3396,35 +3443,106 @@
           <w:szCs w:val="24"/>
           <w:vertAlign w:val="superscript"/>
         </w:rPr>
-        <w:t xml:space="preserve">[12]</w:t>
-      </w:r>
-    </w:p>
-    <w:p>
-      <w:pPr>
-        <w:spacing w:after="0" w:before="0" w:line="288" w:lineRule="auto"/>
-        <w:ind w:firstLine="480"/>
-      </w:pPr>
-      <w:r>
-        <w:rPr>
-          <w:rFonts w:ascii="Times New Roman" w:eastAsia="宋体" w:hAnsi="Times New Roman"/>
-          <w:sz w:val="24"/>
-          <w:szCs w:val="24"/>
-        </w:rPr>
-        <w:t xml:space="preserve">本系统集成了Hibernate Search 7.2.4和lucene-analyzers-smartcn 8.11.4中文分词器。PostSearchServiceImpl.search()方法通过Search.session(entityManager)拿到SearchSession，构建布尔查询对title、summary、tags三个字段做fuzzy模糊匹配，fuzzy(1)参数允许1个编辑距离的容错。查询结果分页返回，同时返回总命中数。</w:t>
-      </w:r>
-    </w:p>
-    <w:p>
-      <w:pPr>
-        <w:spacing w:after="0" w:before="0" w:line="288" w:lineRule="auto"/>
-        <w:ind w:firstLine="480"/>
-      </w:pPr>
-      <w:r>
-        <w:rPr>
-          <w:rFonts w:ascii="Times New Roman" w:eastAsia="宋体" w:hAnsi="Times New Roman"/>
-          <w:sz w:val="24"/>
-          <w:szCs w:val="24"/>
-        </w:rPr>
-        <w:t xml:space="preserve">中文分词由SmartCnAnalysisConfigurer配置类注册SmartCN分词器。文章发布或更新时Lucene索引自动同步，管理员也可以通过OptionsController的reset_indexes接口调用massIndexer重建全部索引。</w:t>
+        <w:t xml:space="preserve">[7]</w:t>
+      </w:r>
+    </w:p>
+    <w:p>
+      <w:pPr>
+        <w:spacing w:after="0" w:before="240" w:line="288" w:lineRule="auto"/>
+      </w:pPr>
+      <w:r>
+        <w:rPr>
+          <w:rFonts w:ascii="Times New Roman" w:eastAsia="黑体" w:hAnsi="Times New Roman"/>
+          <w:sz w:val="28"/>
+          <w:szCs w:val="28"/>
+        </w:rPr>
+        <w:t xml:space="preserve">3.2.2 安全需求</w:t>
+      </w:r>
+    </w:p>
+    <w:p>
+      <w:pPr>
+        <w:spacing w:after="0" w:before="0" w:line="288" w:lineRule="auto"/>
+        <w:ind w:firstLine="480"/>
+      </w:pPr>
+      <w:r>
+        <w:rPr>
+          <w:rFonts w:ascii="Times New Roman" w:eastAsia="宋体" w:hAnsi="Times New Roman"/>
+          <w:sz w:val="24"/>
+          <w:szCs w:val="24"/>
+        </w:rPr>
+        <w:t xml:space="preserve">安全方面需要保证用户数据和系统稳定。密码用MD5加密存储，不存明文。后台路径由Shiro拦截器做RBAC权限控制，没授权的用户进不了管理功能。用户输入的HTML内容用Jsoup清洗，防XSS攻击。删文章时校验当前用户是不是作者，防越权删除。文件上传限制了类型和大小，防恶意文件。</w:t>
+      </w:r>
+      <w:r>
+        <w:rPr>
+          <w:rFonts w:ascii="Times New Roman" w:eastAsia="宋体" w:hAnsi="Times New Roman"/>
+          <w:sz w:val="24"/>
+          <w:szCs w:val="24"/>
+          <w:vertAlign w:val="superscript"/>
+        </w:rPr>
+        <w:t xml:space="preserve">[10]</w:t>
+      </w:r>
+    </w:p>
+    <w:p>
+      <w:pPr>
+        <w:spacing w:after="0" w:before="240" w:line="288" w:lineRule="auto"/>
+      </w:pPr>
+      <w:r>
+        <w:rPr>
+          <w:rFonts w:ascii="Times New Roman" w:eastAsia="黑体" w:hAnsi="Times New Roman"/>
+          <w:sz w:val="28"/>
+          <w:szCs w:val="28"/>
+        </w:rPr>
+        <w:t xml:space="preserve">3.2.3 可扩展性需求</w:t>
+      </w:r>
+    </w:p>
+    <w:p>
+      <w:pPr>
+        <w:spacing w:after="0" w:before="0" w:line="288" w:lineRule="auto"/>
+        <w:ind w:firstLine="480"/>
+      </w:pPr>
+      <w:r>
+        <w:rPr>
+          <w:rFonts w:ascii="Times New Roman" w:eastAsia="宋体" w:hAnsi="Times New Roman"/>
+          <w:sz w:val="24"/>
+          <w:szCs w:val="24"/>
+        </w:rPr>
+        <w:t xml:space="preserve">系统应支持功能模块的灵活扩展。Spring Boot的自动配置机制让新功能只需加依赖和配置就行。模板引擎支持加载外部模板文件，不用重新编译代码就能扩展页面。@PostStatusFilter注解和AOP切面让数据权限过滤可以灵活扩展。ApplicationContext发布PostUpdateEvent事件实现了解耦，要加新的文章更新后处理逻辑，写个事件监听器就够了。</w:t>
+      </w:r>
+      <w:r>
+        <w:rPr>
+          <w:rFonts w:ascii="Times New Roman" w:eastAsia="宋体" w:hAnsi="Times New Roman"/>
+          <w:sz w:val="24"/>
+          <w:szCs w:val="24"/>
+          <w:vertAlign w:val="superscript"/>
+        </w:rPr>
+        <w:t xml:space="preserve">[13]</w:t>
+      </w:r>
+    </w:p>
+    <w:p>
+      <w:pPr>
+        <w:spacing w:after="0" w:before="240" w:line="288" w:lineRule="auto"/>
+      </w:pPr>
+      <w:r>
+        <w:rPr>
+          <w:rFonts w:ascii="Times New Roman" w:eastAsia="黑体" w:hAnsi="Times New Roman"/>
+          <w:sz w:val="28"/>
+          <w:szCs w:val="28"/>
+        </w:rPr>
+        <w:t xml:space="preserve">3.2.4 可维护性需求</w:t>
+      </w:r>
+    </w:p>
+    <w:p>
+      <w:pPr>
+        <w:spacing w:after="0" w:before="0" w:line="288" w:lineRule="auto"/>
+        <w:ind w:firstLine="480"/>
+      </w:pPr>
+      <w:r>
+        <w:rPr>
+          <w:rFonts w:ascii="Times New Roman" w:eastAsia="宋体" w:hAnsi="Times New Roman"/>
+          <w:sz w:val="24"/>
+          <w:szCs w:val="24"/>
+        </w:rPr>
+        <w:t xml:space="preserve">代码要可读、好维护。MVC分层让各层职责清晰，耦合度低。Service层接口和实现分离，方便单测和替换。Lombok减少样板代码，Fastjson2做JSON序列化，Commonmark处理Markdown渲染。日志用Logback，支持不同环境的日志级别。ResourceLock工具类用ConcurrentHashMap和AtomicInteger做了细粒度资源锁，保证并发安全。</w:t>
       </w:r>
     </w:p>
     <w:p>
@@ -3439,7 +3557,7 @@
           <w:sz w:val="36"/>
           <w:szCs w:val="36"/>
         </w:rPr>
-        <w:t xml:space="preserve">第3章 需求分析</w:t>
+        <w:t xml:space="preserve">第4章 系统设计</w:t>
       </w:r>
     </w:p>
     <w:p>
@@ -3452,210 +3570,91 @@
           <w:sz w:val="30"/>
           <w:szCs w:val="30"/>
         </w:rPr>
-        <w:t xml:space="preserve">3.1 功能性需求</w:t>
-      </w:r>
-    </w:p>
-    <w:p>
-      <w:pPr>
-        <w:spacing w:after="0" w:before="0" w:line="288" w:lineRule="auto"/>
-        <w:ind w:firstLine="480"/>
-      </w:pPr>
-      <w:r>
-        <w:rPr>
-          <w:rFonts w:ascii="Times New Roman" w:eastAsia="宋体" w:hAnsi="Times New Roman"/>
-          <w:sz w:val="24"/>
-          <w:szCs w:val="24"/>
-        </w:rPr>
-        <w:t xml:space="preserve">系统的功能性需求分前台和后台两部分。前台面向注册用户和访客，后台面向管理员。application.yml里的site.controls配置项可以控制注册、发文章、评论三个功能的开关。</w:t>
-      </w:r>
-    </w:p>
-    <w:p>
-      <w:pPr>
-        <w:spacing w:after="0" w:before="240" w:line="288" w:lineRule="auto"/>
-      </w:pPr>
-      <w:r>
-        <w:rPr>
-          <w:rFonts w:ascii="Times New Roman" w:eastAsia="黑体" w:hAnsi="Times New Roman"/>
-          <w:sz w:val="28"/>
-          <w:szCs w:val="28"/>
-        </w:rPr>
-        <w:t xml:space="preserve">3.1.1 用户管理功能</w:t>
-      </w:r>
-    </w:p>
-    <w:p>
-      <w:pPr>
-        <w:spacing w:after="0" w:before="0" w:line="288" w:lineRule="auto"/>
-        <w:ind w:firstLine="480"/>
-      </w:pPr>
-      <w:r>
-        <w:rPr>
-          <w:rFonts w:ascii="Times New Roman" w:eastAsia="宋体" w:hAnsi="Times New Roman"/>
-          <w:sz w:val="24"/>
-          <w:szCs w:val="24"/>
-        </w:rPr>
-        <w:t xml:space="preserve">用户管理包括注册、登录和个人信息管理。注册时用户提交用户名和密码，系统校验非空和唯一性后用MD5加密密码，状态设为ENABLED，注册成功后自动登录跳转到用户主页。登录走Shiro认证流程，验证通过后创建会话、更新最后登录时间。个人信息管理支持修改昵称、签名、头像、邮箱和密码，改密码时要校验旧密码。</w:t>
-      </w:r>
-    </w:p>
-    <w:p>
-      <w:pPr>
-        <w:spacing w:after="0" w:before="240" w:line="288" w:lineRule="auto"/>
-      </w:pPr>
-      <w:r>
-        <w:rPr>
-          <w:rFonts w:ascii="Times New Roman" w:eastAsia="黑体" w:hAnsi="Times New Roman"/>
-          <w:sz w:val="28"/>
-          <w:szCs w:val="28"/>
-        </w:rPr>
-        <w:t xml:space="preserve">3.1.2 文章管理功能</w:t>
-      </w:r>
-    </w:p>
-    <w:p>
-      <w:pPr>
-        <w:spacing w:after="0" w:before="0" w:line="288" w:lineRule="auto"/>
-        <w:ind w:firstLine="480"/>
-      </w:pPr>
-      <w:r>
-        <w:rPr>
-          <w:rFonts w:ascii="Times New Roman" w:eastAsia="宋体" w:hAnsi="Times New Roman"/>
-          <w:sz w:val="24"/>
-          <w:szCs w:val="24"/>
-        </w:rPr>
-        <w:t xml:space="preserve">文章管理是系统的核心功能，包括发布、编辑、删除和浏览。发布文章用Markdown编辑器，可以设置标题、频道、标签、摘要和封面图。摘要为空时系统自动截取正文前126个字符。编辑文章时用ResourceLock资源锁防止并发冲突，同时对比新旧内容增减图片资源引用计数。删除文章前校验当前用户是不是作者，删除时清理关联的属性、资源引用并发布删除事件。文章列表支持按时间和浏览量排序，分页浏览。</w:t>
-      </w:r>
-    </w:p>
-    <w:p>
-      <w:pPr>
-        <w:spacing w:after="0" w:before="240" w:line="288" w:lineRule="auto"/>
-      </w:pPr>
-      <w:r>
-        <w:rPr>
-          <w:rFonts w:ascii="Times New Roman" w:eastAsia="黑体" w:hAnsi="Times New Roman"/>
-          <w:sz w:val="28"/>
-          <w:szCs w:val="28"/>
-        </w:rPr>
-        <w:t xml:space="preserve">3.1.3 评论互动功能</w:t>
-      </w:r>
-    </w:p>
-    <w:p>
-      <w:pPr>
-        <w:spacing w:after="0" w:before="0" w:line="288" w:lineRule="auto"/>
-        <w:ind w:firstLine="480"/>
-      </w:pPr>
-      <w:r>
-        <w:rPr>
-          <w:rFonts w:ascii="Times New Roman" w:eastAsia="宋体" w:hAnsi="Times New Roman"/>
-          <w:sz w:val="24"/>
-          <w:szCs w:val="24"/>
-        </w:rPr>
-        <w:t xml:space="preserve">登录用户可以对文章发表评论，也支持多级回复。评论表mto_comment的pid字段记录父评论ID，靠这个字段维护评论的层级关系。文章详情页展示评论列表并显示评论数。后台可以查看和删除评论。</w:t>
-      </w:r>
-    </w:p>
-    <w:p>
-      <w:pPr>
-        <w:spacing w:after="0" w:before="240" w:line="288" w:lineRule="auto"/>
-      </w:pPr>
-      <w:r>
-        <w:rPr>
-          <w:rFonts w:ascii="Times New Roman" w:eastAsia="黑体" w:hAnsi="Times New Roman"/>
-          <w:sz w:val="28"/>
-          <w:szCs w:val="28"/>
-        </w:rPr>
-        <w:t xml:space="preserve">3.1.4 频道与标签功能</w:t>
-      </w:r>
-    </w:p>
-    <w:p>
-      <w:pPr>
-        <w:spacing w:after="0" w:before="0" w:line="288" w:lineRule="auto"/>
-        <w:ind w:firstLine="480"/>
-      </w:pPr>
-      <w:r>
-        <w:rPr>
-          <w:rFonts w:ascii="Times New Roman" w:eastAsia="宋体" w:hAnsi="Times New Roman"/>
-          <w:sz w:val="24"/>
-          <w:szCs w:val="24"/>
-        </w:rPr>
-        <w:t xml:space="preserve">文章通过频道和标签两种方式分类。频道是系统预置的，初始化了banner、博客、随笔、分享四个，管理员可以在后台增删改和排序。标签由用户发布文章时自由填写，通过mto_post_tag表维护文章和标签的多对多关系，系统提供标签云页面展示热门标签。</w:t>
-      </w:r>
-    </w:p>
-    <w:p>
-      <w:pPr>
-        <w:spacing w:after="0" w:before="240" w:line="288" w:lineRule="auto"/>
-      </w:pPr>
-      <w:r>
-        <w:rPr>
-          <w:rFonts w:ascii="Times New Roman" w:eastAsia="黑体" w:hAnsi="Times New Roman"/>
-          <w:sz w:val="28"/>
-          <w:szCs w:val="28"/>
-        </w:rPr>
-        <w:t xml:space="preserve">3.1.5 全文搜索功能</w:t>
-      </w:r>
-    </w:p>
-    <w:p>
-      <w:pPr>
-        <w:spacing w:after="0" w:before="0" w:line="288" w:lineRule="auto"/>
-        <w:ind w:firstLine="480"/>
-      </w:pPr>
-      <w:r>
-        <w:rPr>
-          <w:rFonts w:ascii="Times New Roman" w:eastAsia="宋体" w:hAnsi="Times New Roman"/>
-          <w:sz w:val="24"/>
-          <w:szCs w:val="24"/>
-        </w:rPr>
-        <w:t xml:space="preserve">用户输入关键词可以搜索文章的标题、摘要和标签。搜索基于Hibernate Search和Lucene实现，用SmartCN分词器处理中文，支持模糊匹配和分页。搜索结果按相关度排序，同时加载作者信息一起展示。</w:t>
-      </w:r>
-    </w:p>
-    <w:p>
-      <w:pPr>
-        <w:spacing w:after="0" w:before="240" w:line="288" w:lineRule="auto"/>
-      </w:pPr>
-      <w:r>
-        <w:rPr>
-          <w:rFonts w:ascii="Times New Roman" w:eastAsia="黑体" w:hAnsi="Times New Roman"/>
-          <w:sz w:val="28"/>
-          <w:szCs w:val="28"/>
-        </w:rPr>
-        <w:t xml:space="preserve">3.1.6 收藏功能</w:t>
-      </w:r>
-    </w:p>
-    <w:p>
-      <w:pPr>
-        <w:spacing w:after="0" w:before="0" w:line="288" w:lineRule="auto"/>
-        <w:ind w:firstLine="480"/>
-      </w:pPr>
-      <w:r>
-        <w:rPr>
-          <w:rFonts w:ascii="Times New Roman" w:eastAsia="宋体" w:hAnsi="Times New Roman"/>
-          <w:sz w:val="24"/>
-          <w:szCs w:val="24"/>
-        </w:rPr>
-        <w:t xml:space="preserve">登录用户可以收藏文章，收藏记录存在mto_favorite表里。个人中心可以查看收藏列表和取消收藏。收藏和取消收藏时系统会更新文章的收藏计数。</w:t>
-      </w:r>
-    </w:p>
-    <w:p>
-      <w:pPr>
-        <w:spacing w:after="0" w:before="240" w:line="288" w:lineRule="auto"/>
-      </w:pPr>
-      <w:r>
-        <w:rPr>
-          <w:rFonts w:ascii="Times New Roman" w:eastAsia="黑体" w:hAnsi="Times New Roman"/>
-          <w:sz w:val="28"/>
-          <w:szCs w:val="28"/>
-        </w:rPr>
-        <w:t xml:space="preserve">3.1.7 后台管理功能</w:t>
-      </w:r>
-    </w:p>
-    <w:p>
-      <w:pPr>
-        <w:spacing w:after="0" w:before="0" w:line="288" w:lineRule="auto"/>
-        <w:ind w:firstLine="480"/>
-      </w:pPr>
-      <w:r>
-        <w:rPr>
-          <w:rFonts w:ascii="Times New Roman" w:eastAsia="宋体" w:hAnsi="Times New Roman"/>
-          <w:sz w:val="24"/>
-          <w:szCs w:val="24"/>
-        </w:rPr>
-        <w:t xml:space="preserve">后台通过/admin路径访问，由Shiro权限拦截器控制。菜单有五项，对应六个控制器：AdminController做仪表盘（统计计数加JVM内存监控）；ChannelController管频道的增删改查和排序；CommentController管评论的查看和删除；PostController管文章的列表、编辑、删除和批量删除；UserController管用户列表、角色分配、密码重置、启禁用；OptionsController管系统配置和全文索引重建。</w:t>
+        <w:t xml:space="preserve">4.1 设计原则</w:t>
+      </w:r>
+    </w:p>
+    <w:p>
+      <w:pPr>
+        <w:spacing w:after="0" w:before="0" w:line="288" w:lineRule="auto"/>
+        <w:ind w:firstLine="480"/>
+      </w:pPr>
+      <w:r>
+        <w:rPr>
+          <w:rFonts w:ascii="Times New Roman" w:eastAsia="宋体" w:hAnsi="Times New Roman"/>
+          <w:sz w:val="24"/>
+          <w:szCs w:val="24"/>
+        </w:rPr>
+        <w:t xml:space="preserve">系统设计主要遵循以下原则。</w:t>
+      </w:r>
+    </w:p>
+    <w:p>
+      <w:pPr>
+        <w:spacing w:after="0" w:before="0" w:line="288" w:lineRule="auto"/>
+        <w:ind w:firstLine="480"/>
+      </w:pPr>
+      <w:r>
+        <w:rPr>
+          <w:rFonts w:ascii="Times New Roman" w:eastAsia="宋体" w:hAnsi="Times New Roman"/>
+          <w:sz w:val="24"/>
+          <w:szCs w:val="24"/>
+        </w:rPr>
+        <w:t xml:space="preserve">第一是MVC架构模式，把数据模型、视图展示和业务控制分开，代码更好维护也更好测试。</w:t>
+      </w:r>
+    </w:p>
+    <w:p>
+      <w:pPr>
+        <w:spacing w:after="0" w:before="0" w:line="288" w:lineRule="auto"/>
+        <w:ind w:firstLine="480"/>
+      </w:pPr>
+      <w:r>
+        <w:rPr>
+          <w:rFonts w:ascii="Times New Roman" w:eastAsia="宋体" w:hAnsi="Times New Roman"/>
+          <w:sz w:val="24"/>
+          <w:szCs w:val="24"/>
+        </w:rPr>
+        <w:t xml:space="preserve">第二是分层设计，在MVC基础上进一步细分为实体层、数据访问层、业务逻辑层、控制层和视图层，各层通过接口交互，降低层间耦合。</w:t>
+      </w:r>
+    </w:p>
+    <w:p>
+      <w:pPr>
+        <w:spacing w:after="0" w:before="0" w:line="288" w:lineRule="auto"/>
+        <w:ind w:firstLine="480"/>
+      </w:pPr>
+      <w:r>
+        <w:rPr>
+          <w:rFonts w:ascii="Times New Roman" w:eastAsia="宋体" w:hAnsi="Times New Roman"/>
+          <w:sz w:val="24"/>
+          <w:szCs w:val="24"/>
+        </w:rPr>
+        <w:t xml:space="preserve">第三是单一职责，每个类只管一个功能领域——PostService只管文章，UserService只管用户，避免出现什么都管的"上帝类"。</w:t>
+      </w:r>
+    </w:p>
+    <w:p>
+      <w:pPr>
+        <w:spacing w:after="0" w:before="0" w:line="288" w:lineRule="auto"/>
+        <w:ind w:firstLine="480"/>
+      </w:pPr>
+      <w:r>
+        <w:rPr>
+          <w:rFonts w:ascii="Times New Roman" w:eastAsia="宋体" w:hAnsi="Times New Roman"/>
+          <w:sz w:val="24"/>
+          <w:szCs w:val="24"/>
+        </w:rPr>
+        <w:t xml:space="preserve">第四是开闭原则，通过接口和事件机制实现对扩展开放、对修改关闭。比如PostUpdateEvent事件让系统不改PostService代码就能加新的文章更新后处理逻辑。</w:t>
+      </w:r>
+    </w:p>
+    <w:p>
+      <w:pPr>
+        <w:spacing w:after="0" w:before="0" w:line="288" w:lineRule="auto"/>
+        <w:ind w:firstLine="480"/>
+      </w:pPr>
+      <w:r>
+        <w:rPr>
+          <w:rFonts w:ascii="Times New Roman" w:eastAsia="宋体" w:hAnsi="Times New Roman"/>
+          <w:sz w:val="24"/>
+          <w:szCs w:val="24"/>
+        </w:rPr>
+        <w:t xml:space="preserve">第五是安全优先，架构设计阶段就考虑了安全因素——Shiro做统一认证授权，Hibernate过滤器做数据权限控制，ResourceLock做并发资源锁管理。</w:t>
       </w:r>
     </w:p>
     <w:p>
@@ -3668,266 +3667,6 @@
           <w:sz w:val="30"/>
           <w:szCs w:val="30"/>
         </w:rPr>
-        <w:t xml:space="preserve">3.2 非功能性需求</w:t>
-      </w:r>
-    </w:p>
-    <w:p>
-      <w:pPr>
-        <w:spacing w:after="0" w:before="240" w:line="288" w:lineRule="auto"/>
-      </w:pPr>
-      <w:r>
-        <w:rPr>
-          <w:rFonts w:ascii="Times New Roman" w:eastAsia="黑体" w:hAnsi="Times New Roman"/>
-          <w:sz w:val="28"/>
-          <w:szCs w:val="28"/>
-        </w:rPr>
-        <w:t xml:space="preserve">3.2.1 性能需求</w:t>
-      </w:r>
-    </w:p>
-    <w:p>
-      <w:pPr>
-        <w:spacing w:after="0" w:before="0" w:line="288" w:lineRule="auto"/>
-        <w:ind w:firstLine="480"/>
-      </w:pPr>
-      <w:r>
-        <w:rPr>
-          <w:rFonts w:ascii="Times New Roman" w:eastAsia="宋体" w:hAnsi="Times New Roman"/>
-          <w:sz w:val="24"/>
-          <w:szCs w:val="24"/>
-        </w:rPr>
-        <w:t xml:space="preserve">系统应能快速响应用户请求。页面加载控制在3秒以内，文章列表分页查询不超过1秒，全文搜索不超过2秒。具体的优化手段包括：用EhCache缓存减少数据库查询、分页查询避免一次性加载过多数据、Hibernate Search索引加速搜索。Undertow服务器配了2个IO线程和32个工作线程处理并发。文件上传限制10MB，图片限制宽度800像素、大小2MB。</w:t>
-      </w:r>
-      <w:r>
-        <w:rPr>
-          <w:rFonts w:ascii="Times New Roman" w:eastAsia="宋体" w:hAnsi="Times New Roman"/>
-          <w:sz w:val="24"/>
-          <w:szCs w:val="24"/>
-          <w:vertAlign w:val="superscript"/>
-        </w:rPr>
-        <w:t xml:space="preserve">[7]</w:t>
-      </w:r>
-    </w:p>
-    <w:p>
-      <w:pPr>
-        <w:spacing w:after="0" w:before="240" w:line="288" w:lineRule="auto"/>
-      </w:pPr>
-      <w:r>
-        <w:rPr>
-          <w:rFonts w:ascii="Times New Roman" w:eastAsia="黑体" w:hAnsi="Times New Roman"/>
-          <w:sz w:val="28"/>
-          <w:szCs w:val="28"/>
-        </w:rPr>
-        <w:t xml:space="preserve">3.2.2 安全需求</w:t>
-      </w:r>
-    </w:p>
-    <w:p>
-      <w:pPr>
-        <w:spacing w:after="0" w:before="0" w:line="288" w:lineRule="auto"/>
-        <w:ind w:firstLine="480"/>
-      </w:pPr>
-      <w:r>
-        <w:rPr>
-          <w:rFonts w:ascii="Times New Roman" w:eastAsia="宋体" w:hAnsi="Times New Roman"/>
-          <w:sz w:val="24"/>
-          <w:szCs w:val="24"/>
-        </w:rPr>
-        <w:t xml:space="preserve">安全方面需要保证用户数据和系统稳定。密码用MD5加密存储，不存明文。后台路径由Shiro拦截器做RBAC权限控制，没授权的用户进不了管理功能。用户输入的HTML内容用Jsoup清洗，防XSS攻击。删文章时校验当前用户是不是作者，防越权删除。文件上传限制了类型和大小，防恶意文件。</w:t>
-      </w:r>
-    </w:p>
-    <w:p>
-      <w:pPr>
-        <w:spacing w:after="0" w:before="240" w:line="288" w:lineRule="auto"/>
-      </w:pPr>
-      <w:r>
-        <w:rPr>
-          <w:rFonts w:ascii="Times New Roman" w:eastAsia="黑体" w:hAnsi="Times New Roman"/>
-          <w:sz w:val="28"/>
-          <w:szCs w:val="28"/>
-        </w:rPr>
-        <w:t xml:space="preserve">3.2.3 可扩展性需求</w:t>
-      </w:r>
-    </w:p>
-    <w:p>
-      <w:pPr>
-        <w:spacing w:after="0" w:before="0" w:line="288" w:lineRule="auto"/>
-        <w:ind w:firstLine="480"/>
-      </w:pPr>
-      <w:r>
-        <w:rPr>
-          <w:rFonts w:ascii="Times New Roman" w:eastAsia="宋体" w:hAnsi="Times New Roman"/>
-          <w:sz w:val="24"/>
-          <w:szCs w:val="24"/>
-        </w:rPr>
-        <w:t xml:space="preserve">系统应支持功能模块的灵活扩展。Spring Boot的自动配置机制让新功能只需加依赖和配置就行。模板引擎支持加载外部模板文件，不用重新编译代码就能扩展页面。@PostStatusFilter注解和AOP切面让数据权限过滤可以灵活扩展。ApplicationContext发布PostUpdateEvent事件实现了解耦，要加新的文章更新后处理逻辑，写个事件监听器就够了。</w:t>
-      </w:r>
-    </w:p>
-    <w:p>
-      <w:pPr>
-        <w:spacing w:after="0" w:before="240" w:line="288" w:lineRule="auto"/>
-      </w:pPr>
-      <w:r>
-        <w:rPr>
-          <w:rFonts w:ascii="Times New Roman" w:eastAsia="黑体" w:hAnsi="Times New Roman"/>
-          <w:sz w:val="28"/>
-          <w:szCs w:val="28"/>
-        </w:rPr>
-        <w:t xml:space="preserve">3.2.4 可维护性需求</w:t>
-      </w:r>
-    </w:p>
-    <w:p>
-      <w:pPr>
-        <w:spacing w:after="0" w:before="0" w:line="288" w:lineRule="auto"/>
-        <w:ind w:firstLine="480"/>
-      </w:pPr>
-      <w:r>
-        <w:rPr>
-          <w:rFonts w:ascii="Times New Roman" w:eastAsia="宋体" w:hAnsi="Times New Roman"/>
-          <w:sz w:val="24"/>
-          <w:szCs w:val="24"/>
-        </w:rPr>
-        <w:t xml:space="preserve">代码要可读、好维护。MVC分层让各层职责清晰，耦合度低。Service层接口和实现分离，方便单测和替换。Lombok减少样板代码，Fastjson2做JSON序列化，Commonmark处理Markdown渲染。日志用Logback，支持不同环境的日志级别。ResourceLock工具类用ConcurrentHashMap和AtomicInteger做了细粒度资源锁，保证并发安全。</w:t>
-      </w:r>
-    </w:p>
-    <w:p>
-      <w:pPr>
-        <w:pageBreakBefore/>
-        <w:spacing w:after="480" w:before="480" w:line="288" w:lineRule="auto"/>
-        <w:jc w:val="center"/>
-      </w:pPr>
-      <w:r>
-        <w:rPr>
-          <w:rFonts w:ascii="Times New Roman" w:eastAsia="黑体" w:hAnsi="Times New Roman"/>
-          <w:sz w:val="36"/>
-          <w:szCs w:val="36"/>
-        </w:rPr>
-        <w:t xml:space="preserve">第4章 系统设计</w:t>
-      </w:r>
-    </w:p>
-    <w:p>
-      <w:pPr>
-        <w:spacing w:after="240" w:before="240" w:line="288" w:lineRule="auto"/>
-      </w:pPr>
-      <w:r>
-        <w:rPr>
-          <w:rFonts w:ascii="Times New Roman" w:eastAsia="黑体" w:hAnsi="Times New Roman"/>
-          <w:sz w:val="30"/>
-          <w:szCs w:val="30"/>
-        </w:rPr>
-        <w:t xml:space="preserve">4.1 设计原则</w:t>
-      </w:r>
-    </w:p>
-    <w:p>
-      <w:pPr>
-        <w:spacing w:after="0" w:before="0" w:line="288" w:lineRule="auto"/>
-        <w:ind w:firstLine="480"/>
-      </w:pPr>
-      <w:r>
-        <w:rPr>
-          <w:rFonts w:ascii="Times New Roman" w:eastAsia="宋体" w:hAnsi="Times New Roman"/>
-          <w:sz w:val="24"/>
-          <w:szCs w:val="24"/>
-        </w:rPr>
-        <w:t xml:space="preserve">系统设计主要遵循以下原则。</w:t>
-      </w:r>
-    </w:p>
-    <w:p>
-      <w:pPr>
-        <w:spacing w:after="0" w:before="0" w:line="288" w:lineRule="auto"/>
-        <w:ind w:firstLine="480"/>
-      </w:pPr>
-      <w:r>
-        <w:rPr>
-          <w:rFonts w:ascii="Times New Roman" w:eastAsia="宋体" w:hAnsi="Times New Roman"/>
-          <w:sz w:val="24"/>
-          <w:szCs w:val="24"/>
-        </w:rPr>
-        <w:t xml:space="preserve">第一是MVC架构模式，把数据模型、视图展示和业务控制分开，代码更好维护也更好测试。</w:t>
-      </w:r>
-      <w:r>
-        <w:rPr>
-          <w:rFonts w:ascii="Times New Roman" w:eastAsia="宋体" w:hAnsi="Times New Roman"/>
-          <w:sz w:val="24"/>
-          <w:szCs w:val="24"/>
-          <w:vertAlign w:val="superscript"/>
-        </w:rPr>
-        <w:t xml:space="preserve">[13]</w:t>
-      </w:r>
-      <w:r>
-        <w:rPr>
-          <w:rFonts w:ascii="Times New Roman" w:eastAsia="宋体" w:hAnsi="Times New Roman"/>
-          <w:sz w:val="24"/>
-          <w:szCs w:val="24"/>
-          <w:vertAlign w:val="superscript"/>
-        </w:rPr>
-        <w:t xml:space="preserve">[15]</w:t>
-      </w:r>
-    </w:p>
-    <w:p>
-      <w:pPr>
-        <w:spacing w:after="0" w:before="0" w:line="288" w:lineRule="auto"/>
-        <w:ind w:firstLine="480"/>
-      </w:pPr>
-      <w:r>
-        <w:rPr>
-          <w:rFonts w:ascii="Times New Roman" w:eastAsia="宋体" w:hAnsi="Times New Roman"/>
-          <w:sz w:val="24"/>
-          <w:szCs w:val="24"/>
-        </w:rPr>
-        <w:t xml:space="preserve">第二是分层设计，在MVC基础上进一步细分为实体层、数据访问层、业务逻辑层、控制层和视图层，各层通过接口交互，降低层间耦合。</w:t>
-      </w:r>
-    </w:p>
-    <w:p>
-      <w:pPr>
-        <w:spacing w:after="0" w:before="0" w:line="288" w:lineRule="auto"/>
-        <w:ind w:firstLine="480"/>
-      </w:pPr>
-      <w:r>
-        <w:rPr>
-          <w:rFonts w:ascii="Times New Roman" w:eastAsia="宋体" w:hAnsi="Times New Roman"/>
-          <w:sz w:val="24"/>
-          <w:szCs w:val="24"/>
-        </w:rPr>
-        <w:t xml:space="preserve">第三是单一职责，每个类只管一个功能领域——PostService只管文章，UserService只管用户，避免出现什么都管的"上帝类"。</w:t>
-      </w:r>
-    </w:p>
-    <w:p>
-      <w:pPr>
-        <w:spacing w:after="0" w:before="0" w:line="288" w:lineRule="auto"/>
-        <w:ind w:firstLine="480"/>
-      </w:pPr>
-      <w:r>
-        <w:rPr>
-          <w:rFonts w:ascii="Times New Roman" w:eastAsia="宋体" w:hAnsi="Times New Roman"/>
-          <w:sz w:val="24"/>
-          <w:szCs w:val="24"/>
-        </w:rPr>
-        <w:t xml:space="preserve">第四是开闭原则，通过接口和事件机制实现对扩展开放、对修改关闭。比如PostUpdateEvent事件让系统不改PostService代码就能加新的文章更新后处理逻辑。</w:t>
-      </w:r>
-    </w:p>
-    <w:p>
-      <w:pPr>
-        <w:spacing w:after="0" w:before="0" w:line="288" w:lineRule="auto"/>
-        <w:ind w:firstLine="480"/>
-      </w:pPr>
-      <w:r>
-        <w:rPr>
-          <w:rFonts w:ascii="Times New Roman" w:eastAsia="宋体" w:hAnsi="Times New Roman"/>
-          <w:sz w:val="24"/>
-          <w:szCs w:val="24"/>
-        </w:rPr>
-        <w:t xml:space="preserve">第五是安全优先，架构设计阶段就考虑了安全因素——Shiro做统一认证授权，Hibernate过滤器做数据权限控制，ResourceLock做并发资源锁管理。</w:t>
-      </w:r>
-    </w:p>
-    <w:p>
-      <w:pPr>
-        <w:spacing w:after="240" w:before="240" w:line="288" w:lineRule="auto"/>
-      </w:pPr>
-      <w:r>
-        <w:rPr>
-          <w:rFonts w:ascii="Times New Roman" w:eastAsia="黑体" w:hAnsi="Times New Roman"/>
-          <w:sz w:val="30"/>
-          <w:szCs w:val="30"/>
-        </w:rPr>
         <w:t xml:space="preserve">4.2 系统架构设计</w:t>
       </w:r>
     </w:p>
@@ -4013,20 +3752,6 @@
           <w:szCs w:val="24"/>
         </w:rPr>
         <w:t xml:space="preserve">安全层由Apache Shiro框架构成，包括AccountRealm、AuthenticatedFilter和ShiroConfiguration。通过URL过滤器链做访问控制，基于RBAC模型实现细粒度权限管理。</w:t>
-      </w:r>
-    </w:p>
-    <w:p>
-      <w:pPr>
-        <w:spacing w:after="0" w:before="0" w:line="288" w:lineRule="auto"/>
-        <w:ind w:firstLine="480"/>
-      </w:pPr>
-      <w:r>
-        <w:rPr>
-          <w:rFonts w:ascii="Times New Roman" w:eastAsia="宋体" w:hAnsi="Times New Roman"/>
-          <w:sz w:val="24"/>
-          <w:szCs w:val="24"/>
-        </w:rPr>
-        <w:t xml:space="preserve">搜索层由Hibernate Search和Lucene构成，注解方式建全文索引，数据写入时自动同步索引，SmartCnAnalysisConfigurer配置中文分词器。</w:t>
       </w:r>
     </w:p>
     <w:p>
@@ -4126,35 +3851,35 @@
           <w:sz w:val="24"/>
           <w:szCs w:val="24"/>
         </w:rPr>
-        <w:t xml:space="preserve">前台模块面向普通用户和访客，主要功能包括：首页文章列表展示、文章详情查看、频道文章浏览、标签文章浏览、全文搜索、用户主页、文章发布、评论互动和收藏管理。</w:t>
-      </w:r>
-    </w:p>
-    <w:p>
-      <w:pPr>
-        <w:spacing w:after="0" w:before="0" w:line="288" w:lineRule="auto"/>
-        <w:ind w:firstLine="480"/>
-      </w:pPr>
-      <w:r>
-        <w:rPr>
-          <w:rFonts w:ascii="Times New Roman" w:eastAsia="宋体" w:hAnsi="Times New Roman"/>
-          <w:sz w:val="24"/>
-          <w:szCs w:val="24"/>
-        </w:rPr>
-        <w:t xml:space="preserve">首页通过IndexController处理请求，支持按最新和最热两种排序方式浏览文章列表，并通过ContentsDirective模板指令渲染文章卡片。文章详情页展示文章全文、作者信息、评论列表和相关文章推荐。频道页面通过前台ChannelController处理，按频道分类展示文章。标签页面通过TagController处理，展示标签云和标签关联的文章。搜索功能由SearchController提供，调用PostSearchService进行全文搜索。</w:t>
-      </w:r>
-    </w:p>
-    <w:p>
-      <w:pPr>
-        <w:spacing w:after="0" w:before="0" w:line="288" w:lineRule="auto"/>
-        <w:ind w:firstLine="480"/>
-      </w:pPr>
-      <w:r>
-        <w:rPr>
-          <w:rFonts w:ascii="Times New Roman" w:eastAsia="宋体" w:hAnsi="Times New Roman"/>
-          <w:sz w:val="24"/>
-          <w:szCs w:val="24"/>
-        </w:rPr>
-        <w:t xml:space="preserve">用户个人中心包括个人信息编辑、头像上传、密码修改、我的文章、我的收藏和消息通知等功能模块。文章发布页面集成Markdown编辑器（CodeMirror），支持实时预览、图片上传和标签输入。RegisterController处理用户注册，注册成功后自动登录。</w:t>
+        <w:t xml:space="preserve">前台模块面向普通用户和访客，主要功能包括：首页文章列表展示、文章详情查看、频道文章浏览、标签文章浏览、用户主页、文章发布和评论互动。</w:t>
+      </w:r>
+    </w:p>
+    <w:p>
+      <w:pPr>
+        <w:spacing w:after="0" w:before="0" w:line="288" w:lineRule="auto"/>
+        <w:ind w:firstLine="480"/>
+      </w:pPr>
+      <w:r>
+        <w:rPr>
+          <w:rFonts w:ascii="Times New Roman" w:eastAsia="宋体" w:hAnsi="Times New Roman"/>
+          <w:sz w:val="24"/>
+          <w:szCs w:val="24"/>
+        </w:rPr>
+        <w:t xml:space="preserve">首页通过IndexController处理请求，支持按最新和最热两种排序方式浏览文章列表，并通过ContentsDirective模板指令渲染文章卡片。文章详情页展示文章全文、作者信息和评论列表。频道页面通过前台ChannelController处理，按频道分类展示文章。标签页面通过TagController处理，展示标签云和标签关联的文章。</w:t>
+      </w:r>
+    </w:p>
+    <w:p>
+      <w:pPr>
+        <w:spacing w:after="0" w:before="0" w:line="288" w:lineRule="auto"/>
+        <w:ind w:firstLine="480"/>
+      </w:pPr>
+      <w:r>
+        <w:rPr>
+          <w:rFonts w:ascii="Times New Roman" w:eastAsia="宋体" w:hAnsi="Times New Roman"/>
+          <w:sz w:val="24"/>
+          <w:szCs w:val="24"/>
+        </w:rPr>
+        <w:t xml:space="preserve">用户个人中心包括个人信息编辑、头像上传、密码修改和我的文章等功能模块。文章发布页面集成Markdown编辑器（CodeMirror），支持实时预览、图片上传和标签输入。RegisterController处理用户注册，注册成功后自动登录。</w:t>
       </w:r>
     </w:p>
     <w:p>
@@ -4325,7 +4050,7 @@
           <w:sz w:val="24"/>
           <w:szCs w:val="24"/>
         </w:rPr>
-        <w:t xml:space="preserve">（6）OptionsController：系统配置控制器，提供网站参数修改（update接口）、系统变量刷新（reload_options接口）和全文索引重建（reset_indexes接口）功能。</w:t>
+        <w:t xml:space="preserve">（6）OptionsController：系统配置控制器，提供网站参数修改（update接口）和系统变量刷新（reload_options接口）功能。</w:t>
       </w:r>
     </w:p>
     <w:p>
@@ -4412,16 +4137,7 @@
           <w:sz w:val="24"/>
           <w:szCs w:val="24"/>
         </w:rPr>
-        <w:t xml:space="preserve">系统数据库采用MySQL，数据库名为db_mblog。数据库设计遵循关系型数据库的规范化原则。schema.sql中预定义了系统初始化所需的数据表，其余业务表通过JPA实体类自动建表生成。</w:t>
-      </w:r>
-      <w:r>
-        <w:rPr>
-          <w:rFonts w:ascii="Times New Roman" w:eastAsia="宋体" w:hAnsi="Times New Roman"/>
-          <w:sz w:val="24"/>
-          <w:szCs w:val="24"/>
-          <w:vertAlign w:val="superscript"/>
-        </w:rPr>
-        <w:t xml:space="preserve">[8]</w:t>
+        <w:t xml:space="preserve">系统数据库采用MySQL，数据库名为db_mblog。数据库设计遵循关系型数据库的规范化原则。所有数据表通过JPA实体类的ddl-auto: update配置自动创建。</w:t>
       </w:r>
     </w:p>
     <w:p>
@@ -4434,21 +4150,21 @@
           <w:sz w:val="28"/>
           <w:szCs w:val="28"/>
         </w:rPr>
-        <w:t xml:space="preserve">4.4.1 schema.sql定义的数据表</w:t>
-      </w:r>
-    </w:p>
-    <w:p>
-      <w:pPr>
-        <w:spacing w:after="0" w:before="0" w:line="288" w:lineRule="auto"/>
-        <w:ind w:firstLine="480"/>
-      </w:pPr>
-      <w:r>
-        <w:rPr>
-          <w:rFonts w:ascii="Times New Roman" w:eastAsia="宋体" w:hAnsi="Times New Roman"/>
-          <w:sz w:val="24"/>
-          <w:szCs w:val="24"/>
-        </w:rPr>
-        <w:t xml:space="preserve">schema.sql中定义了以下数据表：</w:t>
+        <w:t xml:space="preserve">4.4.1 系统预置数据表</w:t>
+      </w:r>
+    </w:p>
+    <w:p>
+      <w:pPr>
+        <w:spacing w:after="0" w:before="0" w:line="288" w:lineRule="auto"/>
+        <w:ind w:firstLine="480"/>
+      </w:pPr>
+      <w:r>
+        <w:rPr>
+          <w:rFonts w:ascii="Times New Roman" w:eastAsia="宋体" w:hAnsi="Times New Roman"/>
+          <w:sz w:val="24"/>
+          <w:szCs w:val="24"/>
+        </w:rPr>
+        <w:t xml:space="preserve">系统通过JPA实体类自动创建以下预置数据表：</w:t>
       </w:r>
     </w:p>
     <w:p>
@@ -4981,110 +4697,6 @@
                 <w:sz w:val="18"/>
                 <w:szCs w:val="18"/>
               </w:rPr>
-              <w:t xml:space="preserve">mto_user_oauth</w:t>
-            </w:r>
-          </w:p>
-        </w:tc>
-        <w:tc>
-          <w:tcPr>
-            <w:tcW w:type="dxa" w:w="2800"/>
-            <w:tcBorders>
-              <w:top w:val="single" w:color="000000" w:sz="1"/>
-              <w:left w:val="single" w:color="000000" w:sz="1"/>
-              <w:bottom w:val="single" w:color="000000" w:sz="1"/>
-              <w:right w:val="single" w:color="000000" w:sz="1"/>
-            </w:tcBorders>
-            <w:tcMar>
-              <w:top w:type="dxa" w:w="40"/>
-              <w:left w:type="dxa" w:w="80"/>
-              <w:bottom w:type="dxa" w:w="40"/>
-              <w:right w:type="dxa" w:w="80"/>
-            </w:tcMar>
-            <w:vAlign w:val="center"/>
-          </w:tcPr>
-          <w:p>
-            <w:pPr>
-              <w:spacing w:after="0" w:before="0" w:line="240" w:lineRule="auto"/>
-              <w:jc w:val="center"/>
-            </w:pPr>
-            <w:r>
-              <w:rPr>
-                <w:rFonts w:ascii="Times New Roman" w:eastAsia="宋体" w:hAnsi="Times New Roman"/>
-                <w:b w:val="false"/>
-                <w:bCs w:val="false"/>
-                <w:sz w:val="18"/>
-                <w:szCs w:val="18"/>
-              </w:rPr>
-              <w:t xml:space="preserve">OAuth关联表</w:t>
-            </w:r>
-          </w:p>
-        </w:tc>
-        <w:tc>
-          <w:tcPr>
-            <w:tcW w:type="dxa" w:w="4200"/>
-            <w:tcBorders>
-              <w:top w:val="single" w:color="000000" w:sz="1"/>
-              <w:left w:val="single" w:color="000000" w:sz="1"/>
-              <w:bottom w:val="single" w:color="000000" w:sz="1"/>
-              <w:right w:val="single" w:color="000000" w:sz="1"/>
-            </w:tcBorders>
-            <w:tcMar>
-              <w:top w:type="dxa" w:w="40"/>
-              <w:left w:type="dxa" w:w="80"/>
-              <w:bottom w:type="dxa" w:w="40"/>
-              <w:right w:type="dxa" w:w="80"/>
-            </w:tcMar>
-            <w:vAlign w:val="center"/>
-          </w:tcPr>
-          <w:p>
-            <w:pPr>
-              <w:spacing w:after="0" w:before="0" w:line="240" w:lineRule="auto"/>
-              <w:jc w:val="center"/>
-            </w:pPr>
-            <w:r>
-              <w:rPr>
-                <w:rFonts w:ascii="Times New Roman" w:eastAsia="宋体" w:hAnsi="Times New Roman"/>
-                <w:b w:val="false"/>
-                <w:bCs w:val="false"/>
-                <w:sz w:val="18"/>
-                <w:szCs w:val="18"/>
-              </w:rPr>
-              <w:t xml:space="preserve">id, user_id, access_token, oauth_code, oauth_type</w:t>
-            </w:r>
-          </w:p>
-        </w:tc>
-      </w:tr>
-      <w:tr>
-        <w:tc>
-          <w:tcPr>
-            <w:tcW w:type="dxa" w:w="2000"/>
-            <w:tcBorders>
-              <w:top w:val="single" w:color="000000" w:sz="1"/>
-              <w:left w:val="single" w:color="000000" w:sz="1"/>
-              <w:bottom w:val="single" w:color="000000" w:sz="1"/>
-              <w:right w:val="single" w:color="000000" w:sz="1"/>
-            </w:tcBorders>
-            <w:tcMar>
-              <w:top w:type="dxa" w:w="40"/>
-              <w:left w:type="dxa" w:w="80"/>
-              <w:bottom w:type="dxa" w:w="40"/>
-              <w:right w:type="dxa" w:w="80"/>
-            </w:tcMar>
-            <w:vAlign w:val="center"/>
-          </w:tcPr>
-          <w:p>
-            <w:pPr>
-              <w:spacing w:after="0" w:before="0" w:line="240" w:lineRule="auto"/>
-              <w:jc w:val="center"/>
-            </w:pPr>
-            <w:r>
-              <w:rPr>
-                <w:rFonts w:ascii="Times New Roman" w:eastAsia="宋体" w:hAnsi="Times New Roman"/>
-                <w:b w:val="false"/>
-                <w:bCs w:val="false"/>
-                <w:sz w:val="18"/>
-                <w:szCs w:val="18"/>
-              </w:rPr>
               <w:t xml:space="preserve">shiro_permission</w:t>
             </w:r>
           </w:p>
@@ -5582,21 +5194,21 @@
           <w:sz w:val="24"/>
           <w:szCs w:val="24"/>
         </w:rPr>
-        <w:t xml:space="preserve">除schema.sql定义的表外，系统通过JPA实体类的ddl-auto配置自动创建以下业务表：</w:t>
-      </w:r>
-    </w:p>
-    <w:p>
-      <w:pPr>
-        <w:spacing w:after="0" w:before="0" w:line="288" w:lineRule="auto"/>
-        <w:ind w:firstLine="480"/>
-      </w:pPr>
-      <w:r>
-        <w:rPr>
-          <w:rFonts w:ascii="Times New Roman" w:eastAsia="宋体" w:hAnsi="Times New Roman"/>
-          <w:sz w:val="24"/>
-          <w:szCs w:val="24"/>
-        </w:rPr>
-        <w:t xml:space="preserve">mto_post（文章表）存储文章基本信息，包括标题、摘要、缩略图、标签、作者ID、频道ID、创建时间、收藏数、评论数、浏览量、状态、置顶和推荐字段。mto_post_attribute（文章内容表）存储文章正文和编辑器类型，与文章表一对一关联。mto_comment（评论表）通过pid字段实现多级评论。mto_tag（标签表）和mto_post_tag（文章标签关联表）实现多对多关系。mto_favorite（收藏表）记录用户收藏记录。mto_message（消息表）存储系统通知。mto_resource（资源表）和mto_post_resource（文章资源关联表）管理图片资源引用计数。</w:t>
+        <w:t xml:space="preserve">系统通过JPA实体类的ddl-auto: update配置自动创建以下业务表：</w:t>
+      </w:r>
+    </w:p>
+    <w:p>
+      <w:pPr>
+        <w:spacing w:after="0" w:before="0" w:line="288" w:lineRule="auto"/>
+        <w:ind w:firstLine="480"/>
+      </w:pPr>
+      <w:r>
+        <w:rPr>
+          <w:rFonts w:ascii="Times New Roman" w:eastAsia="宋体" w:hAnsi="Times New Roman"/>
+          <w:sz w:val="24"/>
+          <w:szCs w:val="24"/>
+        </w:rPr>
+        <w:t xml:space="preserve">mto_post（文章表）存储文章基本信息，包括标题、摘要、缩略图、标签、作者ID、频道ID、创建时间、评论数、浏览量和状态字段。mto_post_attribute（文章内容表）存储文章正文和编辑器类型，与文章表一对一关联。mto_comment（评论表）通过pid字段实现多级评论。mto_tag（标签表）和mto_post_tag（文章标签关联表）实现多对多关系。mto_resource（资源表）和mto_post_resource（文章资源关联表）管理图片资源引用计数。</w:t>
       </w:r>
     </w:p>
     <w:p>
@@ -5694,24 +5306,6 @@
           <w:szCs w:val="24"/>
         </w:rPr>
         <w:t xml:space="preserve">密码采用MD5加密存储，避免明文泄露风险。用户名唯一性通过数据库层面的UK_USERNAME唯一索引和应用层面的双重校验保证。</w:t>
-      </w:r>
-      <w:r>
-        <w:rPr>
-          <w:rFonts w:ascii="Times New Roman" w:eastAsia="宋体" w:hAnsi="Times New Roman"/>
-          <w:sz w:val="24"/>
-          <w:szCs w:val="24"/>
-          <w:vertAlign w:val="superscript"/>
-        </w:rPr>
-        <w:t xml:space="preserve">[5]</w:t>
-      </w:r>
-      <w:r>
-        <w:rPr>
-          <w:rFonts w:ascii="Times New Roman" w:eastAsia="宋体" w:hAnsi="Times New Roman"/>
-          <w:sz w:val="24"/>
-          <w:szCs w:val="24"/>
-          <w:vertAlign w:val="superscript"/>
-        </w:rPr>
-        <w:t xml:space="preserve">[10]</w:t>
       </w:r>
     </w:p>
     <w:p>
@@ -6035,7 +5629,7 @@
           <w:sz w:val="24"/>
           <w:szCs w:val="24"/>
         </w:rPr>
-        <w:t xml:space="preserve">信息查询功能主要指全文搜索功能，是博客系统提升内容检索效率的关键能力。</w:t>
+        <w:t xml:space="preserve">信息查询功能主要指文章列表查询，是博客系统内容浏览的核心能力。</w:t>
       </w:r>
     </w:p>
     <w:p>
@@ -6048,49 +5642,103 @@
           <w:sz w:val="28"/>
           <w:szCs w:val="28"/>
         </w:rPr>
-        <w:t xml:space="preserve">5.3.1 全文搜索实现</w:t>
-      </w:r>
-    </w:p>
-    <w:p>
-      <w:pPr>
-        <w:spacing w:after="0" w:before="0" w:line="288" w:lineRule="auto"/>
-        <w:ind w:firstLine="480"/>
-      </w:pPr>
-      <w:r>
-        <w:rPr>
-          <w:rFonts w:ascii="Times New Roman" w:eastAsia="宋体" w:hAnsi="Times New Roman"/>
-          <w:sz w:val="24"/>
-          <w:szCs w:val="24"/>
-        </w:rPr>
-        <w:t xml:space="preserve">全文搜索功能由SearchController、PostSearchService和PostSearchServiceImpl实现。用户通过搜索框输入关键词，SearchController接收请求并调用PostSearchServiceImpl.search()方法进行全文检索。</w:t>
-      </w:r>
-    </w:p>
-    <w:p>
-      <w:pPr>
-        <w:spacing w:after="0" w:before="0" w:line="288" w:lineRule="auto"/>
-        <w:ind w:firstLine="480"/>
-      </w:pPr>
-      <w:r>
-        <w:rPr>
-          <w:rFonts w:ascii="Times New Roman" w:eastAsia="宋体" w:hAnsi="Times New Roman"/>
-          <w:sz w:val="24"/>
-          <w:szCs w:val="24"/>
-        </w:rPr>
-        <w:t xml:space="preserve">PostSearchServiceImpl.search()方法的实现逻辑为：首先通过Search.session(entityManager)获取Hibernate Search的SearchSession，然后构建布尔查询，通过f.match().fields("title", "summary", "tags").matching(term).fuzzy(1)对标题、摘要和标签三个字段进行模糊匹配，fuzzy(1)参数允许1个编辑距离的模糊匹配。查询通过fetch()方法分页获取结果，返回SearchResult对象包含命中结果列表和总命中数。最后将Post实体列表转换为PostVO列表，并批量加载作者信息。</w:t>
-      </w:r>
-    </w:p>
-    <w:p>
-      <w:pPr>
-        <w:spacing w:after="0" w:before="0" w:line="288" w:lineRule="auto"/>
-        <w:ind w:firstLine="480"/>
-      </w:pPr>
-      <w:r>
-        <w:rPr>
-          <w:rFonts w:ascii="Times New Roman" w:eastAsia="宋体" w:hAnsi="Times New Roman"/>
-          <w:sz w:val="24"/>
-          <w:szCs w:val="24"/>
-        </w:rPr>
-        <w:t xml:space="preserve">中文分词由SmartCnAnalysisConfigurer配置类完成，它注册了Lucene的SmartCN中文分词器，使Hibernate Search能够正确处理中文内容的分词。当文章发布或更新时，Hibernate Search自动同步更新Lucene索引，保证搜索结果的实时性。管理员可通过OptionsController的reset_indexes接口调用PostSearchService.resetIndexes()方法，通过massIndexer重建全部索引。</w:t>
+        <w:t xml:space="preserve">5.3.1 文章列表查询实现</w:t>
+      </w:r>
+    </w:p>
+    <w:p>
+      <w:pPr>
+        <w:spacing w:after="0" w:before="0" w:line="288" w:lineRule="auto"/>
+        <w:ind w:firstLine="480"/>
+      </w:pPr>
+      <w:r>
+        <w:rPr>
+          <w:rFonts w:ascii="Times New Roman" w:eastAsia="宋体" w:hAnsi="Times New Roman"/>
+          <w:sz w:val="24"/>
+          <w:szCs w:val="24"/>
+        </w:rPr>
+        <w:t xml:space="preserve">后台文章列表查询通过PostServiceImpl.paging4Admin()方法实现，该方法与前台paging()方法类似，但支持按标题模糊搜索（builder.like(root.get("title"), "%" + title + "%")），且不标注@PostStatusFilter注解，可查看所有状态的文章。前台文章列表查询通过paging()方法实现，支持频道筛选和频道排除，通过@PostStatusFilter注解自动过滤未发布状态的文章。</w:t>
+      </w:r>
+    </w:p>
+    <w:p>
+      <w:pPr>
+        <w:spacing w:after="240" w:before="240" w:line="288" w:lineRule="auto"/>
+      </w:pPr>
+      <w:r>
+        <w:rPr>
+          <w:rFonts w:ascii="Times New Roman" w:eastAsia="黑体" w:hAnsi="Times New Roman"/>
+          <w:sz w:val="30"/>
+          <w:szCs w:val="30"/>
+        </w:rPr>
+        <w:t xml:space="preserve">5.4 信息改动</w:t>
+      </w:r>
+    </w:p>
+    <w:p>
+      <w:pPr>
+        <w:spacing w:after="0" w:before="0" w:line="288" w:lineRule="auto"/>
+        <w:ind w:firstLine="480"/>
+      </w:pPr>
+      <w:r>
+        <w:rPr>
+          <w:rFonts w:ascii="Times New Roman" w:eastAsia="宋体" w:hAnsi="Times New Roman"/>
+          <w:sz w:val="24"/>
+          <w:szCs w:val="24"/>
+        </w:rPr>
+        <w:t xml:space="preserve">信息改动功能涵盖文章发布、编辑、删除及后台各项管理操作，是博客系统内容管理的核心能力。</w:t>
+      </w:r>
+    </w:p>
+    <w:p>
+      <w:pPr>
+        <w:spacing w:after="0" w:before="240" w:line="288" w:lineRule="auto"/>
+      </w:pPr>
+      <w:r>
+        <w:rPr>
+          <w:rFonts w:ascii="Times New Roman" w:eastAsia="黑体" w:hAnsi="Times New Roman"/>
+          <w:sz w:val="28"/>
+          <w:szCs w:val="28"/>
+        </w:rPr>
+        <w:t xml:space="preserve">5.4.1 文章发布实现</w:t>
+      </w:r>
+    </w:p>
+    <w:p>
+      <w:pPr>
+        <w:spacing w:after="0" w:before="0" w:line="288" w:lineRule="auto"/>
+        <w:ind w:firstLine="480"/>
+      </w:pPr>
+      <w:r>
+        <w:rPr>
+          <w:rFonts w:ascii="Times New Roman" w:eastAsia="宋体" w:hAnsi="Times New Roman"/>
+          <w:sz w:val="24"/>
+          <w:szCs w:val="24"/>
+        </w:rPr>
+        <w:t xml:space="preserve">文章发布功能由后台PostController的update接口和PostServiceImpl.post()方法实现。当文章ID为0时，PostController判定为新增操作，从当前登录用户获取作者ID后调用PostServiceImpl.post()方法。</w:t>
+      </w:r>
+    </w:p>
+    <w:p>
+      <w:pPr>
+        <w:spacing w:after="0" w:before="0" w:line="288" w:lineRule="auto"/>
+        <w:ind w:firstLine="480"/>
+      </w:pPr>
+      <w:r>
+        <w:rPr>
+          <w:rFonts w:ascii="Times New Roman" w:eastAsia="宋体" w:hAnsi="Times New Roman"/>
+          <w:sz w:val="24"/>
+          <w:szCs w:val="24"/>
+        </w:rPr>
+        <w:t xml:space="preserve">post()方法的实现逻辑为：首先通过BeanUtils.copyProperties()将PostVO属性拷贝至Post实体，设置创建时间和状态，然后处理摘要——当摘要为空时调用trimSummary()方法，该方法根据编辑器类型判断，若为Markdown编辑器则先通过MarkdownUtils.renderMarkdown()渲染Markdown文本再通过PreviewTextUtils.getText()截取前126个字符，否则直接截取126个字符。保存文章后调用tagService.batchUpdate()批量更新标签关联。</w:t>
+      </w:r>
+    </w:p>
+    <w:p>
+      <w:pPr>
+        <w:spacing w:after="0" w:before="0" w:line="288" w:lineRule="auto"/>
+        <w:ind w:firstLine="480"/>
+      </w:pPr>
+      <w:r>
+        <w:rPr>
+          <w:rFonts w:ascii="Times New Roman" w:eastAsia="宋体" w:hAnsi="Times New Roman"/>
+          <w:sz w:val="24"/>
+          <w:szCs w:val="24"/>
+        </w:rPr>
+        <w:t xml:space="preserve">接着通过ResourceLock获取文章级别的资源锁，在synchronized同步块中保存PostAttribute文章属性（正文内容），调用countResource()方法统计图片资源引用计数，最后通过applicationContext.publishEvent()发布PostUpdateEvent事件（ACTION_PUBLISH），触发文章统计更新。同步块结束后通过ResourceLock.giveUpAtomicInteger()释放资源锁。</w:t>
       </w:r>
     </w:p>
     <w:p>
@@ -6101,9 +5749,9 @@
       <w:r>
         <w:drawing>
           <wp:inline distT="0" distB="0" distL="0" distR="0">
-            <wp:extent cx="2857500" cy="4286250"/>
+            <wp:extent cx="2857500" cy="5143500"/>
             <wp:effectExtent t="0" r="0" b="0" l="0"/>
-            <wp:docPr id="1" name="fig4-8-search-flow.png" descr="图4-8 全文搜索流程图" title="图4-8 全文搜索流程图"/>
+            <wp:docPr id="1" name="fig4-6-post-publish-flow.png" descr="图4-6 文章发布流程图" title="图4-6 文章发布流程图"/>
             <wp:cNvGraphicFramePr>
               <a:graphicFrameLocks xmlns:a="http://schemas.openxmlformats.org/drawingml/2006/main" noChangeAspect="1"/>
             </wp:cNvGraphicFramePr>
@@ -6126,7 +5774,7 @@
                   <pic:spPr bwMode="auto">
                     <a:xfrm>
                       <a:off x="0" y="0"/>
-                      <a:ext cx="2857500" cy="4286250"/>
+                      <a:ext cx="2857500" cy="5143500"/>
                     </a:xfrm>
                     <a:prstGeom prst="rect">
                       <a:avLst/>
@@ -6150,7 +5798,7 @@
           <w:sz w:val="21"/>
           <w:szCs w:val="21"/>
         </w:rPr>
-        <w:t xml:space="preserve">图4-8 全文搜索流程图</w:t>
+        <w:t xml:space="preserve">图4-6 文章发布流程图</w:t>
       </w:r>
     </w:p>
     <w:p>
@@ -6163,48 +5811,35 @@
           <w:sz w:val="28"/>
           <w:szCs w:val="28"/>
         </w:rPr>
-        <w:t xml:space="preserve">5.3.2 文章列表查询实现</w:t>
-      </w:r>
-    </w:p>
-    <w:p>
-      <w:pPr>
-        <w:spacing w:after="0" w:before="0" w:line="288" w:lineRule="auto"/>
-        <w:ind w:firstLine="480"/>
-      </w:pPr>
-      <w:r>
-        <w:rPr>
-          <w:rFonts w:ascii="Times New Roman" w:eastAsia="宋体" w:hAnsi="Times New Roman"/>
-          <w:sz w:val="24"/>
-          <w:szCs w:val="24"/>
-        </w:rPr>
-        <w:t xml:space="preserve">后台文章列表查询通过PostServiceImpl.paging4Admin()方法实现，该方法与前台paging()方法类似，但支持按标题模糊搜索（builder.like(root.get("title"), "%" + title + "%")），且不标注@PostStatusFilter注解，可查看所有状态的文章。前台文章列表查询通过paging()方法实现，支持频道筛选和频道排除，通过@PostStatusFilter注解自动过滤未发布状态的文章。</w:t>
-      </w:r>
-    </w:p>
-    <w:p>
-      <w:pPr>
-        <w:spacing w:after="240" w:before="240" w:line="288" w:lineRule="auto"/>
-      </w:pPr>
-      <w:r>
-        <w:rPr>
-          <w:rFonts w:ascii="Times New Roman" w:eastAsia="黑体" w:hAnsi="Times New Roman"/>
-          <w:sz w:val="30"/>
-          <w:szCs w:val="30"/>
-        </w:rPr>
-        <w:t xml:space="preserve">5.4 信息改动</w:t>
-      </w:r>
-    </w:p>
-    <w:p>
-      <w:pPr>
-        <w:spacing w:after="0" w:before="0" w:line="288" w:lineRule="auto"/>
-        <w:ind w:firstLine="480"/>
-      </w:pPr>
-      <w:r>
-        <w:rPr>
-          <w:rFonts w:ascii="Times New Roman" w:eastAsia="宋体" w:hAnsi="Times New Roman"/>
-          <w:sz w:val="24"/>
-          <w:szCs w:val="24"/>
-        </w:rPr>
-        <w:t xml:space="preserve">信息改动功能涵盖文章发布、编辑、删除及后台各项管理操作，是博客系统内容管理的核心能力。</w:t>
+        <w:t xml:space="preserve">5.4.2 文章编辑与删除实现</w:t>
+      </w:r>
+    </w:p>
+    <w:p>
+      <w:pPr>
+        <w:spacing w:after="0" w:before="0" w:line="288" w:lineRule="auto"/>
+        <w:ind w:firstLine="480"/>
+      </w:pPr>
+      <w:r>
+        <w:rPr>
+          <w:rFonts w:ascii="Times New Roman" w:eastAsia="宋体" w:hAnsi="Times New Roman"/>
+          <w:sz w:val="24"/>
+          <w:szCs w:val="24"/>
+        </w:rPr>
+        <w:t xml:space="preserve">文章编辑通过PostServiceImpl.update()方法实现。该方法首先通过findById()查找文章，然后通过ResourceLock获取资源锁，在synchronized同步块中更新文章标题、频道、缩略图、状态、摘要和标签，保存PostAttribute文章属性，调用tagService.batchUpdate()更新标签关联，并通过countResource()对比新旧内容增减图片资源引用计数。</w:t>
+      </w:r>
+    </w:p>
+    <w:p>
+      <w:pPr>
+        <w:spacing w:after="0" w:before="0" w:line="288" w:lineRule="auto"/>
+        <w:ind w:firstLine="480"/>
+      </w:pPr>
+      <w:r>
+        <w:rPr>
+          <w:rFonts w:ascii="Times New Roman" w:eastAsia="宋体" w:hAnsi="Times New Roman"/>
+          <w:sz w:val="24"/>
+          <w:szCs w:val="24"/>
+        </w:rPr>
+        <w:t xml:space="preserve">文章删除通过PostServiceImpl.delete()方法实现。该方法首先通过findById()查找文章，通过Assert.isTrue(po.getAuthorId() == authorId, "认证失败")校验当前用户是否为文章作者，然后通过ResourceLock获取资源锁，在synchronized同步块中删除文章实体和文章属性，调用cleanResource()清理图片资源引用计数，最后发布PostUpdateEvent事件（ACTION_DELETE）。批量删除通过delete(Collection&lt;Long&gt; ids)方法实现，遍历ID列表逐个执行删除逻辑。</w:t>
       </w:r>
     </w:p>
     <w:p>
@@ -6217,58 +5852,21 @@
           <w:sz w:val="28"/>
           <w:szCs w:val="28"/>
         </w:rPr>
-        <w:t xml:space="preserve">5.4.1 文章发布实现</w:t>
-      </w:r>
-    </w:p>
-    <w:p>
-      <w:pPr>
-        <w:spacing w:after="0" w:before="0" w:line="288" w:lineRule="auto"/>
-        <w:ind w:firstLine="480"/>
-      </w:pPr>
-      <w:r>
-        <w:rPr>
-          <w:rFonts w:ascii="Times New Roman" w:eastAsia="宋体" w:hAnsi="Times New Roman"/>
-          <w:sz w:val="24"/>
-          <w:szCs w:val="24"/>
-        </w:rPr>
-        <w:t xml:space="preserve">文章发布功能由后台PostController的update接口和PostServiceImpl.post()方法实现。当文章ID为0时，PostController判定为新增操作，从当前登录用户获取作者ID后调用PostServiceImpl.post()方法。</w:t>
-      </w:r>
-    </w:p>
-    <w:p>
-      <w:pPr>
-        <w:spacing w:after="0" w:before="0" w:line="288" w:lineRule="auto"/>
-        <w:ind w:firstLine="480"/>
-      </w:pPr>
-      <w:r>
-        <w:rPr>
-          <w:rFonts w:ascii="Times New Roman" w:eastAsia="宋体" w:hAnsi="Times New Roman"/>
-          <w:sz w:val="24"/>
-          <w:szCs w:val="24"/>
-        </w:rPr>
-        <w:t xml:space="preserve">post()方法的实现逻辑为：首先通过BeanUtils.copyProperties()将PostVO属性拷贝至Post实体，设置创建时间和状态，然后处理摘要——当摘要为空时调用trimSummary()方法，该方法根据编辑器类型判断，若为Markdown编辑器则先通过MarkdownUtils.renderMarkdown()渲染Markdown文本再通过PreviewTextUtils.getText()截取前126个字符，否则直接截取126个字符。保存文章后调用tagService.batchUpdate()批量更新标签关联。</w:t>
-      </w:r>
-    </w:p>
-    <w:p>
-      <w:pPr>
-        <w:spacing w:after="0" w:before="0" w:line="288" w:lineRule="auto"/>
-        <w:ind w:firstLine="480"/>
-      </w:pPr>
-      <w:r>
-        <w:rPr>
-          <w:rFonts w:ascii="Times New Roman" w:eastAsia="宋体" w:hAnsi="Times New Roman"/>
-          <w:sz w:val="24"/>
-          <w:szCs w:val="24"/>
-        </w:rPr>
-        <w:t xml:space="preserve">接着通过ResourceLock获取文章级别的资源锁，在synchronized同步块中保存PostAttribute文章属性（正文内容），调用countResource()方法统计图片资源引用计数，最后通过applicationContext.publishEvent()发布PostUpdateEvent事件（ACTION_PUBLISH），触发文章统计更新和消息通知。同步块结束后通过ResourceLock.giveUpAtomicInteger()释放资源锁。</w:t>
-      </w:r>
-      <w:r>
-        <w:rPr>
-          <w:rFonts w:ascii="Times New Roman" w:eastAsia="宋体" w:hAnsi="Times New Roman"/>
-          <w:sz w:val="24"/>
-          <w:szCs w:val="24"/>
-          <w:vertAlign w:val="superscript"/>
-        </w:rPr>
-        <w:t xml:space="preserve">[14]</w:t>
+        <w:t xml:space="preserve">5.4.3 ResourceLock资源锁机制</w:t>
+      </w:r>
+    </w:p>
+    <w:p>
+      <w:pPr>
+        <w:spacing w:after="0" w:before="0" w:line="288" w:lineRule="auto"/>
+        <w:ind w:firstLine="480"/>
+      </w:pPr>
+      <w:r>
+        <w:rPr>
+          <w:rFonts w:ascii="Times New Roman" w:eastAsia="宋体" w:hAnsi="Times New Roman"/>
+          <w:sz w:val="24"/>
+          <w:szCs w:val="24"/>
+        </w:rPr>
+        <w:t xml:space="preserve">ResourceLock是系统自实现的细粒度资源锁工具类，基于ConcurrentHashMap和AtomicInteger实现。getPostKey()方法根据文章ID生成锁键（POST_OPERATE_{postId}），getAtomicInteger()方法获取或创建对应的AtomicInteger并递增引用计数，giveUpAtomicInteger()方法递减引用计数并在计数归零时移除锁对象。这种设计避免了使用全局锁导致的性能瓶颈，实现了文章级别的并发控制，保证了文章发布、编辑和删除操作在并发场景下的数据一致性。</w:t>
       </w:r>
     </w:p>
     <w:p>
@@ -6279,9 +5877,9 @@
       <w:r>
         <w:drawing>
           <wp:inline distT="0" distB="0" distL="0" distR="0">
-            <wp:extent cx="2857500" cy="5143500"/>
+            <wp:extent cx="2857500" cy="4857750"/>
             <wp:effectExtent t="0" r="0" b="0" l="0"/>
-            <wp:docPr id="1" name="fig4-6-post-publish-flow.png" descr="图4-6 文章发布流程图" title="图4-6 文章发布流程图"/>
+            <wp:docPr id="1" name="fig4-7-post-delete-flow.png" descr="图4-7 文章删除流程图" title="图4-7 文章删除流程图"/>
             <wp:cNvGraphicFramePr>
               <a:graphicFrameLocks xmlns:a="http://schemas.openxmlformats.org/drawingml/2006/main" noChangeAspect="1"/>
             </wp:cNvGraphicFramePr>
@@ -6304,134 +5902,6 @@
                   <pic:spPr bwMode="auto">
                     <a:xfrm>
                       <a:off x="0" y="0"/>
-                      <a:ext cx="2857500" cy="5143500"/>
-                    </a:xfrm>
-                    <a:prstGeom prst="rect">
-                      <a:avLst/>
-                    </a:prstGeom>
-                  </pic:spPr>
-                </pic:pic>
-              </a:graphicData>
-            </a:graphic>
-          </wp:inline>
-        </w:drawing>
-      </w:r>
-    </w:p>
-    <w:p>
-      <w:pPr>
-        <w:spacing w:after="120" w:before="0"/>
-        <w:jc w:val="center"/>
-      </w:pPr>
-      <w:r>
-        <w:rPr>
-          <w:rFonts w:ascii="Times New Roman" w:eastAsia="宋体" w:hAnsi="Times New Roman"/>
-          <w:sz w:val="21"/>
-          <w:szCs w:val="21"/>
-        </w:rPr>
-        <w:t xml:space="preserve">图4-6 文章发布流程图</w:t>
-      </w:r>
-    </w:p>
-    <w:p>
-      <w:pPr>
-        <w:spacing w:after="0" w:before="240" w:line="288" w:lineRule="auto"/>
-      </w:pPr>
-      <w:r>
-        <w:rPr>
-          <w:rFonts w:ascii="Times New Roman" w:eastAsia="黑体" w:hAnsi="Times New Roman"/>
-          <w:sz w:val="28"/>
-          <w:szCs w:val="28"/>
-        </w:rPr>
-        <w:t xml:space="preserve">5.4.2 文章编辑与删除实现</w:t>
-      </w:r>
-    </w:p>
-    <w:p>
-      <w:pPr>
-        <w:spacing w:after="0" w:before="0" w:line="288" w:lineRule="auto"/>
-        <w:ind w:firstLine="480"/>
-      </w:pPr>
-      <w:r>
-        <w:rPr>
-          <w:rFonts w:ascii="Times New Roman" w:eastAsia="宋体" w:hAnsi="Times New Roman"/>
-          <w:sz w:val="24"/>
-          <w:szCs w:val="24"/>
-        </w:rPr>
-        <w:t xml:space="preserve">文章编辑通过PostServiceImpl.update()方法实现。该方法首先通过findById()查找文章，然后通过ResourceLock获取资源锁，在synchronized同步块中更新文章标题、频道、缩略图、状态、摘要和标签，保存PostAttribute文章属性，调用tagService.batchUpdate()更新标签关联，并通过countResource()对比新旧内容增减图片资源引用计数。</w:t>
-      </w:r>
-    </w:p>
-    <w:p>
-      <w:pPr>
-        <w:spacing w:after="0" w:before="0" w:line="288" w:lineRule="auto"/>
-        <w:ind w:firstLine="480"/>
-      </w:pPr>
-      <w:r>
-        <w:rPr>
-          <w:rFonts w:ascii="Times New Roman" w:eastAsia="宋体" w:hAnsi="Times New Roman"/>
-          <w:sz w:val="24"/>
-          <w:szCs w:val="24"/>
-        </w:rPr>
-        <w:t xml:space="preserve">文章删除通过PostServiceImpl.delete()方法实现。该方法首先通过findById()查找文章，通过Assert.isTrue(po.getAuthorId() == authorId, "认证失败")校验当前用户是否为文章作者，然后通过ResourceLock获取资源锁，在synchronized同步块中删除文章实体和文章属性，调用cleanResource()清理图片资源引用计数，最后发布PostUpdateEvent事件（ACTION_DELETE）。批量删除通过delete(Collection&lt;Long&gt; ids)方法实现，遍历ID列表逐个执行删除逻辑。</w:t>
-      </w:r>
-    </w:p>
-    <w:p>
-      <w:pPr>
-        <w:spacing w:after="0" w:before="240" w:line="288" w:lineRule="auto"/>
-      </w:pPr>
-      <w:r>
-        <w:rPr>
-          <w:rFonts w:ascii="Times New Roman" w:eastAsia="黑体" w:hAnsi="Times New Roman"/>
-          <w:sz w:val="28"/>
-          <w:szCs w:val="28"/>
-        </w:rPr>
-        <w:t xml:space="preserve">5.4.3 ResourceLock资源锁机制</w:t>
-      </w:r>
-    </w:p>
-    <w:p>
-      <w:pPr>
-        <w:spacing w:after="0" w:before="0" w:line="288" w:lineRule="auto"/>
-        <w:ind w:firstLine="480"/>
-      </w:pPr>
-      <w:r>
-        <w:rPr>
-          <w:rFonts w:ascii="Times New Roman" w:eastAsia="宋体" w:hAnsi="Times New Roman"/>
-          <w:sz w:val="24"/>
-          <w:szCs w:val="24"/>
-        </w:rPr>
-        <w:t xml:space="preserve">ResourceLock是系统自实现的细粒度资源锁工具类，基于ConcurrentHashMap和AtomicInteger实现。getPostKey()方法根据文章ID生成锁键（POST_OPERATE_{postId}），getAtomicInteger()方法获取或创建对应的AtomicInteger并递增引用计数，giveUpAtomicInteger()方法递减引用计数并在计数归零时移除锁对象。这种设计避免了使用全局锁导致的性能瓶颈，实现了文章级别的并发控制，保证了文章发布、编辑和删除操作在并发场景下的数据一致性。</w:t>
-      </w:r>
-    </w:p>
-    <w:p>
-      <w:pPr>
-        <w:spacing w:after="60" w:before="120"/>
-        <w:jc w:val="center"/>
-      </w:pPr>
-      <w:r>
-        <w:drawing>
-          <wp:inline distT="0" distB="0" distL="0" distR="0">
-            <wp:extent cx="2857500" cy="4857750"/>
-            <wp:effectExtent t="0" r="0" b="0" l="0"/>
-            <wp:docPr id="1" name="fig4-7-post-delete-flow.png" descr="图4-7 文章删除流程图" title="图4-7 文章删除流程图"/>
-            <wp:cNvGraphicFramePr>
-              <a:graphicFrameLocks xmlns:a="http://schemas.openxmlformats.org/drawingml/2006/main" noChangeAspect="1"/>
-            </wp:cNvGraphicFramePr>
-            <a:graphic xmlns:a="http://schemas.openxmlformats.org/drawingml/2006/main">
-              <a:graphicData uri="http://schemas.openxmlformats.org/drawingml/2006/picture">
-                <pic:pic xmlns:pic="http://schemas.openxmlformats.org/drawingml/2006/picture">
-                  <pic:nvPicPr>
-                    <pic:cNvPr id="0" name="" descr=""/>
-                    <pic:cNvPicPr>
-                      <a:picLocks noChangeAspect="1" noChangeArrowheads="1"/>
-                    </pic:cNvPicPr>
-                  </pic:nvPicPr>
-                  <pic:blipFill>
-                    <a:blip r:embed="rId18" cstate="none"/>
-                    <a:srcRect/>
-                    <a:stretch>
-                      <a:fillRect/>
-                    </a:stretch>
-                  </pic:blipFill>
-                  <pic:spPr bwMode="auto">
-                    <a:xfrm>
-                      <a:off x="0" y="0"/>
                       <a:ext cx="2857500" cy="4857750"/>
                     </a:xfrm>
                     <a:prstGeom prst="rect">
@@ -6483,7 +5953,7 @@
           <w:sz w:val="24"/>
           <w:szCs w:val="24"/>
         </w:rPr>
-        <w:t xml:space="preserve">后台管理功能由六个控制器实现。ChannelController提供频道的增删改查，更新后调用ContextStartup.resetChannels()刷新频道缓存。UserController通过update_role接口调用UserRoleService.updateRole()为用户分配角色，通过pwd接口重置密码，通过open和close接口修改用户状态。OptionsController通过update接口修改系统配置参数，修改后调用ContextStartup.reloadOptions()重新加载配置，通过reset_indexes接口重建全文索引。CommentController和PostController分别提供评论和文章的列表查看与删除功能，删除操作均支持批量处理。</w:t>
+        <w:t xml:space="preserve">后台管理功能由六个控制器实现。ChannelController提供频道的增删改查，更新后调用ContextStartup.resetChannels()刷新频道缓存。UserController通过update_role接口调用UserRoleService.updateRole()为用户分配角色，通过pwd接口重置密码，通过open和close接口修改用户状态。OptionsController通过update接口修改系统配置参数，修改后调用ContextStartup.reloadOptions()重新加载配置。CommentController和PostController分别提供评论和文章的列表查看与删除功能，删除操作均支持批量处理。</w:t>
       </w:r>
     </w:p>
     <w:p>
@@ -6539,7 +6009,7 @@
           <w:sz w:val="24"/>
           <w:szCs w:val="24"/>
         </w:rPr>
-        <w:t xml:space="preserve">功能测试逐项验证注册登录、文章发布编辑、评论互动、全文搜索、收藏、后台管理等功能，覆盖正常流程和异常输入。安全测试重点检查Shiro权限拦截、文章作者校验、密码加密和用户名唯一性。性能测试关注页面加载、分页查询和全文搜索的响应时间，测试环境用Undertow服务器，2个IO线程32个工作线程。</w:t>
+        <w:t xml:space="preserve">功能测试逐项验证注册登录、文章发布编辑、评论互动、后台管理等功能，覆盖正常流程和异常输入。安全测试重点检查Shiro权限拦截、文章作者校验、密码加密和用户名唯一性。性能测试关注页面加载和分页查询的响应时间，测试环境用Undertow服务器，2个IO线程32个工作线程。</w:t>
       </w:r>
     </w:p>
     <w:p>
@@ -8394,7 +7864,7 @@
                 <w:sz w:val="18"/>
                 <w:szCs w:val="18"/>
               </w:rPr>
-              <w:t xml:space="preserve">全文搜索</w:t>
+              <w:t xml:space="preserve">后台用户管理</w:t>
             </w:r>
           </w:p>
         </w:tc>
@@ -8428,7 +7898,7 @@
                 <w:sz w:val="18"/>
                 <w:szCs w:val="18"/>
               </w:rPr>
-              <w:t xml:space="preserve">输入关键词搜索</w:t>
+              <w:t xml:space="preserve">查看用户列表、重置密码</w:t>
             </w:r>
           </w:p>
         </w:tc>
@@ -8462,7 +7932,7 @@
                 <w:sz w:val="18"/>
                 <w:szCs w:val="18"/>
               </w:rPr>
-              <w:t xml:space="preserve">返回匹配文章列表</w:t>
+              <w:t xml:space="preserve">操作成功</w:t>
             </w:r>
           </w:p>
         </w:tc>
@@ -8532,7 +8002,7 @@
                 <w:sz w:val="18"/>
                 <w:szCs w:val="18"/>
               </w:rPr>
-              <w:t xml:space="preserve">TC-11</w:t>
+              <w:t xml:space="preserve">TC-12</w:t>
             </w:r>
           </w:p>
         </w:tc>
@@ -8566,7 +8036,7 @@
                 <w:sz w:val="18"/>
                 <w:szCs w:val="18"/>
               </w:rPr>
-              <w:t xml:space="preserve">文章收藏</w:t>
+              <w:t xml:space="preserve">后台访问控制</w:t>
             </w:r>
           </w:p>
         </w:tc>
@@ -8600,7 +8070,7 @@
                 <w:sz w:val="18"/>
                 <w:szCs w:val="18"/>
               </w:rPr>
-              <w:t xml:space="preserve">收藏感兴趣的文章</w:t>
+              <w:t xml:space="preserve">未授权用户访问后台</w:t>
             </w:r>
           </w:p>
         </w:tc>
@@ -8634,7 +8104,7 @@
                 <w:sz w:val="18"/>
                 <w:szCs w:val="18"/>
               </w:rPr>
-              <w:t xml:space="preserve">收藏成功计数递增</w:t>
+              <w:t xml:space="preserve">跳转登录页</w:t>
             </w:r>
           </w:p>
         </w:tc>
@@ -8673,178 +8143,6 @@
           </w:p>
         </w:tc>
       </w:tr>
-      <w:tr>
-        <w:tc>
-          <w:tcPr>
-            <w:tcW w:type="dxa" w:w="900"/>
-            <w:tcBorders>
-              <w:top w:val="single" w:color="000000" w:sz="1"/>
-              <w:left w:val="single" w:color="000000" w:sz="1"/>
-              <w:bottom w:val="single" w:color="000000" w:sz="1"/>
-              <w:right w:val="single" w:color="000000" w:sz="1"/>
-            </w:tcBorders>
-            <w:tcMar>
-              <w:top w:type="dxa" w:w="40"/>
-              <w:left w:type="dxa" w:w="80"/>
-              <w:bottom w:type="dxa" w:w="40"/>
-              <w:right w:type="dxa" w:w="80"/>
-            </w:tcMar>
-            <w:vAlign w:val="center"/>
-          </w:tcPr>
-          <w:p>
-            <w:pPr>
-              <w:spacing w:after="0" w:before="0" w:line="240" w:lineRule="auto"/>
-              <w:jc w:val="center"/>
-            </w:pPr>
-            <w:r>
-              <w:rPr>
-                <w:rFonts w:ascii="Times New Roman" w:eastAsia="宋体" w:hAnsi="Times New Roman"/>
-                <w:b w:val="false"/>
-                <w:bCs w:val="false"/>
-                <w:sz w:val="18"/>
-                <w:szCs w:val="18"/>
-              </w:rPr>
-              <w:t xml:space="preserve">TC-12</w:t>
-            </w:r>
-          </w:p>
-        </w:tc>
-        <w:tc>
-          <w:tcPr>
-            <w:tcW w:type="dxa" w:w="1800"/>
-            <w:tcBorders>
-              <w:top w:val="single" w:color="000000" w:sz="1"/>
-              <w:left w:val="single" w:color="000000" w:sz="1"/>
-              <w:bottom w:val="single" w:color="000000" w:sz="1"/>
-              <w:right w:val="single" w:color="000000" w:sz="1"/>
-            </w:tcBorders>
-            <w:tcMar>
-              <w:top w:type="dxa" w:w="40"/>
-              <w:left w:type="dxa" w:w="80"/>
-              <w:bottom w:type="dxa" w:w="40"/>
-              <w:right w:type="dxa" w:w="80"/>
-            </w:tcMar>
-            <w:vAlign w:val="center"/>
-          </w:tcPr>
-          <w:p>
-            <w:pPr>
-              <w:spacing w:after="0" w:before="0" w:line="240" w:lineRule="auto"/>
-              <w:jc w:val="center"/>
-            </w:pPr>
-            <w:r>
-              <w:rPr>
-                <w:rFonts w:ascii="Times New Roman" w:eastAsia="宋体" w:hAnsi="Times New Roman"/>
-                <w:b w:val="false"/>
-                <w:bCs w:val="false"/>
-                <w:sz w:val="18"/>
-                <w:szCs w:val="18"/>
-              </w:rPr>
-              <w:t xml:space="preserve">后台访问控制</w:t>
-            </w:r>
-          </w:p>
-        </w:tc>
-        <w:tc>
-          <w:tcPr>
-            <w:tcW w:type="dxa" w:w="3000"/>
-            <w:tcBorders>
-              <w:top w:val="single" w:color="000000" w:sz="1"/>
-              <w:left w:val="single" w:color="000000" w:sz="1"/>
-              <w:bottom w:val="single" w:color="000000" w:sz="1"/>
-              <w:right w:val="single" w:color="000000" w:sz="1"/>
-            </w:tcBorders>
-            <w:tcMar>
-              <w:top w:type="dxa" w:w="40"/>
-              <w:left w:type="dxa" w:w="80"/>
-              <w:bottom w:type="dxa" w:w="40"/>
-              <w:right w:type="dxa" w:w="80"/>
-            </w:tcMar>
-            <w:vAlign w:val="center"/>
-          </w:tcPr>
-          <w:p>
-            <w:pPr>
-              <w:spacing w:after="0" w:before="0" w:line="240" w:lineRule="auto"/>
-              <w:jc w:val="center"/>
-            </w:pPr>
-            <w:r>
-              <w:rPr>
-                <w:rFonts w:ascii="Times New Roman" w:eastAsia="宋体" w:hAnsi="Times New Roman"/>
-                <w:b w:val="false"/>
-                <w:bCs w:val="false"/>
-                <w:sz w:val="18"/>
-                <w:szCs w:val="18"/>
-              </w:rPr>
-              <w:t xml:space="preserve">未授权用户访问后台</w:t>
-            </w:r>
-          </w:p>
-        </w:tc>
-        <w:tc>
-          <w:tcPr>
-            <w:tcW w:type="dxa" w:w="2000"/>
-            <w:tcBorders>
-              <w:top w:val="single" w:color="000000" w:sz="1"/>
-              <w:left w:val="single" w:color="000000" w:sz="1"/>
-              <w:bottom w:val="single" w:color="000000" w:sz="1"/>
-              <w:right w:val="single" w:color="000000" w:sz="1"/>
-            </w:tcBorders>
-            <w:tcMar>
-              <w:top w:type="dxa" w:w="40"/>
-              <w:left w:type="dxa" w:w="80"/>
-              <w:bottom w:type="dxa" w:w="40"/>
-              <w:right w:type="dxa" w:w="80"/>
-            </w:tcMar>
-            <w:vAlign w:val="center"/>
-          </w:tcPr>
-          <w:p>
-            <w:pPr>
-              <w:spacing w:after="0" w:before="0" w:line="240" w:lineRule="auto"/>
-              <w:jc w:val="center"/>
-            </w:pPr>
-            <w:r>
-              <w:rPr>
-                <w:rFonts w:ascii="Times New Roman" w:eastAsia="宋体" w:hAnsi="Times New Roman"/>
-                <w:b w:val="false"/>
-                <w:bCs w:val="false"/>
-                <w:sz w:val="18"/>
-                <w:szCs w:val="18"/>
-              </w:rPr>
-              <w:t xml:space="preserve">跳转登录页</w:t>
-            </w:r>
-          </w:p>
-        </w:tc>
-        <w:tc>
-          <w:tcPr>
-            <w:tcW w:type="dxa" w:w="1300"/>
-            <w:tcBorders>
-              <w:top w:val="single" w:color="000000" w:sz="1"/>
-              <w:left w:val="single" w:color="000000" w:sz="1"/>
-              <w:bottom w:val="single" w:color="000000" w:sz="1"/>
-              <w:right w:val="single" w:color="000000" w:sz="1"/>
-            </w:tcBorders>
-            <w:tcMar>
-              <w:top w:type="dxa" w:w="40"/>
-              <w:left w:type="dxa" w:w="80"/>
-              <w:bottom w:type="dxa" w:w="40"/>
-              <w:right w:type="dxa" w:w="80"/>
-            </w:tcMar>
-            <w:vAlign w:val="center"/>
-          </w:tcPr>
-          <w:p>
-            <w:pPr>
-              <w:spacing w:after="0" w:before="0" w:line="240" w:lineRule="auto"/>
-              <w:jc w:val="center"/>
-            </w:pPr>
-            <w:r>
-              <w:rPr>
-                <w:rFonts w:ascii="Times New Roman" w:eastAsia="宋体" w:hAnsi="Times New Roman"/>
-                <w:b w:val="false"/>
-                <w:bCs w:val="false"/>
-                <w:sz w:val="18"/>
-                <w:szCs w:val="18"/>
-              </w:rPr>
-              <w:t xml:space="preserve">通过</w:t>
-            </w:r>
-          </w:p>
-        </w:tc>
-      </w:tr>
     </w:tbl>
     <w:p>
       <w:pPr>
@@ -8896,7 +8194,7 @@
           <w:sz w:val="24"/>
           <w:szCs w:val="24"/>
         </w:rPr>
-        <w:t xml:space="preserve">12项功能测试用例全部通过。注册登录流程正常，重复用户名能正确拦截，错误密码登录会提示。文章发布、编辑、删除都正常工作，摘要自动截取和Markdown渲染都没问题。评论发表和展示正常。全文搜索能正确返回匹配结果，中文分词效果可以。收藏功能计数正确。后台各项管理功能在登录且有权限的情况下都能正常使用。</w:t>
+        <w:t xml:space="preserve">12项功能测试用例全部通过。注册登录流程正常，重复用户名能正确拦截，错误密码登录会提示。文章发布、编辑、删除都正常工作，摘要自动截取和Markdown渲染都没问题。评论发表和展示正常。后台各项管理功能在登录且有权限的情况下都能正常使用。</w:t>
       </w:r>
     </w:p>
     <w:p>
@@ -8950,16 +8248,7 @@
           <w:sz w:val="24"/>
           <w:szCs w:val="24"/>
         </w:rPr>
-        <w:t xml:space="preserve">性能方面，首页加载在1秒以内，文章列表分页查询0.5秒以内，全文搜索1秒以内，都满足需求。EhCache缓存减少了数据库查询次数，ResourceLock在并发场景下保证了数据一致性。Undertow的多线程配置能处理并发请求。总体来看，系统在功能、安全和性能方面都达到了预期目标。</w:t>
-      </w:r>
-      <w:r>
-        <w:rPr>
-          <w:rFonts w:ascii="Times New Roman" w:eastAsia="宋体" w:hAnsi="Times New Roman"/>
-          <w:sz w:val="24"/>
-          <w:szCs w:val="24"/>
-          <w:vertAlign w:val="superscript"/>
-        </w:rPr>
-        <w:t xml:space="preserve">[7]</w:t>
+        <w:t xml:space="preserve">性能方面，首页加载在1秒以内，文章列表分页查询0.5秒以内，都满足需求。EhCache缓存减少了数据库查询次数，ResourceLock在并发场景下保证了数据一致性。Undertow的多线程配置能处理并发请求。总体来看，系统在功能、安全和性能方面都达到了预期目标。</w:t>
       </w:r>
     </w:p>
     <w:p>
@@ -9002,21 +8291,21 @@
           <w:sz w:val="24"/>
           <w:szCs w:val="24"/>
         </w:rPr>
-        <w:t xml:space="preserve">需求分析阶段明确了前台用户功能和后台管理功能，以及性能、安全等方面的非功能性需求。架构设计采用MVC分层模式，结合Spring Boot自动配置，把系统分为表现层、控制层、业务层、持久层、安全层和搜索层。数据库方面，schema.sql定义了频道表、配置表、用户表和四张Shiro权限表，其余业务表由JPA自动建表。功能实现覆盖了注册登录、文章管理、评论互动、全文搜索、收藏、后台管理等核心模块。系统测试的12项功能用例全部通过，安全和性能也达标。</w:t>
-      </w:r>
-    </w:p>
-    <w:p>
-      <w:pPr>
-        <w:spacing w:after="0" w:before="0" w:line="288" w:lineRule="auto"/>
-        <w:ind w:firstLine="480"/>
-      </w:pPr>
-      <w:r>
-        <w:rPr>
-          <w:rFonts w:ascii="Times New Roman" w:eastAsia="宋体" w:hAnsi="Times New Roman"/>
-          <w:sz w:val="24"/>
-          <w:szCs w:val="24"/>
-        </w:rPr>
-        <w:t xml:space="preserve">不过系统还有一些可以改进的地方。密码目前用MD5加密，可以换成BCrypt等更安全的方案。缓存用的是本地EhCache，如果访问量大可以换成Redis。全文搜索的结果排序和高亮显示还可以优化。前端目前是FreeMarker服务端渲染，如果改成前后端分离架构，用户交互体验会更好。</w:t>
+        <w:t xml:space="preserve">需求分析阶段明确了前台用户功能和后台管理功能，以及性能、安全等方面的非功能性需求。架构设计采用MVC分层模式，结合Spring Boot自动配置，把系统分为表现层、控制层、业务层、持久层和安全层。数据库方面，所有表通过JPA自动建表。功能实现覆盖了注册登录、文章管理、评论互动、后台管理等核心模块。系统测试的12项功能用例全部通过，安全和性能也达标。</w:t>
+      </w:r>
+    </w:p>
+    <w:p>
+      <w:pPr>
+        <w:spacing w:after="0" w:before="0" w:line="288" w:lineRule="auto"/>
+        <w:ind w:firstLine="480"/>
+      </w:pPr>
+      <w:r>
+        <w:rPr>
+          <w:rFonts w:ascii="Times New Roman" w:eastAsia="宋体" w:hAnsi="Times New Roman"/>
+          <w:sz w:val="24"/>
+          <w:szCs w:val="24"/>
+        </w:rPr>
+        <w:t xml:space="preserve">不过系统还有一些可以改进的地方。密码目前用MD5加密，可以换成BCrypt等更安全的方案。缓存用的是本地EhCache，如果访问量大可以换成Redis。前端目前是FreeMarker服务端渲染，如果改成前后端分离架构，用户交互体验会更好。</w:t>
       </w:r>
     </w:p>
     <w:p>
@@ -9372,7 +8661,7 @@
           <w:sz w:val="24"/>
           <w:szCs w:val="24"/>
         </w:rPr>
-        <w:t xml:space="preserve">感谢开源社区的开发者们，mblog项目的开源代码为我提供了学习和实践的平台。Spring Boot、Apache Shiro、Hibernate Search等开源框架的详细文档和活跃的社区讨论，为我在开发过程中遇到的问题提供了大量参考和解决方案。</w:t>
+        <w:t xml:space="preserve">感谢开源社区的开发者们，mblog项目的开源代码为我提供了学习和实践的平台。Spring Boot、Apache Shiro等开源框架的详细文档和活跃的社区讨论，为我在开发过程中遇到的问题提供了大量参考和解决方案。</w:t>
       </w:r>
     </w:p>
     <w:p>
@@ -9390,7 +8679,7 @@
       </w:r>
     </w:p>
     <w:sectPr>
-      <w:headerReference w:type="default" r:id="rId20"/>
+      <w:headerReference w:type="default" r:id="rId19"/>
       <w:footerReference w:type="default" r:id="rId8"/>
       <w:pgSz w:w="11906" w:h="16838" w:orient="portrait"/>
       <w:pgMar w:top="1701" w:right="1418" w:bottom="1418" w:left="1701" w:header="708" w:footer="708" w:gutter="0"/>

</xml_diff>